<commit_message>
Thêm link công khai vào report
Co-Authored-By: Claude Opus 5.5 <noreply@anthropic.com>
</commit_message>
<xml_diff>
--- a/4_Report/BaoCao.docx
+++ b/4_Report/BaoCao.docx
@@ -197,8 +197,41 @@
         <w:t>Mã nguồn:</w:t>
       </w:r>
       <w:r>
-        <w:t xml:space="preserve"> https://github.com/HoangLiem-AI/VisualDijkstra</w:t>
-      </w:r>
+        <w:t xml:space="preserve"> </w:t>
+      </w:r>
+      <w:hyperlink r:id="rId8">
+        <w:r>
+          <w:rPr>
+            <w:color w:val="1F4E9D"/>
+            <w:u w:val="single"/>
+          </w:rPr>
+          <w:t>https://github.com/HoangLiem-AI/VisualDijkstra</w:t>
+        </w:r>
+      </w:hyperlink>
+    </w:p>
+    <w:p>
+      <w:pPr>
+        <w:spacing w:after="40"/>
+        <w:ind w:left="1701"/>
+      </w:pPr>
+      <w:r>
+        <w:rPr>
+          <w:b/>
+        </w:rPr>
+        <w:t>Bản chạy online:</w:t>
+      </w:r>
+      <w:r>
+        <w:t xml:space="preserve"> </w:t>
+      </w:r>
+      <w:hyperlink r:id="rId9">
+        <w:r>
+          <w:rPr>
+            <w:color w:val="1F4E9D"/>
+            <w:u w:val="single"/>
+          </w:rPr>
+          <w:t>https://hoangliem-ai.github.io/VisualDijkstra/</w:t>
+        </w:r>
+      </w:hyperlink>
     </w:p>
     <w:p>
       <w:pPr>
@@ -268,7 +301,7 @@
       <w:r>
         <w:fldChar w:fldCharType="separate"/>
       </w:r>
-      <w:hyperlink w:anchor="_Toc243217973" w:history="1">
+      <w:hyperlink w:anchor="_Toc243233717" w:history="1">
         <w:r>
           <w:rPr>
             <w:rStyle w:val="Hyperlink"/>
@@ -295,7 +328,7 @@
             <w:noProof/>
             <w:webHidden/>
           </w:rPr>
-          <w:instrText xml:space="preserve"> PAGEREF _Toc243217973 \h </w:instrText>
+          <w:instrText xml:space="preserve"> PAGEREF _Toc243233717 \h </w:instrText>
         </w:r>
         <w:r>
           <w:rPr>
@@ -341,7 +374,7 @@
           <w14:ligatures w14:val="standardContextual"/>
         </w:rPr>
       </w:pPr>
-      <w:hyperlink w:anchor="_Toc243217974" w:history="1">
+      <w:hyperlink w:anchor="_Toc243233718" w:history="1">
         <w:r>
           <w:rPr>
             <w:rStyle w:val="Hyperlink"/>
@@ -368,7 +401,7 @@
             <w:noProof/>
             <w:webHidden/>
           </w:rPr>
-          <w:instrText xml:space="preserve"> PAGEREF _Toc243217974 \h </w:instrText>
+          <w:instrText xml:space="preserve"> PAGEREF _Toc243233718 \h </w:instrText>
         </w:r>
         <w:r>
           <w:rPr>
@@ -414,7 +447,7 @@
           <w14:ligatures w14:val="standardContextual"/>
         </w:rPr>
       </w:pPr>
-      <w:hyperlink w:anchor="_Toc243217975" w:history="1">
+      <w:hyperlink w:anchor="_Toc243233719" w:history="1">
         <w:r>
           <w:rPr>
             <w:rStyle w:val="Hyperlink"/>
@@ -441,7 +474,7 @@
             <w:noProof/>
             <w:webHidden/>
           </w:rPr>
-          <w:instrText xml:space="preserve"> PAGEREF _Toc243217975 \h </w:instrText>
+          <w:instrText xml:space="preserve"> PAGEREF _Toc243233719 \h </w:instrText>
         </w:r>
         <w:r>
           <w:rPr>
@@ -487,7 +520,7 @@
           <w14:ligatures w14:val="standardContextual"/>
         </w:rPr>
       </w:pPr>
-      <w:hyperlink w:anchor="_Toc243217976" w:history="1">
+      <w:hyperlink w:anchor="_Toc243233720" w:history="1">
         <w:r>
           <w:rPr>
             <w:rStyle w:val="Hyperlink"/>
@@ -514,7 +547,7 @@
             <w:noProof/>
             <w:webHidden/>
           </w:rPr>
-          <w:instrText xml:space="preserve"> PAGEREF _Toc243217976 \h </w:instrText>
+          <w:instrText xml:space="preserve"> PAGEREF _Toc243233720 \h </w:instrText>
         </w:r>
         <w:r>
           <w:rPr>
@@ -560,7 +593,7 @@
           <w14:ligatures w14:val="standardContextual"/>
         </w:rPr>
       </w:pPr>
-      <w:hyperlink w:anchor="_Toc243217977" w:history="1">
+      <w:hyperlink w:anchor="_Toc243233721" w:history="1">
         <w:r>
           <w:rPr>
             <w:rStyle w:val="Hyperlink"/>
@@ -587,7 +620,7 @@
             <w:noProof/>
             <w:webHidden/>
           </w:rPr>
-          <w:instrText xml:space="preserve"> PAGEREF _Toc243217977 \h </w:instrText>
+          <w:instrText xml:space="preserve"> PAGEREF _Toc243233721 \h </w:instrText>
         </w:r>
         <w:r>
           <w:rPr>
@@ -633,7 +666,7 @@
           <w14:ligatures w14:val="standardContextual"/>
         </w:rPr>
       </w:pPr>
-      <w:hyperlink w:anchor="_Toc243217978" w:history="1">
+      <w:hyperlink w:anchor="_Toc243233722" w:history="1">
         <w:r>
           <w:rPr>
             <w:rStyle w:val="Hyperlink"/>
@@ -660,7 +693,7 @@
             <w:noProof/>
             <w:webHidden/>
           </w:rPr>
-          <w:instrText xml:space="preserve"> PAGEREF _Toc243217978 \h </w:instrText>
+          <w:instrText xml:space="preserve"> PAGEREF _Toc243233722 \h </w:instrText>
         </w:r>
         <w:r>
           <w:rPr>
@@ -706,7 +739,7 @@
           <w14:ligatures w14:val="standardContextual"/>
         </w:rPr>
       </w:pPr>
-      <w:hyperlink w:anchor="_Toc243217979" w:history="1">
+      <w:hyperlink w:anchor="_Toc243233723" w:history="1">
         <w:r>
           <w:rPr>
             <w:rStyle w:val="Hyperlink"/>
@@ -733,7 +766,7 @@
             <w:noProof/>
             <w:webHidden/>
           </w:rPr>
-          <w:instrText xml:space="preserve"> PAGEREF _Toc243217979 \h </w:instrText>
+          <w:instrText xml:space="preserve"> PAGEREF _Toc243233723 \h </w:instrText>
         </w:r>
         <w:r>
           <w:rPr>
@@ -779,7 +812,7 @@
           <w14:ligatures w14:val="standardContextual"/>
         </w:rPr>
       </w:pPr>
-      <w:hyperlink w:anchor="_Toc243217980" w:history="1">
+      <w:hyperlink w:anchor="_Toc243233724" w:history="1">
         <w:r>
           <w:rPr>
             <w:rStyle w:val="Hyperlink"/>
@@ -806,7 +839,7 @@
             <w:noProof/>
             <w:webHidden/>
           </w:rPr>
-          <w:instrText xml:space="preserve"> PAGEREF _Toc243217980 \h </w:instrText>
+          <w:instrText xml:space="preserve"> PAGEREF _Toc243233724 \h </w:instrText>
         </w:r>
         <w:r>
           <w:rPr>
@@ -852,7 +885,7 @@
           <w14:ligatures w14:val="standardContextual"/>
         </w:rPr>
       </w:pPr>
-      <w:hyperlink w:anchor="_Toc243217981" w:history="1">
+      <w:hyperlink w:anchor="_Toc243233725" w:history="1">
         <w:r>
           <w:rPr>
             <w:rStyle w:val="Hyperlink"/>
@@ -879,7 +912,7 @@
             <w:noProof/>
             <w:webHidden/>
           </w:rPr>
-          <w:instrText xml:space="preserve"> PAGEREF _Toc243217981 \h </w:instrText>
+          <w:instrText xml:space="preserve"> PAGEREF _Toc243233725 \h </w:instrText>
         </w:r>
         <w:r>
           <w:rPr>
@@ -925,7 +958,7 @@
           <w14:ligatures w14:val="standardContextual"/>
         </w:rPr>
       </w:pPr>
-      <w:hyperlink w:anchor="_Toc243217982" w:history="1">
+      <w:hyperlink w:anchor="_Toc243233726" w:history="1">
         <w:r>
           <w:rPr>
             <w:rStyle w:val="Hyperlink"/>
@@ -952,7 +985,7 @@
             <w:noProof/>
             <w:webHidden/>
           </w:rPr>
-          <w:instrText xml:space="preserve"> PAGEREF _Toc243217982 \h </w:instrText>
+          <w:instrText xml:space="preserve"> PAGEREF _Toc243233726 \h </w:instrText>
         </w:r>
         <w:r>
           <w:rPr>
@@ -998,7 +1031,7 @@
           <w14:ligatures w14:val="standardContextual"/>
         </w:rPr>
       </w:pPr>
-      <w:hyperlink w:anchor="_Toc243217983" w:history="1">
+      <w:hyperlink w:anchor="_Toc243233727" w:history="1">
         <w:r>
           <w:rPr>
             <w:rStyle w:val="Hyperlink"/>
@@ -1025,7 +1058,7 @@
             <w:noProof/>
             <w:webHidden/>
           </w:rPr>
-          <w:instrText xml:space="preserve"> PAGEREF _Toc243217983 \h </w:instrText>
+          <w:instrText xml:space="preserve"> PAGEREF _Toc243233727 \h </w:instrText>
         </w:r>
         <w:r>
           <w:rPr>
@@ -1071,7 +1104,7 @@
           <w14:ligatures w14:val="standardContextual"/>
         </w:rPr>
       </w:pPr>
-      <w:hyperlink w:anchor="_Toc243217984" w:history="1">
+      <w:hyperlink w:anchor="_Toc243233728" w:history="1">
         <w:r>
           <w:rPr>
             <w:rStyle w:val="Hyperlink"/>
@@ -1098,7 +1131,7 @@
             <w:noProof/>
             <w:webHidden/>
           </w:rPr>
-          <w:instrText xml:space="preserve"> PAGEREF _Toc243217984 \h </w:instrText>
+          <w:instrText xml:space="preserve"> PAGEREF _Toc243233728 \h </w:instrText>
         </w:r>
         <w:r>
           <w:rPr>
@@ -1144,7 +1177,7 @@
           <w14:ligatures w14:val="standardContextual"/>
         </w:rPr>
       </w:pPr>
-      <w:hyperlink w:anchor="_Toc243217985" w:history="1">
+      <w:hyperlink w:anchor="_Toc243233729" w:history="1">
         <w:r>
           <w:rPr>
             <w:rStyle w:val="Hyperlink"/>
@@ -1171,7 +1204,7 @@
             <w:noProof/>
             <w:webHidden/>
           </w:rPr>
-          <w:instrText xml:space="preserve"> PAGEREF _Toc243217985 \h </w:instrText>
+          <w:instrText xml:space="preserve"> PAGEREF _Toc243233729 \h </w:instrText>
         </w:r>
         <w:r>
           <w:rPr>
@@ -1217,7 +1250,7 @@
           <w14:ligatures w14:val="standardContextual"/>
         </w:rPr>
       </w:pPr>
-      <w:hyperlink w:anchor="_Toc243217986" w:history="1">
+      <w:hyperlink w:anchor="_Toc243233730" w:history="1">
         <w:r>
           <w:rPr>
             <w:rStyle w:val="Hyperlink"/>
@@ -1244,7 +1277,7 @@
             <w:noProof/>
             <w:webHidden/>
           </w:rPr>
-          <w:instrText xml:space="preserve"> PAGEREF _Toc243217986 \h </w:instrText>
+          <w:instrText xml:space="preserve"> PAGEREF _Toc243233730 \h </w:instrText>
         </w:r>
         <w:r>
           <w:rPr>
@@ -1290,7 +1323,7 @@
           <w14:ligatures w14:val="standardContextual"/>
         </w:rPr>
       </w:pPr>
-      <w:hyperlink w:anchor="_Toc243217987" w:history="1">
+      <w:hyperlink w:anchor="_Toc243233731" w:history="1">
         <w:r>
           <w:rPr>
             <w:rStyle w:val="Hyperlink"/>
@@ -1317,7 +1350,7 @@
             <w:noProof/>
             <w:webHidden/>
           </w:rPr>
-          <w:instrText xml:space="preserve"> PAGEREF _Toc243217987 \h </w:instrText>
+          <w:instrText xml:space="preserve"> PAGEREF _Toc243233731 \h </w:instrText>
         </w:r>
         <w:r>
           <w:rPr>
@@ -1363,7 +1396,7 @@
           <w14:ligatures w14:val="standardContextual"/>
         </w:rPr>
       </w:pPr>
-      <w:hyperlink w:anchor="_Toc243217988" w:history="1">
+      <w:hyperlink w:anchor="_Toc243233732" w:history="1">
         <w:r>
           <w:rPr>
             <w:rStyle w:val="Hyperlink"/>
@@ -1390,7 +1423,7 @@
             <w:noProof/>
             <w:webHidden/>
           </w:rPr>
-          <w:instrText xml:space="preserve"> PAGEREF _Toc243217988 \h </w:instrText>
+          <w:instrText xml:space="preserve"> PAGEREF _Toc243233732 \h </w:instrText>
         </w:r>
         <w:r>
           <w:rPr>
@@ -1436,7 +1469,7 @@
           <w14:ligatures w14:val="standardContextual"/>
         </w:rPr>
       </w:pPr>
-      <w:hyperlink w:anchor="_Toc243217989" w:history="1">
+      <w:hyperlink w:anchor="_Toc243233733" w:history="1">
         <w:r>
           <w:rPr>
             <w:rStyle w:val="Hyperlink"/>
@@ -1463,7 +1496,7 @@
             <w:noProof/>
             <w:webHidden/>
           </w:rPr>
-          <w:instrText xml:space="preserve"> PAGEREF _Toc243217989 \h </w:instrText>
+          <w:instrText xml:space="preserve"> PAGEREF _Toc243233733 \h </w:instrText>
         </w:r>
         <w:r>
           <w:rPr>
@@ -1509,7 +1542,7 @@
           <w14:ligatures w14:val="standardContextual"/>
         </w:rPr>
       </w:pPr>
-      <w:hyperlink w:anchor="_Toc243217990" w:history="1">
+      <w:hyperlink w:anchor="_Toc243233734" w:history="1">
         <w:r>
           <w:rPr>
             <w:rStyle w:val="Hyperlink"/>
@@ -1536,7 +1569,7 @@
             <w:noProof/>
             <w:webHidden/>
           </w:rPr>
-          <w:instrText xml:space="preserve"> PAGEREF _Toc243217990 \h </w:instrText>
+          <w:instrText xml:space="preserve"> PAGEREF _Toc243233734 \h </w:instrText>
         </w:r>
         <w:r>
           <w:rPr>
@@ -1582,7 +1615,7 @@
           <w14:ligatures w14:val="standardContextual"/>
         </w:rPr>
       </w:pPr>
-      <w:hyperlink w:anchor="_Toc243217991" w:history="1">
+      <w:hyperlink w:anchor="_Toc243233735" w:history="1">
         <w:r>
           <w:rPr>
             <w:rStyle w:val="Hyperlink"/>
@@ -1609,7 +1642,7 @@
             <w:noProof/>
             <w:webHidden/>
           </w:rPr>
-          <w:instrText xml:space="preserve"> PAGEREF _Toc243217991 \h </w:instrText>
+          <w:instrText xml:space="preserve"> PAGEREF _Toc243233735 \h </w:instrText>
         </w:r>
         <w:r>
           <w:rPr>
@@ -1655,7 +1688,7 @@
           <w14:ligatures w14:val="standardContextual"/>
         </w:rPr>
       </w:pPr>
-      <w:hyperlink w:anchor="_Toc243217992" w:history="1">
+      <w:hyperlink w:anchor="_Toc243233736" w:history="1">
         <w:r>
           <w:rPr>
             <w:rStyle w:val="Hyperlink"/>
@@ -1682,7 +1715,7 @@
             <w:noProof/>
             <w:webHidden/>
           </w:rPr>
-          <w:instrText xml:space="preserve"> PAGEREF _Toc243217992 \h </w:instrText>
+          <w:instrText xml:space="preserve"> PAGEREF _Toc243233736 \h </w:instrText>
         </w:r>
         <w:r>
           <w:rPr>
@@ -1728,7 +1761,7 @@
           <w14:ligatures w14:val="standardContextual"/>
         </w:rPr>
       </w:pPr>
-      <w:hyperlink w:anchor="_Toc243217993" w:history="1">
+      <w:hyperlink w:anchor="_Toc243233737" w:history="1">
         <w:r>
           <w:rPr>
             <w:rStyle w:val="Hyperlink"/>
@@ -1755,7 +1788,7 @@
             <w:noProof/>
             <w:webHidden/>
           </w:rPr>
-          <w:instrText xml:space="preserve"> PAGEREF _Toc243217993 \h </w:instrText>
+          <w:instrText xml:space="preserve"> PAGEREF _Toc243233737 \h </w:instrText>
         </w:r>
         <w:r>
           <w:rPr>
@@ -1801,7 +1834,7 @@
           <w14:ligatures w14:val="standardContextual"/>
         </w:rPr>
       </w:pPr>
-      <w:hyperlink w:anchor="_Toc243217994" w:history="1">
+      <w:hyperlink w:anchor="_Toc243233738" w:history="1">
         <w:r>
           <w:rPr>
             <w:rStyle w:val="Hyperlink"/>
@@ -1828,7 +1861,7 @@
             <w:noProof/>
             <w:webHidden/>
           </w:rPr>
-          <w:instrText xml:space="preserve"> PAGEREF _Toc243217994 \h </w:instrText>
+          <w:instrText xml:space="preserve"> PAGEREF _Toc243233738 \h </w:instrText>
         </w:r>
         <w:r>
           <w:rPr>
@@ -1874,7 +1907,7 @@
           <w14:ligatures w14:val="standardContextual"/>
         </w:rPr>
       </w:pPr>
-      <w:hyperlink w:anchor="_Toc243217995" w:history="1">
+      <w:hyperlink w:anchor="_Toc243233739" w:history="1">
         <w:r>
           <w:rPr>
             <w:rStyle w:val="Hyperlink"/>
@@ -1901,7 +1934,7 @@
             <w:noProof/>
             <w:webHidden/>
           </w:rPr>
-          <w:instrText xml:space="preserve"> PAGEREF _Toc243217995 \h </w:instrText>
+          <w:instrText xml:space="preserve"> PAGEREF _Toc243233739 \h </w:instrText>
         </w:r>
         <w:r>
           <w:rPr>
@@ -1947,7 +1980,7 @@
           <w14:ligatures w14:val="standardContextual"/>
         </w:rPr>
       </w:pPr>
-      <w:hyperlink w:anchor="_Toc243217996" w:history="1">
+      <w:hyperlink w:anchor="_Toc243233740" w:history="1">
         <w:r>
           <w:rPr>
             <w:rStyle w:val="Hyperlink"/>
@@ -1974,7 +2007,7 @@
             <w:noProof/>
             <w:webHidden/>
           </w:rPr>
-          <w:instrText xml:space="preserve"> PAGEREF _Toc243217996 \h </w:instrText>
+          <w:instrText xml:space="preserve"> PAGEREF _Toc243233740 \h </w:instrText>
         </w:r>
         <w:r>
           <w:rPr>
@@ -2020,7 +2053,7 @@
           <w14:ligatures w14:val="standardContextual"/>
         </w:rPr>
       </w:pPr>
-      <w:hyperlink w:anchor="_Toc243217997" w:history="1">
+      <w:hyperlink w:anchor="_Toc243233741" w:history="1">
         <w:r>
           <w:rPr>
             <w:rStyle w:val="Hyperlink"/>
@@ -2047,7 +2080,7 @@
             <w:noProof/>
             <w:webHidden/>
           </w:rPr>
-          <w:instrText xml:space="preserve"> PAGEREF _Toc243217997 \h </w:instrText>
+          <w:instrText xml:space="preserve"> PAGEREF _Toc243233741 \h </w:instrText>
         </w:r>
         <w:r>
           <w:rPr>
@@ -2093,7 +2126,7 @@
           <w14:ligatures w14:val="standardContextual"/>
         </w:rPr>
       </w:pPr>
-      <w:hyperlink w:anchor="_Toc243217998" w:history="1">
+      <w:hyperlink w:anchor="_Toc243233742" w:history="1">
         <w:r>
           <w:rPr>
             <w:rStyle w:val="Hyperlink"/>
@@ -2120,7 +2153,7 @@
             <w:noProof/>
             <w:webHidden/>
           </w:rPr>
-          <w:instrText xml:space="preserve"> PAGEREF _Toc243217998 \h </w:instrText>
+          <w:instrText xml:space="preserve"> PAGEREF _Toc243233742 \h </w:instrText>
         </w:r>
         <w:r>
           <w:rPr>
@@ -2166,7 +2199,7 @@
           <w14:ligatures w14:val="standardContextual"/>
         </w:rPr>
       </w:pPr>
-      <w:hyperlink w:anchor="_Toc243217999" w:history="1">
+      <w:hyperlink w:anchor="_Toc243233743" w:history="1">
         <w:r>
           <w:rPr>
             <w:rStyle w:val="Hyperlink"/>
@@ -2193,7 +2226,7 @@
             <w:noProof/>
             <w:webHidden/>
           </w:rPr>
-          <w:instrText xml:space="preserve"> PAGEREF _Toc243217999 \h </w:instrText>
+          <w:instrText xml:space="preserve"> PAGEREF _Toc243233743 \h </w:instrText>
         </w:r>
         <w:r>
           <w:rPr>
@@ -2239,7 +2272,7 @@
           <w14:ligatures w14:val="standardContextual"/>
         </w:rPr>
       </w:pPr>
-      <w:hyperlink w:anchor="_Toc243218000" w:history="1">
+      <w:hyperlink w:anchor="_Toc243233744" w:history="1">
         <w:r>
           <w:rPr>
             <w:rStyle w:val="Hyperlink"/>
@@ -2266,7 +2299,7 @@
             <w:noProof/>
             <w:webHidden/>
           </w:rPr>
-          <w:instrText xml:space="preserve"> PAGEREF _Toc243218000 \h </w:instrText>
+          <w:instrText xml:space="preserve"> PAGEREF _Toc243233744 \h </w:instrText>
         </w:r>
         <w:r>
           <w:rPr>
@@ -2312,7 +2345,7 @@
           <w14:ligatures w14:val="standardContextual"/>
         </w:rPr>
       </w:pPr>
-      <w:hyperlink w:anchor="_Toc243218001" w:history="1">
+      <w:hyperlink w:anchor="_Toc243233745" w:history="1">
         <w:r>
           <w:rPr>
             <w:rStyle w:val="Hyperlink"/>
@@ -2339,7 +2372,7 @@
             <w:noProof/>
             <w:webHidden/>
           </w:rPr>
-          <w:instrText xml:space="preserve"> PAGEREF _Toc243218001 \h </w:instrText>
+          <w:instrText xml:space="preserve"> PAGEREF _Toc243233745 \h </w:instrText>
         </w:r>
         <w:r>
           <w:rPr>
@@ -2385,7 +2418,7 @@
           <w14:ligatures w14:val="standardContextual"/>
         </w:rPr>
       </w:pPr>
-      <w:hyperlink w:anchor="_Toc243218002" w:history="1">
+      <w:hyperlink w:anchor="_Toc243233746" w:history="1">
         <w:r>
           <w:rPr>
             <w:rStyle w:val="Hyperlink"/>
@@ -2412,7 +2445,7 @@
             <w:noProof/>
             <w:webHidden/>
           </w:rPr>
-          <w:instrText xml:space="preserve"> PAGEREF _Toc243218002 \h </w:instrText>
+          <w:instrText xml:space="preserve"> PAGEREF _Toc243233746 \h </w:instrText>
         </w:r>
         <w:r>
           <w:rPr>
@@ -2458,7 +2491,7 @@
           <w14:ligatures w14:val="standardContextual"/>
         </w:rPr>
       </w:pPr>
-      <w:hyperlink w:anchor="_Toc243218003" w:history="1">
+      <w:hyperlink w:anchor="_Toc243233747" w:history="1">
         <w:r>
           <w:rPr>
             <w:rStyle w:val="Hyperlink"/>
@@ -2485,7 +2518,7 @@
             <w:noProof/>
             <w:webHidden/>
           </w:rPr>
-          <w:instrText xml:space="preserve"> PAGEREF _Toc243218003 \h </w:instrText>
+          <w:instrText xml:space="preserve"> PAGEREF _Toc243233747 \h </w:instrText>
         </w:r>
         <w:r>
           <w:rPr>
@@ -2531,7 +2564,7 @@
           <w14:ligatures w14:val="standardContextual"/>
         </w:rPr>
       </w:pPr>
-      <w:hyperlink w:anchor="_Toc243218004" w:history="1">
+      <w:hyperlink w:anchor="_Toc243233748" w:history="1">
         <w:r>
           <w:rPr>
             <w:rStyle w:val="Hyperlink"/>
@@ -2558,7 +2591,7 @@
             <w:noProof/>
             <w:webHidden/>
           </w:rPr>
-          <w:instrText xml:space="preserve"> PAGEREF _Toc243218004 \h </w:instrText>
+          <w:instrText xml:space="preserve"> PAGEREF _Toc243233748 \h </w:instrText>
         </w:r>
         <w:r>
           <w:rPr>
@@ -2604,7 +2637,7 @@
           <w14:ligatures w14:val="standardContextual"/>
         </w:rPr>
       </w:pPr>
-      <w:hyperlink w:anchor="_Toc243218005" w:history="1">
+      <w:hyperlink w:anchor="_Toc243233749" w:history="1">
         <w:r>
           <w:rPr>
             <w:rStyle w:val="Hyperlink"/>
@@ -2631,7 +2664,7 @@
             <w:noProof/>
             <w:webHidden/>
           </w:rPr>
-          <w:instrText xml:space="preserve"> PAGEREF _Toc243218005 \h </w:instrText>
+          <w:instrText xml:space="preserve"> PAGEREF _Toc243233749 \h </w:instrText>
         </w:r>
         <w:r>
           <w:rPr>
@@ -2677,7 +2710,7 @@
           <w14:ligatures w14:val="standardContextual"/>
         </w:rPr>
       </w:pPr>
-      <w:hyperlink w:anchor="_Toc243218006" w:history="1">
+      <w:hyperlink w:anchor="_Toc243233750" w:history="1">
         <w:r>
           <w:rPr>
             <w:rStyle w:val="Hyperlink"/>
@@ -2704,7 +2737,7 @@
             <w:noProof/>
             <w:webHidden/>
           </w:rPr>
-          <w:instrText xml:space="preserve"> PAGEREF _Toc243218006 \h </w:instrText>
+          <w:instrText xml:space="preserve"> PAGEREF _Toc243233750 \h </w:instrText>
         </w:r>
         <w:r>
           <w:rPr>
@@ -2750,7 +2783,7 @@
           <w14:ligatures w14:val="standardContextual"/>
         </w:rPr>
       </w:pPr>
-      <w:hyperlink w:anchor="_Toc243218007" w:history="1">
+      <w:hyperlink w:anchor="_Toc243233751" w:history="1">
         <w:r>
           <w:rPr>
             <w:rStyle w:val="Hyperlink"/>
@@ -2777,7 +2810,7 @@
             <w:noProof/>
             <w:webHidden/>
           </w:rPr>
-          <w:instrText xml:space="preserve"> PAGEREF _Toc243218007 \h </w:instrText>
+          <w:instrText xml:space="preserve"> PAGEREF _Toc243233751 \h </w:instrText>
         </w:r>
         <w:r>
           <w:rPr>
@@ -2823,7 +2856,7 @@
           <w14:ligatures w14:val="standardContextual"/>
         </w:rPr>
       </w:pPr>
-      <w:hyperlink w:anchor="_Toc243218008" w:history="1">
+      <w:hyperlink w:anchor="_Toc243233752" w:history="1">
         <w:r>
           <w:rPr>
             <w:rStyle w:val="Hyperlink"/>
@@ -2850,7 +2883,7 @@
             <w:noProof/>
             <w:webHidden/>
           </w:rPr>
-          <w:instrText xml:space="preserve"> PAGEREF _Toc243218008 \h </w:instrText>
+          <w:instrText xml:space="preserve"> PAGEREF _Toc243233752 \h </w:instrText>
         </w:r>
         <w:r>
           <w:rPr>
@@ -2896,7 +2929,7 @@
           <w14:ligatures w14:val="standardContextual"/>
         </w:rPr>
       </w:pPr>
-      <w:hyperlink w:anchor="_Toc243218009" w:history="1">
+      <w:hyperlink w:anchor="_Toc243233753" w:history="1">
         <w:r>
           <w:rPr>
             <w:rStyle w:val="Hyperlink"/>
@@ -2923,7 +2956,7 @@
             <w:noProof/>
             <w:webHidden/>
           </w:rPr>
-          <w:instrText xml:space="preserve"> PAGEREF _Toc243218009 \h </w:instrText>
+          <w:instrText xml:space="preserve"> PAGEREF _Toc243233753 \h </w:instrText>
         </w:r>
         <w:r>
           <w:rPr>
@@ -2969,7 +3002,7 @@
           <w14:ligatures w14:val="standardContextual"/>
         </w:rPr>
       </w:pPr>
-      <w:hyperlink w:anchor="_Toc243218010" w:history="1">
+      <w:hyperlink w:anchor="_Toc243233754" w:history="1">
         <w:r>
           <w:rPr>
             <w:rStyle w:val="Hyperlink"/>
@@ -2996,7 +3029,7 @@
             <w:noProof/>
             <w:webHidden/>
           </w:rPr>
-          <w:instrText xml:space="preserve"> PAGEREF _Toc243218010 \h </w:instrText>
+          <w:instrText xml:space="preserve"> PAGEREF _Toc243233754 \h </w:instrText>
         </w:r>
         <w:r>
           <w:rPr>
@@ -3042,7 +3075,7 @@
           <w14:ligatures w14:val="standardContextual"/>
         </w:rPr>
       </w:pPr>
-      <w:hyperlink w:anchor="_Toc243218011" w:history="1">
+      <w:hyperlink w:anchor="_Toc243233755" w:history="1">
         <w:r>
           <w:rPr>
             <w:rStyle w:val="Hyperlink"/>
@@ -3069,7 +3102,7 @@
             <w:noProof/>
             <w:webHidden/>
           </w:rPr>
-          <w:instrText xml:space="preserve"> PAGEREF _Toc243218011 \h </w:instrText>
+          <w:instrText xml:space="preserve"> PAGEREF _Toc243233755 \h </w:instrText>
         </w:r>
         <w:r>
           <w:rPr>
@@ -3115,7 +3148,7 @@
           <w14:ligatures w14:val="standardContextual"/>
         </w:rPr>
       </w:pPr>
-      <w:hyperlink w:anchor="_Toc243218012" w:history="1">
+      <w:hyperlink w:anchor="_Toc243233756" w:history="1">
         <w:r>
           <w:rPr>
             <w:rStyle w:val="Hyperlink"/>
@@ -3142,7 +3175,7 @@
             <w:noProof/>
             <w:webHidden/>
           </w:rPr>
-          <w:instrText xml:space="preserve"> PAGEREF _Toc243218012 \h </w:instrText>
+          <w:instrText xml:space="preserve"> PAGEREF _Toc243233756 \h </w:instrText>
         </w:r>
         <w:r>
           <w:rPr>
@@ -3188,7 +3221,7 @@
           <w14:ligatures w14:val="standardContextual"/>
         </w:rPr>
       </w:pPr>
-      <w:hyperlink w:anchor="_Toc243218013" w:history="1">
+      <w:hyperlink w:anchor="_Toc243233757" w:history="1">
         <w:r>
           <w:rPr>
             <w:rStyle w:val="Hyperlink"/>
@@ -3215,7 +3248,7 @@
             <w:noProof/>
             <w:webHidden/>
           </w:rPr>
-          <w:instrText xml:space="preserve"> PAGEREF _Toc243218013 \h </w:instrText>
+          <w:instrText xml:space="preserve"> PAGEREF _Toc243233757 \h </w:instrText>
         </w:r>
         <w:r>
           <w:rPr>
@@ -3261,7 +3294,7 @@
           <w14:ligatures w14:val="standardContextual"/>
         </w:rPr>
       </w:pPr>
-      <w:hyperlink w:anchor="_Toc243218014" w:history="1">
+      <w:hyperlink w:anchor="_Toc243233758" w:history="1">
         <w:r>
           <w:rPr>
             <w:rStyle w:val="Hyperlink"/>
@@ -3288,7 +3321,7 @@
             <w:noProof/>
             <w:webHidden/>
           </w:rPr>
-          <w:instrText xml:space="preserve"> PAGEREF _Toc243218014 \h </w:instrText>
+          <w:instrText xml:space="preserve"> PAGEREF _Toc243233758 \h </w:instrText>
         </w:r>
         <w:r>
           <w:rPr>
@@ -3334,7 +3367,7 @@
           <w14:ligatures w14:val="standardContextual"/>
         </w:rPr>
       </w:pPr>
-      <w:hyperlink w:anchor="_Toc243218015" w:history="1">
+      <w:hyperlink w:anchor="_Toc243233759" w:history="1">
         <w:r>
           <w:rPr>
             <w:rStyle w:val="Hyperlink"/>
@@ -3361,7 +3394,7 @@
             <w:noProof/>
             <w:webHidden/>
           </w:rPr>
-          <w:instrText xml:space="preserve"> PAGEREF _Toc243218015 \h </w:instrText>
+          <w:instrText xml:space="preserve"> PAGEREF _Toc243233759 \h </w:instrText>
         </w:r>
         <w:r>
           <w:rPr>
@@ -3407,7 +3440,7 @@
           <w14:ligatures w14:val="standardContextual"/>
         </w:rPr>
       </w:pPr>
-      <w:hyperlink w:anchor="_Toc243218016" w:history="1">
+      <w:hyperlink w:anchor="_Toc243233760" w:history="1">
         <w:r>
           <w:rPr>
             <w:rStyle w:val="Hyperlink"/>
@@ -3434,7 +3467,7 @@
             <w:noProof/>
             <w:webHidden/>
           </w:rPr>
-          <w:instrText xml:space="preserve"> PAGEREF _Toc243218016 \h </w:instrText>
+          <w:instrText xml:space="preserve"> PAGEREF _Toc243233760 \h </w:instrText>
         </w:r>
         <w:r>
           <w:rPr>
@@ -3480,7 +3513,7 @@
           <w14:ligatures w14:val="standardContextual"/>
         </w:rPr>
       </w:pPr>
-      <w:hyperlink w:anchor="_Toc243218017" w:history="1">
+      <w:hyperlink w:anchor="_Toc243233761" w:history="1">
         <w:r>
           <w:rPr>
             <w:rStyle w:val="Hyperlink"/>
@@ -3507,7 +3540,7 @@
             <w:noProof/>
             <w:webHidden/>
           </w:rPr>
-          <w:instrText xml:space="preserve"> PAGEREF _Toc243218017 \h </w:instrText>
+          <w:instrText xml:space="preserve"> PAGEREF _Toc243233761 \h </w:instrText>
         </w:r>
         <w:r>
           <w:rPr>
@@ -3553,7 +3586,7 @@
           <w14:ligatures w14:val="standardContextual"/>
         </w:rPr>
       </w:pPr>
-      <w:hyperlink w:anchor="_Toc243218018" w:history="1">
+      <w:hyperlink w:anchor="_Toc243233762" w:history="1">
         <w:r>
           <w:rPr>
             <w:rStyle w:val="Hyperlink"/>
@@ -3580,7 +3613,7 @@
             <w:noProof/>
             <w:webHidden/>
           </w:rPr>
-          <w:instrText xml:space="preserve"> PAGEREF _Toc243218018 \h </w:instrText>
+          <w:instrText xml:space="preserve"> PAGEREF _Toc243233762 \h </w:instrText>
         </w:r>
         <w:r>
           <w:rPr>
@@ -3626,7 +3659,7 @@
           <w14:ligatures w14:val="standardContextual"/>
         </w:rPr>
       </w:pPr>
-      <w:hyperlink w:anchor="_Toc243218019" w:history="1">
+      <w:hyperlink w:anchor="_Toc243233763" w:history="1">
         <w:r>
           <w:rPr>
             <w:rStyle w:val="Hyperlink"/>
@@ -3653,7 +3686,7 @@
             <w:noProof/>
             <w:webHidden/>
           </w:rPr>
-          <w:instrText xml:space="preserve"> PAGEREF _Toc243218019 \h </w:instrText>
+          <w:instrText xml:space="preserve"> PAGEREF _Toc243233763 \h </w:instrText>
         </w:r>
         <w:r>
           <w:rPr>
@@ -3699,7 +3732,7 @@
           <w14:ligatures w14:val="standardContextual"/>
         </w:rPr>
       </w:pPr>
-      <w:hyperlink w:anchor="_Toc243218020" w:history="1">
+      <w:hyperlink w:anchor="_Toc243233764" w:history="1">
         <w:r>
           <w:rPr>
             <w:rStyle w:val="Hyperlink"/>
@@ -3726,7 +3759,7 @@
             <w:noProof/>
             <w:webHidden/>
           </w:rPr>
-          <w:instrText xml:space="preserve"> PAGEREF _Toc243218020 \h </w:instrText>
+          <w:instrText xml:space="preserve"> PAGEREF _Toc243233764 \h </w:instrText>
         </w:r>
         <w:r>
           <w:rPr>
@@ -3772,7 +3805,7 @@
           <w14:ligatures w14:val="standardContextual"/>
         </w:rPr>
       </w:pPr>
-      <w:hyperlink w:anchor="_Toc243218021" w:history="1">
+      <w:hyperlink w:anchor="_Toc243233765" w:history="1">
         <w:r>
           <w:rPr>
             <w:rStyle w:val="Hyperlink"/>
@@ -3799,7 +3832,7 @@
             <w:noProof/>
             <w:webHidden/>
           </w:rPr>
-          <w:instrText xml:space="preserve"> PAGEREF _Toc243218021 \h </w:instrText>
+          <w:instrText xml:space="preserve"> PAGEREF _Toc243233765 \h </w:instrText>
         </w:r>
         <w:r>
           <w:rPr>
@@ -3845,7 +3878,7 @@
           <w14:ligatures w14:val="standardContextual"/>
         </w:rPr>
       </w:pPr>
-      <w:hyperlink w:anchor="_Toc243218022" w:history="1">
+      <w:hyperlink w:anchor="_Toc243233766" w:history="1">
         <w:r>
           <w:rPr>
             <w:rStyle w:val="Hyperlink"/>
@@ -3872,7 +3905,7 @@
             <w:noProof/>
             <w:webHidden/>
           </w:rPr>
-          <w:instrText xml:space="preserve"> PAGEREF _Toc243218022 \h </w:instrText>
+          <w:instrText xml:space="preserve"> PAGEREF _Toc243233766 \h </w:instrText>
         </w:r>
         <w:r>
           <w:rPr>
@@ -3918,7 +3951,7 @@
           <w14:ligatures w14:val="standardContextual"/>
         </w:rPr>
       </w:pPr>
-      <w:hyperlink w:anchor="_Toc243218023" w:history="1">
+      <w:hyperlink w:anchor="_Toc243233767" w:history="1">
         <w:r>
           <w:rPr>
             <w:rStyle w:val="Hyperlink"/>
@@ -3945,7 +3978,7 @@
             <w:noProof/>
             <w:webHidden/>
           </w:rPr>
-          <w:instrText xml:space="preserve"> PAGEREF _Toc243218023 \h </w:instrText>
+          <w:instrText xml:space="preserve"> PAGEREF _Toc243233767 \h </w:instrText>
         </w:r>
         <w:r>
           <w:rPr>
@@ -3991,7 +4024,7 @@
           <w14:ligatures w14:val="standardContextual"/>
         </w:rPr>
       </w:pPr>
-      <w:hyperlink w:anchor="_Toc243218024" w:history="1">
+      <w:hyperlink w:anchor="_Toc243233768" w:history="1">
         <w:r>
           <w:rPr>
             <w:rStyle w:val="Hyperlink"/>
@@ -4018,7 +4051,7 @@
             <w:noProof/>
             <w:webHidden/>
           </w:rPr>
-          <w:instrText xml:space="preserve"> PAGEREF _Toc243218024 \h </w:instrText>
+          <w:instrText xml:space="preserve"> PAGEREF _Toc243233768 \h </w:instrText>
         </w:r>
         <w:r>
           <w:rPr>
@@ -4064,7 +4097,7 @@
           <w14:ligatures w14:val="standardContextual"/>
         </w:rPr>
       </w:pPr>
-      <w:hyperlink w:anchor="_Toc243218025" w:history="1">
+      <w:hyperlink w:anchor="_Toc243233769" w:history="1">
         <w:r>
           <w:rPr>
             <w:rStyle w:val="Hyperlink"/>
@@ -4091,7 +4124,7 @@
             <w:noProof/>
             <w:webHidden/>
           </w:rPr>
-          <w:instrText xml:space="preserve"> PAGEREF _Toc243218025 \h </w:instrText>
+          <w:instrText xml:space="preserve"> PAGEREF _Toc243233769 \h </w:instrText>
         </w:r>
         <w:r>
           <w:rPr>
@@ -4137,7 +4170,7 @@
           <w14:ligatures w14:val="standardContextual"/>
         </w:rPr>
       </w:pPr>
-      <w:hyperlink w:anchor="_Toc243218026" w:history="1">
+      <w:hyperlink w:anchor="_Toc243233770" w:history="1">
         <w:r>
           <w:rPr>
             <w:rStyle w:val="Hyperlink"/>
@@ -4164,7 +4197,7 @@
             <w:noProof/>
             <w:webHidden/>
           </w:rPr>
-          <w:instrText xml:space="preserve"> PAGEREF _Toc243218026 \h </w:instrText>
+          <w:instrText xml:space="preserve"> PAGEREF _Toc243233770 \h </w:instrText>
         </w:r>
         <w:r>
           <w:rPr>
@@ -4210,7 +4243,7 @@
           <w14:ligatures w14:val="standardContextual"/>
         </w:rPr>
       </w:pPr>
-      <w:hyperlink w:anchor="_Toc243218027" w:history="1">
+      <w:hyperlink w:anchor="_Toc243233771" w:history="1">
         <w:r>
           <w:rPr>
             <w:rStyle w:val="Hyperlink"/>
@@ -4237,7 +4270,7 @@
             <w:noProof/>
             <w:webHidden/>
           </w:rPr>
-          <w:instrText xml:space="preserve"> PAGEREF _Toc243218027 \h </w:instrText>
+          <w:instrText xml:space="preserve"> PAGEREF _Toc243233771 \h </w:instrText>
         </w:r>
         <w:r>
           <w:rPr>
@@ -4278,7 +4311,7 @@
         <w:pStyle w:val="Heading1"/>
         <w:pageBreakBefore/>
       </w:pPr>
-      <w:bookmarkStart w:id="0" w:name="_Toc243217973"/>
+      <w:bookmarkStart w:id="0" w:name="_Toc243233717"/>
       <w:r>
         <w:lastRenderedPageBreak/>
         <w:t>Ghi chú về bản nháp này</w:t>
@@ -4372,7 +4405,7 @@
         <w:pStyle w:val="Heading1"/>
         <w:pageBreakBefore/>
       </w:pPr>
-      <w:bookmarkStart w:id="1" w:name="_Toc243217974"/>
+      <w:bookmarkStart w:id="1" w:name="_Toc243233718"/>
       <w:r>
         <w:lastRenderedPageBreak/>
         <w:t>Chương 1. Giới thiệu</w:t>
@@ -4383,7 +4416,7 @@
       <w:pPr>
         <w:pStyle w:val="Heading2"/>
       </w:pPr>
-      <w:bookmarkStart w:id="2" w:name="_Toc243217975"/>
+      <w:bookmarkStart w:id="2" w:name="_Toc243233719"/>
       <w:r>
         <w:t>1.1. Bài toán đường đi ngắn nhất một nguồn</w:t>
       </w:r>
@@ -4411,7 +4444,7 @@
       <w:pPr>
         <w:pStyle w:val="Heading2"/>
       </w:pPr>
-      <w:bookmarkStart w:id="3" w:name="_Toc243217976"/>
+      <w:bookmarkStart w:id="3" w:name="_Toc243233720"/>
       <w:r>
         <w:t>1.2. Mục tiêu đồ án</w:t>
       </w:r>
@@ -4466,7 +4499,7 @@
       <w:pPr>
         <w:pStyle w:val="Heading2"/>
       </w:pPr>
-      <w:bookmarkStart w:id="4" w:name="_Toc243217977"/>
+      <w:bookmarkStart w:id="4" w:name="_Toc243233721"/>
       <w:r>
         <w:t>1.3. Phạm vi</w:t>
       </w:r>
@@ -4668,7 +4701,7 @@
       <w:pPr>
         <w:pStyle w:val="Heading2"/>
       </w:pPr>
-      <w:bookmarkStart w:id="5" w:name="_Toc243217978"/>
+      <w:bookmarkStart w:id="5" w:name="_Toc243233722"/>
       <w:r>
         <w:t>1.4. Sản phẩm nộp</w:t>
       </w:r>
@@ -5038,20 +5071,59 @@
     </w:p>
     <w:p>
       <w:pPr>
-        <w:pStyle w:val="Heading2"/>
-      </w:pPr>
-      <w:bookmarkStart w:id="6" w:name="_Toc243217979"/>
-      <w:r>
-        <w:t>1.5. Bố cục báo cáo</w:t>
-      </w:r>
-      <w:bookmarkEnd w:id="6"/>
-    </w:p>
-    <w:p>
-      <w:pPr>
         <w:ind w:firstLine="567"/>
         <w:jc w:val="both"/>
       </w:pPr>
       <w:r>
+        <w:rPr>
+          <w:b/>
+        </w:rPr>
+        <w:t>Truy cập sản phẩm.</w:t>
+      </w:r>
+      <w:r>
+        <w:t xml:space="preserve"> Bản chạy online đặt trên GitHub Pages: </w:t>
+      </w:r>
+      <w:hyperlink r:id="rId10">
+        <w:r>
+          <w:rPr>
+            <w:color w:val="1F4E9D"/>
+            <w:u w:val="single"/>
+          </w:rPr>
+          <w:t>https://hoangliem-ai.github.io/VisualDijkstra/</w:t>
+        </w:r>
+      </w:hyperlink>
+      <w:r>
+        <w:t xml:space="preserve"> — mở bằng trình duyệt, không cần cài đặt hay đăng nhập. Mã nguồn, bộ testcase, DEVLOG và report nằm trong repo công khai </w:t>
+      </w:r>
+      <w:hyperlink r:id="rId11">
+        <w:r>
+          <w:rPr>
+            <w:color w:val="1F4E9D"/>
+            <w:u w:val="single"/>
+          </w:rPr>
+          <w:t>https://github.com/HoangLiem-AI/VisualDijkstra</w:t>
+        </w:r>
+      </w:hyperlink>
+      <w:r>
+        <w:t>. Mọi link trong báo cáo đều để chế độ công khai, không cần xin quyền truy cập và không có thời hạn. Nếu không mở được bản online, có thể chạy trên máy theo mục cài đặt trong README.md (chỉ cần Node.js).</w:t>
+      </w:r>
+    </w:p>
+    <w:p>
+      <w:pPr>
+        <w:pStyle w:val="Heading2"/>
+      </w:pPr>
+      <w:bookmarkStart w:id="6" w:name="_Toc243233723"/>
+      <w:r>
+        <w:t>1.5. Bố cục báo cáo</w:t>
+      </w:r>
+      <w:bookmarkEnd w:id="6"/>
+    </w:p>
+    <w:p>
+      <w:pPr>
+        <w:ind w:firstLine="567"/>
+        <w:jc w:val="both"/>
+      </w:pPr>
+      <w:r>
         <w:t>Chương 2 trình bày cơ sở lý thuyết. Chương 3 và 4 trình bày thiết kế và cài đặt. Chương 5 chạy từng bước trên ví dụ thống nhất. Chương 6 và 7 là kiểm thử và đánh giá hiệu năng. Chương 8 tường thuật quá trình xây dựng, trong đó có cách sử dụng AI. Chương 9 là kết luận và hướng phát triển.</w:t>
       </w:r>
     </w:p>
@@ -5060,7 +5132,7 @@
         <w:pStyle w:val="Heading1"/>
         <w:pageBreakBefore/>
       </w:pPr>
-      <w:bookmarkStart w:id="7" w:name="_Toc243217980"/>
+      <w:bookmarkStart w:id="7" w:name="_Toc243233724"/>
       <w:r>
         <w:lastRenderedPageBreak/>
         <w:t>Chương 2. Cơ sở lý thuyết</w:t>
@@ -5071,7 +5143,7 @@
       <w:pPr>
         <w:pStyle w:val="Heading2"/>
       </w:pPr>
-      <w:bookmarkStart w:id="8" w:name="_Toc243217981"/>
+      <w:bookmarkStart w:id="8" w:name="_Toc243233725"/>
       <w:r>
         <w:t>2.1. Ba chiến lược giải cùng một bài toán</w:t>
       </w:r>
@@ -5443,7 +5515,7 @@
       <w:pPr>
         <w:pStyle w:val="Heading2"/>
       </w:pPr>
-      <w:bookmarkStart w:id="9" w:name="_Toc243217982"/>
+      <w:bookmarkStart w:id="9" w:name="_Toc243233726"/>
       <w:r>
         <w:t>2.2. Thuật toán Dijkstra</w:t>
       </w:r>
@@ -5773,7 +5845,7 @@
       <w:pPr>
         <w:pStyle w:val="Heading2"/>
       </w:pPr>
-      <w:bookmarkStart w:id="10" w:name="_Toc243217983"/>
+      <w:bookmarkStart w:id="10" w:name="_Toc243233727"/>
       <w:r>
         <w:t>2.3. Min-heap nhị phân và lazy deletion</w:t>
       </w:r>
@@ -5858,7 +5930,7 @@
       <w:pPr>
         <w:pStyle w:val="Heading2"/>
       </w:pPr>
-      <w:bookmarkStart w:id="11" w:name="_Toc243217984"/>
+      <w:bookmarkStart w:id="11" w:name="_Toc243233728"/>
       <w:r>
         <w:t>2.4. Bellman-Ford (quy hoạch động)</w:t>
       </w:r>
@@ -5922,7 +5994,7 @@
       <w:pPr>
         <w:pStyle w:val="Heading2"/>
       </w:pPr>
-      <w:bookmarkStart w:id="12" w:name="_Toc243217985"/>
+      <w:bookmarkStart w:id="12" w:name="_Toc243233729"/>
       <w:r>
         <w:t>2.5. Vì sao Dijkstra sai khi có cạnh âm</w:t>
       </w:r>
@@ -5989,7 +6061,7 @@
       <w:pPr>
         <w:pStyle w:val="Heading2"/>
       </w:pPr>
-      <w:bookmarkStart w:id="13" w:name="_Toc243217986"/>
+      <w:bookmarkStart w:id="13" w:name="_Toc243233730"/>
       <w:r>
         <w:t>2.6. So sánh tổng hợp</w:t>
       </w:r>
@@ -6533,7 +6605,7 @@
         <w:pStyle w:val="Heading1"/>
         <w:pageBreakBefore/>
       </w:pPr>
-      <w:bookmarkStart w:id="14" w:name="_Toc243217987"/>
+      <w:bookmarkStart w:id="14" w:name="_Toc243233731"/>
       <w:r>
         <w:lastRenderedPageBreak/>
         <w:t>Chương 3. Phân tích và thiết kế</w:t>
@@ -6544,7 +6616,7 @@
       <w:pPr>
         <w:pStyle w:val="Heading2"/>
       </w:pPr>
-      <w:bookmarkStart w:id="15" w:name="_Toc243217988"/>
+      <w:bookmarkStart w:id="15" w:name="_Toc243233732"/>
       <w:r>
         <w:t>3.1. Yêu cầu chức năng</w:t>
       </w:r>
@@ -6599,7 +6671,7 @@
       <w:pPr>
         <w:pStyle w:val="Heading2"/>
       </w:pPr>
-      <w:bookmarkStart w:id="16" w:name="_Toc243217989"/>
+      <w:bookmarkStart w:id="16" w:name="_Toc243233733"/>
       <w:r>
         <w:t>3.2. Kiến trúc: lõi sinh trace, giao diện chỉ phát lại</w:t>
       </w:r>
@@ -7393,7 +7465,7 @@
       <w:pPr>
         <w:pStyle w:val="Heading2"/>
       </w:pPr>
-      <w:bookmarkStart w:id="17" w:name="_Toc243217990"/>
+      <w:bookmarkStart w:id="17" w:name="_Toc243233734"/>
       <w:r>
         <w:t>3.3. Cấu trúc một bước trace</w:t>
       </w:r>
@@ -7914,7 +7986,7 @@
       <w:pPr>
         <w:pStyle w:val="Heading2"/>
       </w:pPr>
-      <w:bookmarkStart w:id="18" w:name="_Toc243217991"/>
+      <w:bookmarkStart w:id="18" w:name="_Toc243233735"/>
       <w:r>
         <w:t>3.4. Hàm relax(edge, t)</w:t>
       </w:r>
@@ -7953,7 +8025,7 @@
       <w:pPr>
         <w:pStyle w:val="Heading2"/>
       </w:pPr>
-      <w:bookmarkStart w:id="19" w:name="_Toc243217992"/>
+      <w:bookmarkStart w:id="19" w:name="_Toc243233736"/>
       <w:r>
         <w:t>3.5. Định dạng input/output và xử lý lỗi</w:t>
       </w:r>
@@ -8110,7 +8182,7 @@
       <w:pPr>
         <w:pStyle w:val="Heading2"/>
       </w:pPr>
-      <w:bookmarkStart w:id="20" w:name="_Toc243217993"/>
+      <w:bookmarkStart w:id="20" w:name="_Toc243233737"/>
       <w:r>
         <w:lastRenderedPageBreak/>
         <w:t>3.6. Các quyết định thiết kế</w:t>
@@ -8662,7 +8734,7 @@
         <w:pStyle w:val="Heading1"/>
         <w:pageBreakBefore/>
       </w:pPr>
-      <w:bookmarkStart w:id="21" w:name="_Toc243217994"/>
+      <w:bookmarkStart w:id="21" w:name="_Toc243233738"/>
       <w:r>
         <w:lastRenderedPageBreak/>
         <w:t>Chương 4. Cài đặt và giao diện</w:t>
@@ -8673,7 +8745,7 @@
       <w:pPr>
         <w:pStyle w:val="Heading2"/>
       </w:pPr>
-      <w:bookmarkStart w:id="22" w:name="_Toc243217995"/>
+      <w:bookmarkStart w:id="22" w:name="_Toc243233739"/>
       <w:r>
         <w:t>4.1. Vòng lặp chính của Dijkstra (min-heap)</w:t>
       </w:r>
@@ -9047,7 +9119,7 @@
       <w:pPr>
         <w:pStyle w:val="Heading2"/>
       </w:pPr>
-      <w:bookmarkStart w:id="23" w:name="_Toc243217996"/>
+      <w:bookmarkStart w:id="23" w:name="_Toc243233740"/>
       <w:r>
         <w:t>4.2. Min-heap: thao tác sift-down</w:t>
       </w:r>
@@ -9245,7 +9317,7 @@
       <w:pPr>
         <w:pStyle w:val="Heading2"/>
       </w:pPr>
-      <w:bookmarkStart w:id="24" w:name="_Toc243217997"/>
+      <w:bookmarkStart w:id="24" w:name="_Toc243233741"/>
       <w:r>
         <w:lastRenderedPageBreak/>
         <w:t>4.3. Giao diện</w:t>
@@ -9287,7 +9359,7 @@
                     <pic:cNvPicPr/>
                   </pic:nvPicPr>
                   <pic:blipFill>
-                    <a:blip r:embed="rId8"/>
+                    <a:blip r:embed="rId12"/>
                     <a:stretch>
                       <a:fillRect/>
                     </a:stretch>
@@ -9778,7 +9850,7 @@
                     <pic:cNvPicPr/>
                   </pic:nvPicPr>
                   <pic:blipFill>
-                    <a:blip r:embed="rId9"/>
+                    <a:blip r:embed="rId13"/>
                     <a:stretch>
                       <a:fillRect/>
                     </a:stretch>
@@ -9823,7 +9895,7 @@
       <w:pPr>
         <w:pStyle w:val="Heading2"/>
       </w:pPr>
-      <w:bookmarkStart w:id="25" w:name="_Toc243217998"/>
+      <w:bookmarkStart w:id="25" w:name="_Toc243233742"/>
       <w:r>
         <w:t>4.4. Cách chạy</w:t>
       </w:r>
@@ -9956,7 +10028,7 @@
         <w:pStyle w:val="Heading1"/>
         <w:pageBreakBefore/>
       </w:pPr>
-      <w:bookmarkStart w:id="26" w:name="_Toc243217999"/>
+      <w:bookmarkStart w:id="26" w:name="_Toc243233743"/>
       <w:r>
         <w:lastRenderedPageBreak/>
         <w:t>Chương 5. Ví dụ minh họa thống nhất</w:t>
@@ -9967,7 +10039,7 @@
       <w:pPr>
         <w:pStyle w:val="Heading2"/>
       </w:pPr>
-      <w:bookmarkStart w:id="27" w:name="_Toc243218000"/>
+      <w:bookmarkStart w:id="27" w:name="_Toc243233744"/>
       <w:r>
         <w:t>5.1. Đồ thị ví dụ</w:t>
       </w:r>
@@ -10298,7 +10370,7 @@
       <w:pPr>
         <w:pStyle w:val="Heading2"/>
       </w:pPr>
-      <w:bookmarkStart w:id="28" w:name="_Toc243218001"/>
+      <w:bookmarkStart w:id="28" w:name="_Toc243233745"/>
       <w:r>
         <w:t>5.2. Dijkstra (min-heap): toàn bộ 23 bước</w:t>
       </w:r>
@@ -12476,7 +12548,7 @@
       <w:pPr>
         <w:pStyle w:val="Heading2"/>
       </w:pPr>
-      <w:bookmarkStart w:id="29" w:name="_Toc243218002"/>
+      <w:bookmarkStart w:id="29" w:name="_Toc243233746"/>
       <w:r>
         <w:t>5.3. Các bước đáng chú ý</w:t>
       </w:r>
@@ -12524,354 +12596,6 @@
             <wp:extent cx="5760000" cy="3931231"/>
             <wp:effectExtent l="0" t="0" r="0" b="0"/>
             <wp:docPr id="3" name="Picture 3"/>
-            <wp:cNvGraphicFramePr>
-              <a:graphicFrameLocks xmlns:a="http://schemas.openxmlformats.org/drawingml/2006/main" noChangeAspect="1"/>
-            </wp:cNvGraphicFramePr>
-            <a:graphic xmlns:a="http://schemas.openxmlformats.org/drawingml/2006/main">
-              <a:graphicData uri="http://schemas.openxmlformats.org/drawingml/2006/picture">
-                <pic:pic xmlns:pic="http://schemas.openxmlformats.org/drawingml/2006/picture">
-                  <pic:nvPicPr>
-                    <pic:cNvPr id="0" name="image.png"/>
-                    <pic:cNvPicPr/>
-                  </pic:nvPicPr>
-                  <pic:blipFill>
-                    <a:blip r:embed="rId10"/>
-                    <a:stretch>
-                      <a:fillRect/>
-                    </a:stretch>
-                  </pic:blipFill>
-                  <pic:spPr>
-                    <a:xfrm>
-                      <a:off x="0" y="0"/>
-                      <a:ext cx="5760000" cy="3931231"/>
-                    </a:xfrm>
-                    <a:prstGeom prst="rect">
-                      <a:avLst/>
-                    </a:prstGeom>
-                  </pic:spPr>
-                </pic:pic>
-              </a:graphicData>
-            </a:graphic>
-          </wp:inline>
-        </w:drawing>
-      </w:r>
-    </w:p>
-    <w:p>
-      <w:pPr>
-        <w:spacing w:after="200"/>
-        <w:jc w:val="center"/>
-      </w:pPr>
-      <w:r>
-        <w:rPr>
-          <w:b/>
-          <w:sz w:val="24"/>
-        </w:rPr>
-        <w:t xml:space="preserve">Hình 5.1. </w:t>
-      </w:r>
-      <w:r>
-        <w:rPr>
-          <w:i/>
-          <w:sz w:val="24"/>
-        </w:rPr>
-        <w:t>Bước 6: relax 3→2, dist[2] giảm 4 → 3; (2, 4) trở thành phần tử cũ</w:t>
-      </w:r>
-    </w:p>
-    <w:p>
-      <w:pPr>
-        <w:pStyle w:val="Heading3"/>
-      </w:pPr>
-      <w:r>
-        <w:t>Bước 12 — lazy deletion</w:t>
-      </w:r>
-    </w:p>
-    <w:p>
-      <w:pPr>
-        <w:ind w:firstLine="567"/>
-        <w:jc w:val="both"/>
-      </w:pPr>
-      <w:r>
-        <w:t>Heap trả về (2, 4), nhưng đỉnh 2 đã được chốt ở bước 9 với dist = 3, nên phần tử này bị bỏ qua (dòng 5 của pseudo-code). Đây là cái giá của lazy deletion: heap lớn hơn một chút (10 lần push cho 6 đỉnh), đổi lại không cần decrease-key.</w:t>
-      </w:r>
-    </w:p>
-    <w:p>
-      <w:pPr>
-        <w:keepNext/>
-        <w:spacing w:after="40"/>
-        <w:jc w:val="center"/>
-      </w:pPr>
-      <w:r>
-        <w:rPr>
-          <w:noProof/>
-        </w:rPr>
-        <w:lastRenderedPageBreak/>
-        <w:drawing>
-          <wp:inline distT="0" distB="0" distL="0" distR="0" wp14:anchorId="735404D2" wp14:editId="7949D8DB">
-            <wp:extent cx="5760000" cy="3931231"/>
-            <wp:effectExtent l="0" t="0" r="0" b="0"/>
-            <wp:docPr id="4" name="Picture 4"/>
-            <wp:cNvGraphicFramePr>
-              <a:graphicFrameLocks xmlns:a="http://schemas.openxmlformats.org/drawingml/2006/main" noChangeAspect="1"/>
-            </wp:cNvGraphicFramePr>
-            <a:graphic xmlns:a="http://schemas.openxmlformats.org/drawingml/2006/main">
-              <a:graphicData uri="http://schemas.openxmlformats.org/drawingml/2006/picture">
-                <pic:pic xmlns:pic="http://schemas.openxmlformats.org/drawingml/2006/picture">
-                  <pic:nvPicPr>
-                    <pic:cNvPr id="0" name="image.png"/>
-                    <pic:cNvPicPr/>
-                  </pic:nvPicPr>
-                  <pic:blipFill>
-                    <a:blip r:embed="rId11"/>
-                    <a:stretch>
-                      <a:fillRect/>
-                    </a:stretch>
-                  </pic:blipFill>
-                  <pic:spPr>
-                    <a:xfrm>
-                      <a:off x="0" y="0"/>
-                      <a:ext cx="5760000" cy="3931231"/>
-                    </a:xfrm>
-                    <a:prstGeom prst="rect">
-                      <a:avLst/>
-                    </a:prstGeom>
-                  </pic:spPr>
-                </pic:pic>
-              </a:graphicData>
-            </a:graphic>
-          </wp:inline>
-        </w:drawing>
-      </w:r>
-    </w:p>
-    <w:p>
-      <w:pPr>
-        <w:spacing w:after="200"/>
-        <w:jc w:val="center"/>
-      </w:pPr>
-      <w:r>
-        <w:rPr>
-          <w:b/>
-          <w:sz w:val="24"/>
-        </w:rPr>
-        <w:t xml:space="preserve">Hình 5.2. </w:t>
-      </w:r>
-      <w:r>
-        <w:rPr>
-          <w:i/>
-          <w:sz w:val="24"/>
-        </w:rPr>
-        <w:t>Bước 12: lấy ra phần tử cũ (2, 4) và bỏ qua</w:t>
-      </w:r>
-    </w:p>
-    <w:p>
-      <w:pPr>
-        <w:pStyle w:val="Heading3"/>
-      </w:pPr>
-      <w:r>
-        <w:t>Bước 21 — không relax tới đỉnh đã chốt</w:t>
-      </w:r>
-    </w:p>
-    <w:p>
-      <w:pPr>
-        <w:ind w:firstLine="567"/>
-        <w:jc w:val="both"/>
-      </w:pPr>
-      <w:r>
-        <w:t>Đỉnh 6 được chốt với dist = 13; cạnh 6→4 dẫn tới đỉnh 4 đã chốt nên bị bỏ qua (dòng 7). Với trọng số không âm, việc này không bao giờ làm mất kết quả đúng (mục 2.2).</w:t>
-      </w:r>
-    </w:p>
-    <w:p>
-      <w:pPr>
-        <w:keepNext/>
-        <w:spacing w:after="40"/>
-        <w:jc w:val="center"/>
-      </w:pPr>
-      <w:r>
-        <w:rPr>
-          <w:noProof/>
-        </w:rPr>
-        <w:lastRenderedPageBreak/>
-        <w:drawing>
-          <wp:inline distT="0" distB="0" distL="0" distR="0" wp14:anchorId="21115168" wp14:editId="306CC266">
-            <wp:extent cx="5760000" cy="3931231"/>
-            <wp:effectExtent l="0" t="0" r="0" b="0"/>
-            <wp:docPr id="5" name="Picture 5"/>
-            <wp:cNvGraphicFramePr>
-              <a:graphicFrameLocks xmlns:a="http://schemas.openxmlformats.org/drawingml/2006/main" noChangeAspect="1"/>
-            </wp:cNvGraphicFramePr>
-            <a:graphic xmlns:a="http://schemas.openxmlformats.org/drawingml/2006/main">
-              <a:graphicData uri="http://schemas.openxmlformats.org/drawingml/2006/picture">
-                <pic:pic xmlns:pic="http://schemas.openxmlformats.org/drawingml/2006/picture">
-                  <pic:nvPicPr>
-                    <pic:cNvPr id="0" name="image.png"/>
-                    <pic:cNvPicPr/>
-                  </pic:nvPicPr>
-                  <pic:blipFill>
-                    <a:blip r:embed="rId12"/>
-                    <a:stretch>
-                      <a:fillRect/>
-                    </a:stretch>
-                  </pic:blipFill>
-                  <pic:spPr>
-                    <a:xfrm>
-                      <a:off x="0" y="0"/>
-                      <a:ext cx="5760000" cy="3931231"/>
-                    </a:xfrm>
-                    <a:prstGeom prst="rect">
-                      <a:avLst/>
-                    </a:prstGeom>
-                  </pic:spPr>
-                </pic:pic>
-              </a:graphicData>
-            </a:graphic>
-          </wp:inline>
-        </w:drawing>
-      </w:r>
-    </w:p>
-    <w:p>
-      <w:pPr>
-        <w:spacing w:after="200"/>
-        <w:jc w:val="center"/>
-      </w:pPr>
-      <w:r>
-        <w:rPr>
-          <w:b/>
-          <w:sz w:val="24"/>
-        </w:rPr>
-        <w:t xml:space="preserve">Hình 5.3. </w:t>
-      </w:r>
-      <w:r>
-        <w:rPr>
-          <w:i/>
-          <w:sz w:val="24"/>
-        </w:rPr>
-        <w:t>Bước 21: bỏ qua cạnh 6→4 vì đỉnh 4 đã chốt</w:t>
-      </w:r>
-    </w:p>
-    <w:p>
-      <w:pPr>
-        <w:pStyle w:val="Heading3"/>
-      </w:pPr>
-      <w:r>
-        <w:t>Bước 23 — kết quả</w:t>
-      </w:r>
-    </w:p>
-    <w:p>
-      <w:pPr>
-        <w:ind w:firstLine="567"/>
-        <w:jc w:val="both"/>
-      </w:pPr>
-      <w:r>
-        <w:t>Hàng đợi rỗng, thuật toán kết thúc. Đường đi ngắn nhất 1 → 3 → 2 → 4 → 5 → 6 có độ dài 1 + 2 + 5 + 2 + 3 = 13, được tô tím.</w:t>
-      </w:r>
-    </w:p>
-    <w:p>
-      <w:pPr>
-        <w:keepNext/>
-        <w:spacing w:after="40"/>
-        <w:jc w:val="center"/>
-      </w:pPr>
-      <w:r>
-        <w:rPr>
-          <w:noProof/>
-        </w:rPr>
-        <w:lastRenderedPageBreak/>
-        <w:drawing>
-          <wp:inline distT="0" distB="0" distL="0" distR="0" wp14:anchorId="576A7EB2" wp14:editId="2B8B62FC">
-            <wp:extent cx="5760000" cy="3763200"/>
-            <wp:effectExtent l="0" t="0" r="0" b="0"/>
-            <wp:docPr id="6" name="Picture 6"/>
-            <wp:cNvGraphicFramePr>
-              <a:graphicFrameLocks xmlns:a="http://schemas.openxmlformats.org/drawingml/2006/main" noChangeAspect="1"/>
-            </wp:cNvGraphicFramePr>
-            <a:graphic xmlns:a="http://schemas.openxmlformats.org/drawingml/2006/main">
-              <a:graphicData uri="http://schemas.openxmlformats.org/drawingml/2006/picture">
-                <pic:pic xmlns:pic="http://schemas.openxmlformats.org/drawingml/2006/picture">
-                  <pic:nvPicPr>
-                    <pic:cNvPr id="0" name="image.png"/>
-                    <pic:cNvPicPr/>
-                  </pic:nvPicPr>
-                  <pic:blipFill>
-                    <a:blip r:embed="rId13"/>
-                    <a:stretch>
-                      <a:fillRect/>
-                    </a:stretch>
-                  </pic:blipFill>
-                  <pic:spPr>
-                    <a:xfrm>
-                      <a:off x="0" y="0"/>
-                      <a:ext cx="5760000" cy="3763200"/>
-                    </a:xfrm>
-                    <a:prstGeom prst="rect">
-                      <a:avLst/>
-                    </a:prstGeom>
-                  </pic:spPr>
-                </pic:pic>
-              </a:graphicData>
-            </a:graphic>
-          </wp:inline>
-        </w:drawing>
-      </w:r>
-    </w:p>
-    <w:p>
-      <w:pPr>
-        <w:spacing w:after="200"/>
-        <w:jc w:val="center"/>
-      </w:pPr>
-      <w:r>
-        <w:rPr>
-          <w:b/>
-          <w:sz w:val="24"/>
-        </w:rPr>
-        <w:t xml:space="preserve">Hình 5.4. </w:t>
-      </w:r>
-      <w:r>
-        <w:rPr>
-          <w:i/>
-          <w:sz w:val="24"/>
-        </w:rPr>
-        <w:t>Bước 23: đường đi ngắn nhất 1 → 3 → 2 → 4 → 5 → 6, độ dài 13</w:t>
-      </w:r>
-    </w:p>
-    <w:p>
-      <w:pPr>
-        <w:pStyle w:val="Heading2"/>
-      </w:pPr>
-      <w:bookmarkStart w:id="30" w:name="_Toc243218003"/>
-      <w:r>
-        <w:t>5.4. Cùng đồ thị với Dijkstra mảng và Bellman-Ford</w:t>
-      </w:r>
-      <w:bookmarkEnd w:id="30"/>
-    </w:p>
-    <w:p>
-      <w:pPr>
-        <w:ind w:firstLine="567"/>
-        <w:jc w:val="both"/>
-      </w:pPr>
-      <w:r>
-        <w:rPr>
-          <w:b/>
-        </w:rPr>
-        <w:t>Dijkstra (mảng)</w:t>
-      </w:r>
-      <w:r>
-        <w:t xml:space="preserve"> cho 19 bước: các đỉnh được chốt theo đúng thứ tự như bản heap (1, 3, 2, 4, 5, 6) nhưng không có bước "bỏ qua phần tử cũ", vì mỗi lần chọn đỉnh là duyệt lại cả mảng dist. Khung bên phải hiện danh sách đỉnh ứng viên thay cho heap.</w:t>
-      </w:r>
-    </w:p>
-    <w:p>
-      <w:pPr>
-        <w:keepNext/>
-        <w:spacing w:after="40"/>
-        <w:jc w:val="center"/>
-      </w:pPr>
-      <w:r>
-        <w:rPr>
-          <w:noProof/>
-        </w:rPr>
-        <w:lastRenderedPageBreak/>
-        <w:drawing>
-          <wp:inline distT="0" distB="0" distL="0" distR="0" wp14:anchorId="1D611BBD" wp14:editId="3171F25C">
-            <wp:extent cx="5760000" cy="3931231"/>
-            <wp:effectExtent l="0" t="0" r="0" b="0"/>
-            <wp:docPr id="7" name="Picture 7"/>
             <wp:cNvGraphicFramePr>
               <a:graphicFrameLocks xmlns:a="http://schemas.openxmlformats.org/drawingml/2006/main" noChangeAspect="1"/>
             </wp:cNvGraphicFramePr>
@@ -12914,14 +12638,22 @@
           <w:b/>
           <w:sz w:val="24"/>
         </w:rPr>
-        <w:t xml:space="preserve">Hình 5.5. </w:t>
+        <w:t xml:space="preserve">Hình 5.1. </w:t>
       </w:r>
       <w:r>
         <w:rPr>
           <w:i/>
           <w:sz w:val="24"/>
         </w:rPr>
-        <w:t>Dijkstra (mảng), bước 6: danh sách ứng viên thay cho hàng đợi ưu tiên</w:t>
+        <w:t>Bước 6: relax 3→2, dist[2] giảm 4 → 3; (2, 4) trở thành phần tử cũ</w:t>
+      </w:r>
+    </w:p>
+    <w:p>
+      <w:pPr>
+        <w:pStyle w:val="Heading3"/>
+      </w:pPr>
+      <w:r>
+        <w:t>Bước 12 — lazy deletion</w:t>
       </w:r>
     </w:p>
     <w:p>
@@ -12930,22 +12662,7 @@
         <w:jc w:val="both"/>
       </w:pPr>
       <w:r>
-        <w:rPr>
-          <w:b/>
-        </w:rPr>
-        <w:t>Bellman-Ford</w:t>
-      </w:r>
-      <w:r>
-        <w:t xml:space="preserve"> cho 27 bước. Vì các cạnh trong input gần như đã theo thứ tự topo, vòng 1 đã tìm ra mọi khoảng cách đúng; vòng 2 duyệt lại 11 cạnh mà không cập nhật gì nên thuật toán </w:t>
-      </w:r>
-      <w:r>
-        <w:rPr>
-          <w:b/>
-        </w:rPr>
-        <w:t>dừng sớm</w:t>
-      </w:r>
-      <w:r>
-        <w:t>, không cần chạy đủ n − 1 = 5 vòng. Kết quả trùng với Dijkstra.</w:t>
+        <w:t>Heap trả về (2, 4), nhưng đỉnh 2 đã được chốt ở bước 9 với dist = 3, nên phần tử này bị bỏ qua (dòng 5 của pseudo-code). Đây là cái giá của lazy deletion: heap lớn hơn một chút (10 lần push cho 6 đỉnh), đổi lại không cần decrease-key.</w:t>
       </w:r>
     </w:p>
     <w:p>
@@ -12960,10 +12677,10 @@
         </w:rPr>
         <w:lastRenderedPageBreak/>
         <w:drawing>
-          <wp:inline distT="0" distB="0" distL="0" distR="0" wp14:anchorId="7B6B7EF2" wp14:editId="65F20DB6">
+          <wp:inline distT="0" distB="0" distL="0" distR="0" wp14:anchorId="735404D2" wp14:editId="7949D8DB">
             <wp:extent cx="5760000" cy="3931231"/>
             <wp:effectExtent l="0" t="0" r="0" b="0"/>
-            <wp:docPr id="8" name="Picture 8"/>
+            <wp:docPr id="4" name="Picture 4"/>
             <wp:cNvGraphicFramePr>
               <a:graphicFrameLocks xmlns:a="http://schemas.openxmlformats.org/drawingml/2006/main" noChangeAspect="1"/>
             </wp:cNvGraphicFramePr>
@@ -13006,6 +12723,361 @@
           <w:b/>
           <w:sz w:val="24"/>
         </w:rPr>
+        <w:t xml:space="preserve">Hình 5.2. </w:t>
+      </w:r>
+      <w:r>
+        <w:rPr>
+          <w:i/>
+          <w:sz w:val="24"/>
+        </w:rPr>
+        <w:t>Bước 12: lấy ra phần tử cũ (2, 4) và bỏ qua</w:t>
+      </w:r>
+    </w:p>
+    <w:p>
+      <w:pPr>
+        <w:pStyle w:val="Heading3"/>
+      </w:pPr>
+      <w:r>
+        <w:t>Bước 21 — không relax tới đỉnh đã chốt</w:t>
+      </w:r>
+    </w:p>
+    <w:p>
+      <w:pPr>
+        <w:ind w:firstLine="567"/>
+        <w:jc w:val="both"/>
+      </w:pPr>
+      <w:r>
+        <w:t>Đỉnh 6 được chốt với dist = 13; cạnh 6→4 dẫn tới đỉnh 4 đã chốt nên bị bỏ qua (dòng 7). Với trọng số không âm, việc này không bao giờ làm mất kết quả đúng (mục 2.2).</w:t>
+      </w:r>
+    </w:p>
+    <w:p>
+      <w:pPr>
+        <w:keepNext/>
+        <w:spacing w:after="40"/>
+        <w:jc w:val="center"/>
+      </w:pPr>
+      <w:r>
+        <w:rPr>
+          <w:noProof/>
+        </w:rPr>
+        <w:lastRenderedPageBreak/>
+        <w:drawing>
+          <wp:inline distT="0" distB="0" distL="0" distR="0" wp14:anchorId="21115168" wp14:editId="306CC266">
+            <wp:extent cx="5760000" cy="3931231"/>
+            <wp:effectExtent l="0" t="0" r="0" b="0"/>
+            <wp:docPr id="5" name="Picture 5"/>
+            <wp:cNvGraphicFramePr>
+              <a:graphicFrameLocks xmlns:a="http://schemas.openxmlformats.org/drawingml/2006/main" noChangeAspect="1"/>
+            </wp:cNvGraphicFramePr>
+            <a:graphic xmlns:a="http://schemas.openxmlformats.org/drawingml/2006/main">
+              <a:graphicData uri="http://schemas.openxmlformats.org/drawingml/2006/picture">
+                <pic:pic xmlns:pic="http://schemas.openxmlformats.org/drawingml/2006/picture">
+                  <pic:nvPicPr>
+                    <pic:cNvPr id="0" name="image.png"/>
+                    <pic:cNvPicPr/>
+                  </pic:nvPicPr>
+                  <pic:blipFill>
+                    <a:blip r:embed="rId16"/>
+                    <a:stretch>
+                      <a:fillRect/>
+                    </a:stretch>
+                  </pic:blipFill>
+                  <pic:spPr>
+                    <a:xfrm>
+                      <a:off x="0" y="0"/>
+                      <a:ext cx="5760000" cy="3931231"/>
+                    </a:xfrm>
+                    <a:prstGeom prst="rect">
+                      <a:avLst/>
+                    </a:prstGeom>
+                  </pic:spPr>
+                </pic:pic>
+              </a:graphicData>
+            </a:graphic>
+          </wp:inline>
+        </w:drawing>
+      </w:r>
+    </w:p>
+    <w:p>
+      <w:pPr>
+        <w:spacing w:after="200"/>
+        <w:jc w:val="center"/>
+      </w:pPr>
+      <w:r>
+        <w:rPr>
+          <w:b/>
+          <w:sz w:val="24"/>
+        </w:rPr>
+        <w:t xml:space="preserve">Hình 5.3. </w:t>
+      </w:r>
+      <w:r>
+        <w:rPr>
+          <w:i/>
+          <w:sz w:val="24"/>
+        </w:rPr>
+        <w:t>Bước 21: bỏ qua cạnh 6→4 vì đỉnh 4 đã chốt</w:t>
+      </w:r>
+    </w:p>
+    <w:p>
+      <w:pPr>
+        <w:pStyle w:val="Heading3"/>
+      </w:pPr>
+      <w:r>
+        <w:t>Bước 23 — kết quả</w:t>
+      </w:r>
+    </w:p>
+    <w:p>
+      <w:pPr>
+        <w:ind w:firstLine="567"/>
+        <w:jc w:val="both"/>
+      </w:pPr>
+      <w:r>
+        <w:t>Hàng đợi rỗng, thuật toán kết thúc. Đường đi ngắn nhất 1 → 3 → 2 → 4 → 5 → 6 có độ dài 1 + 2 + 5 + 2 + 3 = 13, được tô tím.</w:t>
+      </w:r>
+    </w:p>
+    <w:p>
+      <w:pPr>
+        <w:keepNext/>
+        <w:spacing w:after="40"/>
+        <w:jc w:val="center"/>
+      </w:pPr>
+      <w:r>
+        <w:rPr>
+          <w:noProof/>
+        </w:rPr>
+        <w:lastRenderedPageBreak/>
+        <w:drawing>
+          <wp:inline distT="0" distB="0" distL="0" distR="0" wp14:anchorId="576A7EB2" wp14:editId="2B8B62FC">
+            <wp:extent cx="5760000" cy="3763200"/>
+            <wp:effectExtent l="0" t="0" r="0" b="0"/>
+            <wp:docPr id="6" name="Picture 6"/>
+            <wp:cNvGraphicFramePr>
+              <a:graphicFrameLocks xmlns:a="http://schemas.openxmlformats.org/drawingml/2006/main" noChangeAspect="1"/>
+            </wp:cNvGraphicFramePr>
+            <a:graphic xmlns:a="http://schemas.openxmlformats.org/drawingml/2006/main">
+              <a:graphicData uri="http://schemas.openxmlformats.org/drawingml/2006/picture">
+                <pic:pic xmlns:pic="http://schemas.openxmlformats.org/drawingml/2006/picture">
+                  <pic:nvPicPr>
+                    <pic:cNvPr id="0" name="image.png"/>
+                    <pic:cNvPicPr/>
+                  </pic:nvPicPr>
+                  <pic:blipFill>
+                    <a:blip r:embed="rId17"/>
+                    <a:stretch>
+                      <a:fillRect/>
+                    </a:stretch>
+                  </pic:blipFill>
+                  <pic:spPr>
+                    <a:xfrm>
+                      <a:off x="0" y="0"/>
+                      <a:ext cx="5760000" cy="3763200"/>
+                    </a:xfrm>
+                    <a:prstGeom prst="rect">
+                      <a:avLst/>
+                    </a:prstGeom>
+                  </pic:spPr>
+                </pic:pic>
+              </a:graphicData>
+            </a:graphic>
+          </wp:inline>
+        </w:drawing>
+      </w:r>
+    </w:p>
+    <w:p>
+      <w:pPr>
+        <w:spacing w:after="200"/>
+        <w:jc w:val="center"/>
+      </w:pPr>
+      <w:r>
+        <w:rPr>
+          <w:b/>
+          <w:sz w:val="24"/>
+        </w:rPr>
+        <w:t xml:space="preserve">Hình 5.4. </w:t>
+      </w:r>
+      <w:r>
+        <w:rPr>
+          <w:i/>
+          <w:sz w:val="24"/>
+        </w:rPr>
+        <w:t>Bước 23: đường đi ngắn nhất 1 → 3 → 2 → 4 → 5 → 6, độ dài 13</w:t>
+      </w:r>
+    </w:p>
+    <w:p>
+      <w:pPr>
+        <w:pStyle w:val="Heading2"/>
+      </w:pPr>
+      <w:bookmarkStart w:id="30" w:name="_Toc243233747"/>
+      <w:r>
+        <w:t>5.4. Cùng đồ thị với Dijkstra mảng và Bellman-Ford</w:t>
+      </w:r>
+      <w:bookmarkEnd w:id="30"/>
+    </w:p>
+    <w:p>
+      <w:pPr>
+        <w:ind w:firstLine="567"/>
+        <w:jc w:val="both"/>
+      </w:pPr>
+      <w:r>
+        <w:rPr>
+          <w:b/>
+        </w:rPr>
+        <w:t>Dijkstra (mảng)</w:t>
+      </w:r>
+      <w:r>
+        <w:t xml:space="preserve"> cho 19 bước: các đỉnh được chốt theo đúng thứ tự như bản heap (1, 3, 2, 4, 5, 6) nhưng không có bước "bỏ qua phần tử cũ", vì mỗi lần chọn đỉnh là duyệt lại cả mảng dist. Khung bên phải hiện danh sách đỉnh ứng viên thay cho heap.</w:t>
+      </w:r>
+    </w:p>
+    <w:p>
+      <w:pPr>
+        <w:keepNext/>
+        <w:spacing w:after="40"/>
+        <w:jc w:val="center"/>
+      </w:pPr>
+      <w:r>
+        <w:rPr>
+          <w:noProof/>
+        </w:rPr>
+        <w:lastRenderedPageBreak/>
+        <w:drawing>
+          <wp:inline distT="0" distB="0" distL="0" distR="0" wp14:anchorId="1D611BBD" wp14:editId="3171F25C">
+            <wp:extent cx="5760000" cy="3931231"/>
+            <wp:effectExtent l="0" t="0" r="0" b="0"/>
+            <wp:docPr id="7" name="Picture 7"/>
+            <wp:cNvGraphicFramePr>
+              <a:graphicFrameLocks xmlns:a="http://schemas.openxmlformats.org/drawingml/2006/main" noChangeAspect="1"/>
+            </wp:cNvGraphicFramePr>
+            <a:graphic xmlns:a="http://schemas.openxmlformats.org/drawingml/2006/main">
+              <a:graphicData uri="http://schemas.openxmlformats.org/drawingml/2006/picture">
+                <pic:pic xmlns:pic="http://schemas.openxmlformats.org/drawingml/2006/picture">
+                  <pic:nvPicPr>
+                    <pic:cNvPr id="0" name="image.png"/>
+                    <pic:cNvPicPr/>
+                  </pic:nvPicPr>
+                  <pic:blipFill>
+                    <a:blip r:embed="rId18"/>
+                    <a:stretch>
+                      <a:fillRect/>
+                    </a:stretch>
+                  </pic:blipFill>
+                  <pic:spPr>
+                    <a:xfrm>
+                      <a:off x="0" y="0"/>
+                      <a:ext cx="5760000" cy="3931231"/>
+                    </a:xfrm>
+                    <a:prstGeom prst="rect">
+                      <a:avLst/>
+                    </a:prstGeom>
+                  </pic:spPr>
+                </pic:pic>
+              </a:graphicData>
+            </a:graphic>
+          </wp:inline>
+        </w:drawing>
+      </w:r>
+    </w:p>
+    <w:p>
+      <w:pPr>
+        <w:spacing w:after="200"/>
+        <w:jc w:val="center"/>
+      </w:pPr>
+      <w:r>
+        <w:rPr>
+          <w:b/>
+          <w:sz w:val="24"/>
+        </w:rPr>
+        <w:t xml:space="preserve">Hình 5.5. </w:t>
+      </w:r>
+      <w:r>
+        <w:rPr>
+          <w:i/>
+          <w:sz w:val="24"/>
+        </w:rPr>
+        <w:t>Dijkstra (mảng), bước 6: danh sách ứng viên thay cho hàng đợi ưu tiên</w:t>
+      </w:r>
+    </w:p>
+    <w:p>
+      <w:pPr>
+        <w:ind w:firstLine="567"/>
+        <w:jc w:val="both"/>
+      </w:pPr>
+      <w:r>
+        <w:rPr>
+          <w:b/>
+        </w:rPr>
+        <w:t>Bellman-Ford</w:t>
+      </w:r>
+      <w:r>
+        <w:t xml:space="preserve"> cho 27 bước. Vì các cạnh trong input gần như đã theo thứ tự topo, vòng 1 đã tìm ra mọi khoảng cách đúng; vòng 2 duyệt lại 11 cạnh mà không cập nhật gì nên thuật toán </w:t>
+      </w:r>
+      <w:r>
+        <w:rPr>
+          <w:b/>
+        </w:rPr>
+        <w:t>dừng sớm</w:t>
+      </w:r>
+      <w:r>
+        <w:t>, không cần chạy đủ n − 1 = 5 vòng. Kết quả trùng với Dijkstra.</w:t>
+      </w:r>
+    </w:p>
+    <w:p>
+      <w:pPr>
+        <w:keepNext/>
+        <w:spacing w:after="40"/>
+        <w:jc w:val="center"/>
+      </w:pPr>
+      <w:r>
+        <w:rPr>
+          <w:noProof/>
+        </w:rPr>
+        <w:lastRenderedPageBreak/>
+        <w:drawing>
+          <wp:inline distT="0" distB="0" distL="0" distR="0" wp14:anchorId="7B6B7EF2" wp14:editId="65F20DB6">
+            <wp:extent cx="5760000" cy="3931231"/>
+            <wp:effectExtent l="0" t="0" r="0" b="0"/>
+            <wp:docPr id="8" name="Picture 8"/>
+            <wp:cNvGraphicFramePr>
+              <a:graphicFrameLocks xmlns:a="http://schemas.openxmlformats.org/drawingml/2006/main" noChangeAspect="1"/>
+            </wp:cNvGraphicFramePr>
+            <a:graphic xmlns:a="http://schemas.openxmlformats.org/drawingml/2006/main">
+              <a:graphicData uri="http://schemas.openxmlformats.org/drawingml/2006/picture">
+                <pic:pic xmlns:pic="http://schemas.openxmlformats.org/drawingml/2006/picture">
+                  <pic:nvPicPr>
+                    <pic:cNvPr id="0" name="image.png"/>
+                    <pic:cNvPicPr/>
+                  </pic:nvPicPr>
+                  <pic:blipFill>
+                    <a:blip r:embed="rId19"/>
+                    <a:stretch>
+                      <a:fillRect/>
+                    </a:stretch>
+                  </pic:blipFill>
+                  <pic:spPr>
+                    <a:xfrm>
+                      <a:off x="0" y="0"/>
+                      <a:ext cx="5760000" cy="3931231"/>
+                    </a:xfrm>
+                    <a:prstGeom prst="rect">
+                      <a:avLst/>
+                    </a:prstGeom>
+                  </pic:spPr>
+                </pic:pic>
+              </a:graphicData>
+            </a:graphic>
+          </wp:inline>
+        </w:drawing>
+      </w:r>
+    </w:p>
+    <w:p>
+      <w:pPr>
+        <w:spacing w:after="200"/>
+        <w:jc w:val="center"/>
+      </w:pPr>
+      <w:r>
+        <w:rPr>
+          <w:b/>
+          <w:sz w:val="24"/>
+        </w:rPr>
         <w:t xml:space="preserve">Hình 5.6. </w:t>
       </w:r>
       <w:r>
@@ -13282,7 +13354,7 @@
       <w:pPr>
         <w:pStyle w:val="Heading2"/>
       </w:pPr>
-      <w:bookmarkStart w:id="31" w:name="_Toc243218004"/>
+      <w:bookmarkStart w:id="31" w:name="_Toc243233748"/>
       <w:r>
         <w:t>5.5. Cạnh âm và chu trình âm</w:t>
       </w:r>
@@ -13333,7 +13405,7 @@
                     <pic:cNvPicPr/>
                   </pic:nvPicPr>
                   <pic:blipFill>
-                    <a:blip r:embed="rId16"/>
+                    <a:blip r:embed="rId20"/>
                     <a:stretch>
                       <a:fillRect/>
                     </a:stretch>
@@ -13420,7 +13492,7 @@
                     <pic:cNvPicPr/>
                   </pic:nvPicPr>
                   <pic:blipFill>
-                    <a:blip r:embed="rId17"/>
+                    <a:blip r:embed="rId21"/>
                     <a:stretch>
                       <a:fillRect/>
                     </a:stretch>
@@ -13466,7 +13538,7 @@
         <w:pStyle w:val="Heading1"/>
         <w:pageBreakBefore/>
       </w:pPr>
-      <w:bookmarkStart w:id="32" w:name="_Toc243218005"/>
+      <w:bookmarkStart w:id="32" w:name="_Toc243233749"/>
       <w:r>
         <w:lastRenderedPageBreak/>
         <w:t>Chương 6. Kiểm thử</w:t>
@@ -13477,7 +13549,7 @@
       <w:pPr>
         <w:pStyle w:val="Heading2"/>
       </w:pPr>
-      <w:bookmarkStart w:id="33" w:name="_Toc243218006"/>
+      <w:bookmarkStart w:id="33" w:name="_Toc243233750"/>
       <w:r>
         <w:t>6.1. Chiến lược</w:t>
       </w:r>
@@ -13552,7 +13624,7 @@
       <w:pPr>
         <w:pStyle w:val="Heading2"/>
       </w:pPr>
-      <w:bookmarkStart w:id="34" w:name="_Toc243218007"/>
+      <w:bookmarkStart w:id="34" w:name="_Toc243233751"/>
       <w:r>
         <w:t>6.2. Bộ testcase</w:t>
       </w:r>
@@ -13937,7 +14009,7 @@
       <w:pPr>
         <w:pStyle w:val="Heading2"/>
       </w:pPr>
-      <w:bookmarkStart w:id="35" w:name="_Toc243218008"/>
+      <w:bookmarkStart w:id="35" w:name="_Toc243233752"/>
       <w:r>
         <w:t>6.3. Cách chấm</w:t>
       </w:r>
@@ -14003,7 +14075,7 @@
       <w:pPr>
         <w:pStyle w:val="Heading2"/>
       </w:pPr>
-      <w:bookmarkStart w:id="36" w:name="_Toc243218009"/>
+      <w:bookmarkStart w:id="36" w:name="_Toc243233753"/>
       <w:r>
         <w:t>6.4. Kết quả</w:t>
       </w:r>
@@ -14549,7 +14621,7 @@
       <w:pPr>
         <w:pStyle w:val="Heading2"/>
       </w:pPr>
-      <w:bookmarkStart w:id="37" w:name="_Toc243218010"/>
+      <w:bookmarkStart w:id="37" w:name="_Toc243233754"/>
       <w:r>
         <w:t>6.5. Bộ test có bắt được lỗi không? (mutation test)</w:t>
       </w:r>
@@ -14646,7 +14718,7 @@
         <w:pStyle w:val="Heading1"/>
         <w:pageBreakBefore/>
       </w:pPr>
-      <w:bookmarkStart w:id="38" w:name="_Toc243218011"/>
+      <w:bookmarkStart w:id="38" w:name="_Toc243233755"/>
       <w:r>
         <w:lastRenderedPageBreak/>
         <w:t>Chương 7. Đánh giá hiệu năng</w:t>
@@ -14657,7 +14729,7 @@
       <w:pPr>
         <w:pStyle w:val="Heading2"/>
       </w:pPr>
-      <w:bookmarkStart w:id="39" w:name="_Toc243218012"/>
+      <w:bookmarkStart w:id="39" w:name="_Toc243233756"/>
       <w:r>
         <w:t>7.1. Thiết lập</w:t>
       </w:r>
@@ -14724,7 +14796,7 @@
       <w:pPr>
         <w:pStyle w:val="Heading2"/>
       </w:pPr>
-      <w:bookmarkStart w:id="40" w:name="_Toc243218013"/>
+      <w:bookmarkStart w:id="40" w:name="_Toc243233757"/>
       <w:r>
         <w:t>7.2. Đồ thị thưa</w:t>
       </w:r>
@@ -15524,7 +15596,7 @@
                     <pic:cNvPicPr/>
                   </pic:nvPicPr>
                   <pic:blipFill>
-                    <a:blip r:embed="rId18"/>
+                    <a:blip r:embed="rId22"/>
                     <a:stretch>
                       <a:fillRect/>
                     </a:stretch>
@@ -15578,7 +15650,7 @@
       <w:pPr>
         <w:pStyle w:val="Heading2"/>
       </w:pPr>
-      <w:bookmarkStart w:id="41" w:name="_Toc243218014"/>
+      <w:bookmarkStart w:id="41" w:name="_Toc243233758"/>
       <w:r>
         <w:lastRenderedPageBreak/>
         <w:t>7.3. Đồ thị dày</w:t>
@@ -16199,7 +16271,7 @@
                     <pic:cNvPicPr/>
                   </pic:nvPicPr>
                   <pic:blipFill>
-                    <a:blip r:embed="rId19"/>
+                    <a:blip r:embed="rId23"/>
                     <a:stretch>
                       <a:fillRect/>
                     </a:stretch>
@@ -16253,7 +16325,7 @@
       <w:pPr>
         <w:pStyle w:val="Heading2"/>
       </w:pPr>
-      <w:bookmarkStart w:id="42" w:name="_Toc243218015"/>
+      <w:bookmarkStart w:id="42" w:name="_Toc243233759"/>
       <w:r>
         <w:t>7.4. Nhận xét</w:t>
       </w:r>
@@ -16319,7 +16391,7 @@
         <w:pStyle w:val="Heading1"/>
         <w:pageBreakBefore/>
       </w:pPr>
-      <w:bookmarkStart w:id="43" w:name="_Toc243218016"/>
+      <w:bookmarkStart w:id="43" w:name="_Toc243233760"/>
       <w:r>
         <w:lastRenderedPageBreak/>
         <w:t>Chương 8. Quá trình xây dựng và sử dụng AI</w:t>
@@ -16349,7 +16421,7 @@
       <w:pPr>
         <w:pStyle w:val="Heading2"/>
       </w:pPr>
-      <w:bookmarkStart w:id="44" w:name="_Toc243218017"/>
+      <w:bookmarkStart w:id="44" w:name="_Toc243233761"/>
       <w:r>
         <w:t>8.1. Công cụ và cách tổ chức làm việc</w:t>
       </w:r>
@@ -16728,7 +16800,7 @@
       <w:pPr>
         <w:pStyle w:val="Heading2"/>
       </w:pPr>
-      <w:bookmarkStart w:id="45" w:name="_Toc243218018"/>
+      <w:bookmarkStart w:id="45" w:name="_Toc243233762"/>
       <w:r>
         <w:t>8.2. Dòng thời gian</w:t>
       </w:r>
@@ -17903,7 +17975,7 @@
       <w:pPr>
         <w:pStyle w:val="Heading2"/>
       </w:pPr>
-      <w:bookmarkStart w:id="46" w:name="_Toc243218019"/>
+      <w:bookmarkStart w:id="46" w:name="_Toc243233763"/>
       <w:r>
         <w:t>8.3. Lỗi phát hiện và cách xử lý</w:t>
       </w:r>
@@ -18364,7 +18436,7 @@
       <w:pPr>
         <w:pStyle w:val="Heading2"/>
       </w:pPr>
-      <w:bookmarkStart w:id="47" w:name="_Toc243218020"/>
+      <w:bookmarkStart w:id="47" w:name="_Toc243233764"/>
       <w:r>
         <w:t>8.4. Kết quả của AI được kiểm chứng như thế nào</w:t>
       </w:r>
@@ -18455,7 +18527,7 @@
       <w:pPr>
         <w:pStyle w:val="Heading2"/>
       </w:pPr>
-      <w:bookmarkStart w:id="48" w:name="_Toc243218021"/>
+      <w:bookmarkStart w:id="48" w:name="_Toc243233765"/>
       <w:r>
         <w:t>8.5. Phân công giữa sinh viên và AI</w:t>
       </w:r>
@@ -18913,7 +18985,7 @@
       <w:pPr>
         <w:pStyle w:val="Heading2"/>
       </w:pPr>
-      <w:bookmarkStart w:id="49" w:name="_Toc243218022"/>
+      <w:bookmarkStart w:id="49" w:name="_Toc243233766"/>
       <w:r>
         <w:t>8.6. Nhận xét về việc dùng AI</w:t>
       </w:r>
@@ -18935,7 +19007,7 @@
         <w:pStyle w:val="Heading1"/>
         <w:pageBreakBefore/>
       </w:pPr>
-      <w:bookmarkStart w:id="50" w:name="_Toc243218023"/>
+      <w:bookmarkStart w:id="50" w:name="_Toc243233767"/>
       <w:r>
         <w:lastRenderedPageBreak/>
         <w:t>Chương 9. Kết luận và hướng phát triển</w:t>
@@ -18946,7 +19018,7 @@
       <w:pPr>
         <w:pStyle w:val="Heading2"/>
       </w:pPr>
-      <w:bookmarkStart w:id="51" w:name="_Toc243218024"/>
+      <w:bookmarkStart w:id="51" w:name="_Toc243233768"/>
       <w:r>
         <w:t>9.1. Kết quả đạt được</w:t>
       </w:r>
@@ -19001,7 +19073,7 @@
       <w:pPr>
         <w:pStyle w:val="Heading2"/>
       </w:pPr>
-      <w:bookmarkStart w:id="52" w:name="_Toc243218025"/>
+      <w:bookmarkStart w:id="52" w:name="_Toc243233769"/>
       <w:r>
         <w:t>9.2. Hạn chế</w:t>
       </w:r>
@@ -19047,7 +19119,7 @@
       <w:pPr>
         <w:pStyle w:val="Heading2"/>
       </w:pPr>
-      <w:bookmarkStart w:id="53" w:name="_Toc243218026"/>
+      <w:bookmarkStart w:id="53" w:name="_Toc243233770"/>
       <w:r>
         <w:t>9.3. Hướng phát triển</w:t>
       </w:r>
@@ -19098,19 +19170,10 @@
     </w:p>
     <w:p>
       <w:pPr>
-        <w:pStyle w:val="ListBullet"/>
-        <w:jc w:val="both"/>
-      </w:pPr>
-      <w:r>
-        <w:t>Triển khai lên GitHub Pages để dùng trực tiếp không cần cài đặt.</w:t>
-      </w:r>
-    </w:p>
-    <w:p>
-      <w:pPr>
         <w:pStyle w:val="Heading1"/>
         <w:pageBreakBefore/>
       </w:pPr>
-      <w:bookmarkStart w:id="54" w:name="_Toc243218027"/>
+      <w:bookmarkStart w:id="54" w:name="_Toc243233771"/>
       <w:r>
         <w:lastRenderedPageBreak/>
         <w:t>Tài liệu tham khảo</w:t>
@@ -19208,7 +19271,7 @@
       </w:r>
     </w:p>
     <w:sectPr>
-      <w:footerReference w:type="default" r:id="rId20"/>
+      <w:footerReference w:type="default" r:id="rId24"/>
       <w:pgSz w:w="11906" w:h="16838"/>
       <w:pgMar w:top="1134" w:right="1134" w:bottom="1134" w:left="1701" w:header="720" w:footer="720" w:gutter="0"/>
       <w:cols w:space="720"/>

</xml_diff>

<commit_message>
Thống nhất ký hiệu V, E trong report
Co-Authored-By: Claude Opus 5.5 <noreply@anthropic.com>
</commit_message>
<xml_diff>
--- a/4_Report/BaoCao.docx
+++ b/4_Report/BaoCao.docx
@@ -301,7 +301,7 @@
       <w:r>
         <w:fldChar w:fldCharType="separate"/>
       </w:r>
-      <w:hyperlink w:anchor="_Toc243233717" w:history="1">
+      <w:hyperlink w:anchor="_Toc243236137" w:history="1">
         <w:r>
           <w:rPr>
             <w:rStyle w:val="Hyperlink"/>
@@ -328,7 +328,7 @@
             <w:noProof/>
             <w:webHidden/>
           </w:rPr>
-          <w:instrText xml:space="preserve"> PAGEREF _Toc243233717 \h </w:instrText>
+          <w:instrText xml:space="preserve"> PAGEREF _Toc243236137 \h </w:instrText>
         </w:r>
         <w:r>
           <w:rPr>
@@ -374,7 +374,7 @@
           <w14:ligatures w14:val="standardContextual"/>
         </w:rPr>
       </w:pPr>
-      <w:hyperlink w:anchor="_Toc243233718" w:history="1">
+      <w:hyperlink w:anchor="_Toc243236138" w:history="1">
         <w:r>
           <w:rPr>
             <w:rStyle w:val="Hyperlink"/>
@@ -401,7 +401,7 @@
             <w:noProof/>
             <w:webHidden/>
           </w:rPr>
-          <w:instrText xml:space="preserve"> PAGEREF _Toc243233718 \h </w:instrText>
+          <w:instrText xml:space="preserve"> PAGEREF _Toc243236138 \h </w:instrText>
         </w:r>
         <w:r>
           <w:rPr>
@@ -447,7 +447,7 @@
           <w14:ligatures w14:val="standardContextual"/>
         </w:rPr>
       </w:pPr>
-      <w:hyperlink w:anchor="_Toc243233719" w:history="1">
+      <w:hyperlink w:anchor="_Toc243236139" w:history="1">
         <w:r>
           <w:rPr>
             <w:rStyle w:val="Hyperlink"/>
@@ -474,7 +474,7 @@
             <w:noProof/>
             <w:webHidden/>
           </w:rPr>
-          <w:instrText xml:space="preserve"> PAGEREF _Toc243233719 \h </w:instrText>
+          <w:instrText xml:space="preserve"> PAGEREF _Toc243236139 \h </w:instrText>
         </w:r>
         <w:r>
           <w:rPr>
@@ -520,7 +520,7 @@
           <w14:ligatures w14:val="standardContextual"/>
         </w:rPr>
       </w:pPr>
-      <w:hyperlink w:anchor="_Toc243233720" w:history="1">
+      <w:hyperlink w:anchor="_Toc243236140" w:history="1">
         <w:r>
           <w:rPr>
             <w:rStyle w:val="Hyperlink"/>
@@ -547,7 +547,7 @@
             <w:noProof/>
             <w:webHidden/>
           </w:rPr>
-          <w:instrText xml:space="preserve"> PAGEREF _Toc243233720 \h </w:instrText>
+          <w:instrText xml:space="preserve"> PAGEREF _Toc243236140 \h </w:instrText>
         </w:r>
         <w:r>
           <w:rPr>
@@ -593,7 +593,7 @@
           <w14:ligatures w14:val="standardContextual"/>
         </w:rPr>
       </w:pPr>
-      <w:hyperlink w:anchor="_Toc243233721" w:history="1">
+      <w:hyperlink w:anchor="_Toc243236141" w:history="1">
         <w:r>
           <w:rPr>
             <w:rStyle w:val="Hyperlink"/>
@@ -620,7 +620,7 @@
             <w:noProof/>
             <w:webHidden/>
           </w:rPr>
-          <w:instrText xml:space="preserve"> PAGEREF _Toc243233721 \h </w:instrText>
+          <w:instrText xml:space="preserve"> PAGEREF _Toc243236141 \h </w:instrText>
         </w:r>
         <w:r>
           <w:rPr>
@@ -666,7 +666,7 @@
           <w14:ligatures w14:val="standardContextual"/>
         </w:rPr>
       </w:pPr>
-      <w:hyperlink w:anchor="_Toc243233722" w:history="1">
+      <w:hyperlink w:anchor="_Toc243236142" w:history="1">
         <w:r>
           <w:rPr>
             <w:rStyle w:val="Hyperlink"/>
@@ -693,7 +693,7 @@
             <w:noProof/>
             <w:webHidden/>
           </w:rPr>
-          <w:instrText xml:space="preserve"> PAGEREF _Toc243233722 \h </w:instrText>
+          <w:instrText xml:space="preserve"> PAGEREF _Toc243236142 \h </w:instrText>
         </w:r>
         <w:r>
           <w:rPr>
@@ -739,7 +739,7 @@
           <w14:ligatures w14:val="standardContextual"/>
         </w:rPr>
       </w:pPr>
-      <w:hyperlink w:anchor="_Toc243233723" w:history="1">
+      <w:hyperlink w:anchor="_Toc243236143" w:history="1">
         <w:r>
           <w:rPr>
             <w:rStyle w:val="Hyperlink"/>
@@ -766,7 +766,7 @@
             <w:noProof/>
             <w:webHidden/>
           </w:rPr>
-          <w:instrText xml:space="preserve"> PAGEREF _Toc243233723 \h </w:instrText>
+          <w:instrText xml:space="preserve"> PAGEREF _Toc243236143 \h </w:instrText>
         </w:r>
         <w:r>
           <w:rPr>
@@ -812,7 +812,7 @@
           <w14:ligatures w14:val="standardContextual"/>
         </w:rPr>
       </w:pPr>
-      <w:hyperlink w:anchor="_Toc243233724" w:history="1">
+      <w:hyperlink w:anchor="_Toc243236144" w:history="1">
         <w:r>
           <w:rPr>
             <w:rStyle w:val="Hyperlink"/>
@@ -839,7 +839,7 @@
             <w:noProof/>
             <w:webHidden/>
           </w:rPr>
-          <w:instrText xml:space="preserve"> PAGEREF _Toc243233724 \h </w:instrText>
+          <w:instrText xml:space="preserve"> PAGEREF _Toc243236144 \h </w:instrText>
         </w:r>
         <w:r>
           <w:rPr>
@@ -885,7 +885,7 @@
           <w14:ligatures w14:val="standardContextual"/>
         </w:rPr>
       </w:pPr>
-      <w:hyperlink w:anchor="_Toc243233725" w:history="1">
+      <w:hyperlink w:anchor="_Toc243236145" w:history="1">
         <w:r>
           <w:rPr>
             <w:rStyle w:val="Hyperlink"/>
@@ -912,7 +912,7 @@
             <w:noProof/>
             <w:webHidden/>
           </w:rPr>
-          <w:instrText xml:space="preserve"> PAGEREF _Toc243233725 \h </w:instrText>
+          <w:instrText xml:space="preserve"> PAGEREF _Toc243236145 \h </w:instrText>
         </w:r>
         <w:r>
           <w:rPr>
@@ -958,7 +958,7 @@
           <w14:ligatures w14:val="standardContextual"/>
         </w:rPr>
       </w:pPr>
-      <w:hyperlink w:anchor="_Toc243233726" w:history="1">
+      <w:hyperlink w:anchor="_Toc243236146" w:history="1">
         <w:r>
           <w:rPr>
             <w:rStyle w:val="Hyperlink"/>
@@ -985,7 +985,7 @@
             <w:noProof/>
             <w:webHidden/>
           </w:rPr>
-          <w:instrText xml:space="preserve"> PAGEREF _Toc243233726 \h </w:instrText>
+          <w:instrText xml:space="preserve"> PAGEREF _Toc243236146 \h </w:instrText>
         </w:r>
         <w:r>
           <w:rPr>
@@ -1031,7 +1031,7 @@
           <w14:ligatures w14:val="standardContextual"/>
         </w:rPr>
       </w:pPr>
-      <w:hyperlink w:anchor="_Toc243233727" w:history="1">
+      <w:hyperlink w:anchor="_Toc243236147" w:history="1">
         <w:r>
           <w:rPr>
             <w:rStyle w:val="Hyperlink"/>
@@ -1058,7 +1058,7 @@
             <w:noProof/>
             <w:webHidden/>
           </w:rPr>
-          <w:instrText xml:space="preserve"> PAGEREF _Toc243233727 \h </w:instrText>
+          <w:instrText xml:space="preserve"> PAGEREF _Toc243236147 \h </w:instrText>
         </w:r>
         <w:r>
           <w:rPr>
@@ -1104,7 +1104,7 @@
           <w14:ligatures w14:val="standardContextual"/>
         </w:rPr>
       </w:pPr>
-      <w:hyperlink w:anchor="_Toc243233728" w:history="1">
+      <w:hyperlink w:anchor="_Toc243236148" w:history="1">
         <w:r>
           <w:rPr>
             <w:rStyle w:val="Hyperlink"/>
@@ -1131,7 +1131,7 @@
             <w:noProof/>
             <w:webHidden/>
           </w:rPr>
-          <w:instrText xml:space="preserve"> PAGEREF _Toc243233728 \h </w:instrText>
+          <w:instrText xml:space="preserve"> PAGEREF _Toc243236148 \h </w:instrText>
         </w:r>
         <w:r>
           <w:rPr>
@@ -1177,7 +1177,7 @@
           <w14:ligatures w14:val="standardContextual"/>
         </w:rPr>
       </w:pPr>
-      <w:hyperlink w:anchor="_Toc243233729" w:history="1">
+      <w:hyperlink w:anchor="_Toc243236149" w:history="1">
         <w:r>
           <w:rPr>
             <w:rStyle w:val="Hyperlink"/>
@@ -1204,7 +1204,7 @@
             <w:noProof/>
             <w:webHidden/>
           </w:rPr>
-          <w:instrText xml:space="preserve"> PAGEREF _Toc243233729 \h </w:instrText>
+          <w:instrText xml:space="preserve"> PAGEREF _Toc243236149 \h </w:instrText>
         </w:r>
         <w:r>
           <w:rPr>
@@ -1250,7 +1250,7 @@
           <w14:ligatures w14:val="standardContextual"/>
         </w:rPr>
       </w:pPr>
-      <w:hyperlink w:anchor="_Toc243233730" w:history="1">
+      <w:hyperlink w:anchor="_Toc243236150" w:history="1">
         <w:r>
           <w:rPr>
             <w:rStyle w:val="Hyperlink"/>
@@ -1277,7 +1277,7 @@
             <w:noProof/>
             <w:webHidden/>
           </w:rPr>
-          <w:instrText xml:space="preserve"> PAGEREF _Toc243233730 \h </w:instrText>
+          <w:instrText xml:space="preserve"> PAGEREF _Toc243236150 \h </w:instrText>
         </w:r>
         <w:r>
           <w:rPr>
@@ -1323,7 +1323,7 @@
           <w14:ligatures w14:val="standardContextual"/>
         </w:rPr>
       </w:pPr>
-      <w:hyperlink w:anchor="_Toc243233731" w:history="1">
+      <w:hyperlink w:anchor="_Toc243236151" w:history="1">
         <w:r>
           <w:rPr>
             <w:rStyle w:val="Hyperlink"/>
@@ -1350,7 +1350,7 @@
             <w:noProof/>
             <w:webHidden/>
           </w:rPr>
-          <w:instrText xml:space="preserve"> PAGEREF _Toc243233731 \h </w:instrText>
+          <w:instrText xml:space="preserve"> PAGEREF _Toc243236151 \h </w:instrText>
         </w:r>
         <w:r>
           <w:rPr>
@@ -1396,7 +1396,7 @@
           <w14:ligatures w14:val="standardContextual"/>
         </w:rPr>
       </w:pPr>
-      <w:hyperlink w:anchor="_Toc243233732" w:history="1">
+      <w:hyperlink w:anchor="_Toc243236152" w:history="1">
         <w:r>
           <w:rPr>
             <w:rStyle w:val="Hyperlink"/>
@@ -1423,7 +1423,7 @@
             <w:noProof/>
             <w:webHidden/>
           </w:rPr>
-          <w:instrText xml:space="preserve"> PAGEREF _Toc243233732 \h </w:instrText>
+          <w:instrText xml:space="preserve"> PAGEREF _Toc243236152 \h </w:instrText>
         </w:r>
         <w:r>
           <w:rPr>
@@ -1469,7 +1469,7 @@
           <w14:ligatures w14:val="standardContextual"/>
         </w:rPr>
       </w:pPr>
-      <w:hyperlink w:anchor="_Toc243233733" w:history="1">
+      <w:hyperlink w:anchor="_Toc243236153" w:history="1">
         <w:r>
           <w:rPr>
             <w:rStyle w:val="Hyperlink"/>
@@ -1496,7 +1496,7 @@
             <w:noProof/>
             <w:webHidden/>
           </w:rPr>
-          <w:instrText xml:space="preserve"> PAGEREF _Toc243233733 \h </w:instrText>
+          <w:instrText xml:space="preserve"> PAGEREF _Toc243236153 \h </w:instrText>
         </w:r>
         <w:r>
           <w:rPr>
@@ -1542,7 +1542,7 @@
           <w14:ligatures w14:val="standardContextual"/>
         </w:rPr>
       </w:pPr>
-      <w:hyperlink w:anchor="_Toc243233734" w:history="1">
+      <w:hyperlink w:anchor="_Toc243236154" w:history="1">
         <w:r>
           <w:rPr>
             <w:rStyle w:val="Hyperlink"/>
@@ -1569,7 +1569,7 @@
             <w:noProof/>
             <w:webHidden/>
           </w:rPr>
-          <w:instrText xml:space="preserve"> PAGEREF _Toc243233734 \h </w:instrText>
+          <w:instrText xml:space="preserve"> PAGEREF _Toc243236154 \h </w:instrText>
         </w:r>
         <w:r>
           <w:rPr>
@@ -1615,7 +1615,7 @@
           <w14:ligatures w14:val="standardContextual"/>
         </w:rPr>
       </w:pPr>
-      <w:hyperlink w:anchor="_Toc243233735" w:history="1">
+      <w:hyperlink w:anchor="_Toc243236155" w:history="1">
         <w:r>
           <w:rPr>
             <w:rStyle w:val="Hyperlink"/>
@@ -1642,7 +1642,7 @@
             <w:noProof/>
             <w:webHidden/>
           </w:rPr>
-          <w:instrText xml:space="preserve"> PAGEREF _Toc243233735 \h </w:instrText>
+          <w:instrText xml:space="preserve"> PAGEREF _Toc243236155 \h </w:instrText>
         </w:r>
         <w:r>
           <w:rPr>
@@ -1688,7 +1688,7 @@
           <w14:ligatures w14:val="standardContextual"/>
         </w:rPr>
       </w:pPr>
-      <w:hyperlink w:anchor="_Toc243233736" w:history="1">
+      <w:hyperlink w:anchor="_Toc243236156" w:history="1">
         <w:r>
           <w:rPr>
             <w:rStyle w:val="Hyperlink"/>
@@ -1715,7 +1715,7 @@
             <w:noProof/>
             <w:webHidden/>
           </w:rPr>
-          <w:instrText xml:space="preserve"> PAGEREF _Toc243233736 \h </w:instrText>
+          <w:instrText xml:space="preserve"> PAGEREF _Toc243236156 \h </w:instrText>
         </w:r>
         <w:r>
           <w:rPr>
@@ -1761,7 +1761,7 @@
           <w14:ligatures w14:val="standardContextual"/>
         </w:rPr>
       </w:pPr>
-      <w:hyperlink w:anchor="_Toc243233737" w:history="1">
+      <w:hyperlink w:anchor="_Toc243236157" w:history="1">
         <w:r>
           <w:rPr>
             <w:rStyle w:val="Hyperlink"/>
@@ -1788,7 +1788,7 @@
             <w:noProof/>
             <w:webHidden/>
           </w:rPr>
-          <w:instrText xml:space="preserve"> PAGEREF _Toc243233737 \h </w:instrText>
+          <w:instrText xml:space="preserve"> PAGEREF _Toc243236157 \h </w:instrText>
         </w:r>
         <w:r>
           <w:rPr>
@@ -1834,7 +1834,7 @@
           <w14:ligatures w14:val="standardContextual"/>
         </w:rPr>
       </w:pPr>
-      <w:hyperlink w:anchor="_Toc243233738" w:history="1">
+      <w:hyperlink w:anchor="_Toc243236158" w:history="1">
         <w:r>
           <w:rPr>
             <w:rStyle w:val="Hyperlink"/>
@@ -1861,7 +1861,7 @@
             <w:noProof/>
             <w:webHidden/>
           </w:rPr>
-          <w:instrText xml:space="preserve"> PAGEREF _Toc243233738 \h </w:instrText>
+          <w:instrText xml:space="preserve"> PAGEREF _Toc243236158 \h </w:instrText>
         </w:r>
         <w:r>
           <w:rPr>
@@ -1907,7 +1907,7 @@
           <w14:ligatures w14:val="standardContextual"/>
         </w:rPr>
       </w:pPr>
-      <w:hyperlink w:anchor="_Toc243233739" w:history="1">
+      <w:hyperlink w:anchor="_Toc243236159" w:history="1">
         <w:r>
           <w:rPr>
             <w:rStyle w:val="Hyperlink"/>
@@ -1934,7 +1934,7 @@
             <w:noProof/>
             <w:webHidden/>
           </w:rPr>
-          <w:instrText xml:space="preserve"> PAGEREF _Toc243233739 \h </w:instrText>
+          <w:instrText xml:space="preserve"> PAGEREF _Toc243236159 \h </w:instrText>
         </w:r>
         <w:r>
           <w:rPr>
@@ -1980,7 +1980,7 @@
           <w14:ligatures w14:val="standardContextual"/>
         </w:rPr>
       </w:pPr>
-      <w:hyperlink w:anchor="_Toc243233740" w:history="1">
+      <w:hyperlink w:anchor="_Toc243236160" w:history="1">
         <w:r>
           <w:rPr>
             <w:rStyle w:val="Hyperlink"/>
@@ -2007,7 +2007,7 @@
             <w:noProof/>
             <w:webHidden/>
           </w:rPr>
-          <w:instrText xml:space="preserve"> PAGEREF _Toc243233740 \h </w:instrText>
+          <w:instrText xml:space="preserve"> PAGEREF _Toc243236160 \h </w:instrText>
         </w:r>
         <w:r>
           <w:rPr>
@@ -2053,7 +2053,7 @@
           <w14:ligatures w14:val="standardContextual"/>
         </w:rPr>
       </w:pPr>
-      <w:hyperlink w:anchor="_Toc243233741" w:history="1">
+      <w:hyperlink w:anchor="_Toc243236161" w:history="1">
         <w:r>
           <w:rPr>
             <w:rStyle w:val="Hyperlink"/>
@@ -2080,7 +2080,7 @@
             <w:noProof/>
             <w:webHidden/>
           </w:rPr>
-          <w:instrText xml:space="preserve"> PAGEREF _Toc243233741 \h </w:instrText>
+          <w:instrText xml:space="preserve"> PAGEREF _Toc243236161 \h </w:instrText>
         </w:r>
         <w:r>
           <w:rPr>
@@ -2126,7 +2126,7 @@
           <w14:ligatures w14:val="standardContextual"/>
         </w:rPr>
       </w:pPr>
-      <w:hyperlink w:anchor="_Toc243233742" w:history="1">
+      <w:hyperlink w:anchor="_Toc243236162" w:history="1">
         <w:r>
           <w:rPr>
             <w:rStyle w:val="Hyperlink"/>
@@ -2153,7 +2153,7 @@
             <w:noProof/>
             <w:webHidden/>
           </w:rPr>
-          <w:instrText xml:space="preserve"> PAGEREF _Toc243233742 \h </w:instrText>
+          <w:instrText xml:space="preserve"> PAGEREF _Toc243236162 \h </w:instrText>
         </w:r>
         <w:r>
           <w:rPr>
@@ -2199,7 +2199,7 @@
           <w14:ligatures w14:val="standardContextual"/>
         </w:rPr>
       </w:pPr>
-      <w:hyperlink w:anchor="_Toc243233743" w:history="1">
+      <w:hyperlink w:anchor="_Toc243236163" w:history="1">
         <w:r>
           <w:rPr>
             <w:rStyle w:val="Hyperlink"/>
@@ -2226,7 +2226,7 @@
             <w:noProof/>
             <w:webHidden/>
           </w:rPr>
-          <w:instrText xml:space="preserve"> PAGEREF _Toc243233743 \h </w:instrText>
+          <w:instrText xml:space="preserve"> PAGEREF _Toc243236163 \h </w:instrText>
         </w:r>
         <w:r>
           <w:rPr>
@@ -2272,7 +2272,7 @@
           <w14:ligatures w14:val="standardContextual"/>
         </w:rPr>
       </w:pPr>
-      <w:hyperlink w:anchor="_Toc243233744" w:history="1">
+      <w:hyperlink w:anchor="_Toc243236164" w:history="1">
         <w:r>
           <w:rPr>
             <w:rStyle w:val="Hyperlink"/>
@@ -2299,7 +2299,7 @@
             <w:noProof/>
             <w:webHidden/>
           </w:rPr>
-          <w:instrText xml:space="preserve"> PAGEREF _Toc243233744 \h </w:instrText>
+          <w:instrText xml:space="preserve"> PAGEREF _Toc243236164 \h </w:instrText>
         </w:r>
         <w:r>
           <w:rPr>
@@ -2345,7 +2345,7 @@
           <w14:ligatures w14:val="standardContextual"/>
         </w:rPr>
       </w:pPr>
-      <w:hyperlink w:anchor="_Toc243233745" w:history="1">
+      <w:hyperlink w:anchor="_Toc243236165" w:history="1">
         <w:r>
           <w:rPr>
             <w:rStyle w:val="Hyperlink"/>
@@ -2372,7 +2372,7 @@
             <w:noProof/>
             <w:webHidden/>
           </w:rPr>
-          <w:instrText xml:space="preserve"> PAGEREF _Toc243233745 \h </w:instrText>
+          <w:instrText xml:space="preserve"> PAGEREF _Toc243236165 \h </w:instrText>
         </w:r>
         <w:r>
           <w:rPr>
@@ -2418,7 +2418,7 @@
           <w14:ligatures w14:val="standardContextual"/>
         </w:rPr>
       </w:pPr>
-      <w:hyperlink w:anchor="_Toc243233746" w:history="1">
+      <w:hyperlink w:anchor="_Toc243236166" w:history="1">
         <w:r>
           <w:rPr>
             <w:rStyle w:val="Hyperlink"/>
@@ -2445,7 +2445,7 @@
             <w:noProof/>
             <w:webHidden/>
           </w:rPr>
-          <w:instrText xml:space="preserve"> PAGEREF _Toc243233746 \h </w:instrText>
+          <w:instrText xml:space="preserve"> PAGEREF _Toc243236166 \h </w:instrText>
         </w:r>
         <w:r>
           <w:rPr>
@@ -2491,7 +2491,7 @@
           <w14:ligatures w14:val="standardContextual"/>
         </w:rPr>
       </w:pPr>
-      <w:hyperlink w:anchor="_Toc243233747" w:history="1">
+      <w:hyperlink w:anchor="_Toc243236167" w:history="1">
         <w:r>
           <w:rPr>
             <w:rStyle w:val="Hyperlink"/>
@@ -2518,7 +2518,7 @@
             <w:noProof/>
             <w:webHidden/>
           </w:rPr>
-          <w:instrText xml:space="preserve"> PAGEREF _Toc243233747 \h </w:instrText>
+          <w:instrText xml:space="preserve"> PAGEREF _Toc243236167 \h </w:instrText>
         </w:r>
         <w:r>
           <w:rPr>
@@ -2564,7 +2564,7 @@
           <w14:ligatures w14:val="standardContextual"/>
         </w:rPr>
       </w:pPr>
-      <w:hyperlink w:anchor="_Toc243233748" w:history="1">
+      <w:hyperlink w:anchor="_Toc243236168" w:history="1">
         <w:r>
           <w:rPr>
             <w:rStyle w:val="Hyperlink"/>
@@ -2591,7 +2591,7 @@
             <w:noProof/>
             <w:webHidden/>
           </w:rPr>
-          <w:instrText xml:space="preserve"> PAGEREF _Toc243233748 \h </w:instrText>
+          <w:instrText xml:space="preserve"> PAGEREF _Toc243236168 \h </w:instrText>
         </w:r>
         <w:r>
           <w:rPr>
@@ -2637,7 +2637,7 @@
           <w14:ligatures w14:val="standardContextual"/>
         </w:rPr>
       </w:pPr>
-      <w:hyperlink w:anchor="_Toc243233749" w:history="1">
+      <w:hyperlink w:anchor="_Toc243236169" w:history="1">
         <w:r>
           <w:rPr>
             <w:rStyle w:val="Hyperlink"/>
@@ -2664,7 +2664,7 @@
             <w:noProof/>
             <w:webHidden/>
           </w:rPr>
-          <w:instrText xml:space="preserve"> PAGEREF _Toc243233749 \h </w:instrText>
+          <w:instrText xml:space="preserve"> PAGEREF _Toc243236169 \h </w:instrText>
         </w:r>
         <w:r>
           <w:rPr>
@@ -2710,7 +2710,7 @@
           <w14:ligatures w14:val="standardContextual"/>
         </w:rPr>
       </w:pPr>
-      <w:hyperlink w:anchor="_Toc243233750" w:history="1">
+      <w:hyperlink w:anchor="_Toc243236170" w:history="1">
         <w:r>
           <w:rPr>
             <w:rStyle w:val="Hyperlink"/>
@@ -2737,7 +2737,7 @@
             <w:noProof/>
             <w:webHidden/>
           </w:rPr>
-          <w:instrText xml:space="preserve"> PAGEREF _Toc243233750 \h </w:instrText>
+          <w:instrText xml:space="preserve"> PAGEREF _Toc243236170 \h </w:instrText>
         </w:r>
         <w:r>
           <w:rPr>
@@ -2783,7 +2783,7 @@
           <w14:ligatures w14:val="standardContextual"/>
         </w:rPr>
       </w:pPr>
-      <w:hyperlink w:anchor="_Toc243233751" w:history="1">
+      <w:hyperlink w:anchor="_Toc243236171" w:history="1">
         <w:r>
           <w:rPr>
             <w:rStyle w:val="Hyperlink"/>
@@ -2810,7 +2810,7 @@
             <w:noProof/>
             <w:webHidden/>
           </w:rPr>
-          <w:instrText xml:space="preserve"> PAGEREF _Toc243233751 \h </w:instrText>
+          <w:instrText xml:space="preserve"> PAGEREF _Toc243236171 \h </w:instrText>
         </w:r>
         <w:r>
           <w:rPr>
@@ -2856,7 +2856,7 @@
           <w14:ligatures w14:val="standardContextual"/>
         </w:rPr>
       </w:pPr>
-      <w:hyperlink w:anchor="_Toc243233752" w:history="1">
+      <w:hyperlink w:anchor="_Toc243236172" w:history="1">
         <w:r>
           <w:rPr>
             <w:rStyle w:val="Hyperlink"/>
@@ -2883,7 +2883,7 @@
             <w:noProof/>
             <w:webHidden/>
           </w:rPr>
-          <w:instrText xml:space="preserve"> PAGEREF _Toc243233752 \h </w:instrText>
+          <w:instrText xml:space="preserve"> PAGEREF _Toc243236172 \h </w:instrText>
         </w:r>
         <w:r>
           <w:rPr>
@@ -2929,7 +2929,7 @@
           <w14:ligatures w14:val="standardContextual"/>
         </w:rPr>
       </w:pPr>
-      <w:hyperlink w:anchor="_Toc243233753" w:history="1">
+      <w:hyperlink w:anchor="_Toc243236173" w:history="1">
         <w:r>
           <w:rPr>
             <w:rStyle w:val="Hyperlink"/>
@@ -2956,7 +2956,7 @@
             <w:noProof/>
             <w:webHidden/>
           </w:rPr>
-          <w:instrText xml:space="preserve"> PAGEREF _Toc243233753 \h </w:instrText>
+          <w:instrText xml:space="preserve"> PAGEREF _Toc243236173 \h </w:instrText>
         </w:r>
         <w:r>
           <w:rPr>
@@ -3002,7 +3002,7 @@
           <w14:ligatures w14:val="standardContextual"/>
         </w:rPr>
       </w:pPr>
-      <w:hyperlink w:anchor="_Toc243233754" w:history="1">
+      <w:hyperlink w:anchor="_Toc243236174" w:history="1">
         <w:r>
           <w:rPr>
             <w:rStyle w:val="Hyperlink"/>
@@ -3029,7 +3029,7 @@
             <w:noProof/>
             <w:webHidden/>
           </w:rPr>
-          <w:instrText xml:space="preserve"> PAGEREF _Toc243233754 \h </w:instrText>
+          <w:instrText xml:space="preserve"> PAGEREF _Toc243236174 \h </w:instrText>
         </w:r>
         <w:r>
           <w:rPr>
@@ -3075,7 +3075,7 @@
           <w14:ligatures w14:val="standardContextual"/>
         </w:rPr>
       </w:pPr>
-      <w:hyperlink w:anchor="_Toc243233755" w:history="1">
+      <w:hyperlink w:anchor="_Toc243236175" w:history="1">
         <w:r>
           <w:rPr>
             <w:rStyle w:val="Hyperlink"/>
@@ -3102,7 +3102,7 @@
             <w:noProof/>
             <w:webHidden/>
           </w:rPr>
-          <w:instrText xml:space="preserve"> PAGEREF _Toc243233755 \h </w:instrText>
+          <w:instrText xml:space="preserve"> PAGEREF _Toc243236175 \h </w:instrText>
         </w:r>
         <w:r>
           <w:rPr>
@@ -3148,7 +3148,7 @@
           <w14:ligatures w14:val="standardContextual"/>
         </w:rPr>
       </w:pPr>
-      <w:hyperlink w:anchor="_Toc243233756" w:history="1">
+      <w:hyperlink w:anchor="_Toc243236176" w:history="1">
         <w:r>
           <w:rPr>
             <w:rStyle w:val="Hyperlink"/>
@@ -3175,7 +3175,7 @@
             <w:noProof/>
             <w:webHidden/>
           </w:rPr>
-          <w:instrText xml:space="preserve"> PAGEREF _Toc243233756 \h </w:instrText>
+          <w:instrText xml:space="preserve"> PAGEREF _Toc243236176 \h </w:instrText>
         </w:r>
         <w:r>
           <w:rPr>
@@ -3221,7 +3221,7 @@
           <w14:ligatures w14:val="standardContextual"/>
         </w:rPr>
       </w:pPr>
-      <w:hyperlink w:anchor="_Toc243233757" w:history="1">
+      <w:hyperlink w:anchor="_Toc243236177" w:history="1">
         <w:r>
           <w:rPr>
             <w:rStyle w:val="Hyperlink"/>
@@ -3248,7 +3248,7 @@
             <w:noProof/>
             <w:webHidden/>
           </w:rPr>
-          <w:instrText xml:space="preserve"> PAGEREF _Toc243233757 \h </w:instrText>
+          <w:instrText xml:space="preserve"> PAGEREF _Toc243236177 \h </w:instrText>
         </w:r>
         <w:r>
           <w:rPr>
@@ -3294,7 +3294,7 @@
           <w14:ligatures w14:val="standardContextual"/>
         </w:rPr>
       </w:pPr>
-      <w:hyperlink w:anchor="_Toc243233758" w:history="1">
+      <w:hyperlink w:anchor="_Toc243236178" w:history="1">
         <w:r>
           <w:rPr>
             <w:rStyle w:val="Hyperlink"/>
@@ -3321,7 +3321,7 @@
             <w:noProof/>
             <w:webHidden/>
           </w:rPr>
-          <w:instrText xml:space="preserve"> PAGEREF _Toc243233758 \h </w:instrText>
+          <w:instrText xml:space="preserve"> PAGEREF _Toc243236178 \h </w:instrText>
         </w:r>
         <w:r>
           <w:rPr>
@@ -3367,7 +3367,7 @@
           <w14:ligatures w14:val="standardContextual"/>
         </w:rPr>
       </w:pPr>
-      <w:hyperlink w:anchor="_Toc243233759" w:history="1">
+      <w:hyperlink w:anchor="_Toc243236179" w:history="1">
         <w:r>
           <w:rPr>
             <w:rStyle w:val="Hyperlink"/>
@@ -3394,7 +3394,7 @@
             <w:noProof/>
             <w:webHidden/>
           </w:rPr>
-          <w:instrText xml:space="preserve"> PAGEREF _Toc243233759 \h </w:instrText>
+          <w:instrText xml:space="preserve"> PAGEREF _Toc243236179 \h </w:instrText>
         </w:r>
         <w:r>
           <w:rPr>
@@ -3440,7 +3440,7 @@
           <w14:ligatures w14:val="standardContextual"/>
         </w:rPr>
       </w:pPr>
-      <w:hyperlink w:anchor="_Toc243233760" w:history="1">
+      <w:hyperlink w:anchor="_Toc243236180" w:history="1">
         <w:r>
           <w:rPr>
             <w:rStyle w:val="Hyperlink"/>
@@ -3467,7 +3467,7 @@
             <w:noProof/>
             <w:webHidden/>
           </w:rPr>
-          <w:instrText xml:space="preserve"> PAGEREF _Toc243233760 \h </w:instrText>
+          <w:instrText xml:space="preserve"> PAGEREF _Toc243236180 \h </w:instrText>
         </w:r>
         <w:r>
           <w:rPr>
@@ -3513,7 +3513,7 @@
           <w14:ligatures w14:val="standardContextual"/>
         </w:rPr>
       </w:pPr>
-      <w:hyperlink w:anchor="_Toc243233761" w:history="1">
+      <w:hyperlink w:anchor="_Toc243236181" w:history="1">
         <w:r>
           <w:rPr>
             <w:rStyle w:val="Hyperlink"/>
@@ -3540,7 +3540,7 @@
             <w:noProof/>
             <w:webHidden/>
           </w:rPr>
-          <w:instrText xml:space="preserve"> PAGEREF _Toc243233761 \h </w:instrText>
+          <w:instrText xml:space="preserve"> PAGEREF _Toc243236181 \h </w:instrText>
         </w:r>
         <w:r>
           <w:rPr>
@@ -3586,7 +3586,7 @@
           <w14:ligatures w14:val="standardContextual"/>
         </w:rPr>
       </w:pPr>
-      <w:hyperlink w:anchor="_Toc243233762" w:history="1">
+      <w:hyperlink w:anchor="_Toc243236182" w:history="1">
         <w:r>
           <w:rPr>
             <w:rStyle w:val="Hyperlink"/>
@@ -3613,7 +3613,7 @@
             <w:noProof/>
             <w:webHidden/>
           </w:rPr>
-          <w:instrText xml:space="preserve"> PAGEREF _Toc243233762 \h </w:instrText>
+          <w:instrText xml:space="preserve"> PAGEREF _Toc243236182 \h </w:instrText>
         </w:r>
         <w:r>
           <w:rPr>
@@ -3659,7 +3659,7 @@
           <w14:ligatures w14:val="standardContextual"/>
         </w:rPr>
       </w:pPr>
-      <w:hyperlink w:anchor="_Toc243233763" w:history="1">
+      <w:hyperlink w:anchor="_Toc243236183" w:history="1">
         <w:r>
           <w:rPr>
             <w:rStyle w:val="Hyperlink"/>
@@ -3686,7 +3686,7 @@
             <w:noProof/>
             <w:webHidden/>
           </w:rPr>
-          <w:instrText xml:space="preserve"> PAGEREF _Toc243233763 \h </w:instrText>
+          <w:instrText xml:space="preserve"> PAGEREF _Toc243236183 \h </w:instrText>
         </w:r>
         <w:r>
           <w:rPr>
@@ -3732,7 +3732,7 @@
           <w14:ligatures w14:val="standardContextual"/>
         </w:rPr>
       </w:pPr>
-      <w:hyperlink w:anchor="_Toc243233764" w:history="1">
+      <w:hyperlink w:anchor="_Toc243236184" w:history="1">
         <w:r>
           <w:rPr>
             <w:rStyle w:val="Hyperlink"/>
@@ -3759,7 +3759,7 @@
             <w:noProof/>
             <w:webHidden/>
           </w:rPr>
-          <w:instrText xml:space="preserve"> PAGEREF _Toc243233764 \h </w:instrText>
+          <w:instrText xml:space="preserve"> PAGEREF _Toc243236184 \h </w:instrText>
         </w:r>
         <w:r>
           <w:rPr>
@@ -3805,7 +3805,7 @@
           <w14:ligatures w14:val="standardContextual"/>
         </w:rPr>
       </w:pPr>
-      <w:hyperlink w:anchor="_Toc243233765" w:history="1">
+      <w:hyperlink w:anchor="_Toc243236185" w:history="1">
         <w:r>
           <w:rPr>
             <w:rStyle w:val="Hyperlink"/>
@@ -3832,7 +3832,7 @@
             <w:noProof/>
             <w:webHidden/>
           </w:rPr>
-          <w:instrText xml:space="preserve"> PAGEREF _Toc243233765 \h </w:instrText>
+          <w:instrText xml:space="preserve"> PAGEREF _Toc243236185 \h </w:instrText>
         </w:r>
         <w:r>
           <w:rPr>
@@ -3878,7 +3878,7 @@
           <w14:ligatures w14:val="standardContextual"/>
         </w:rPr>
       </w:pPr>
-      <w:hyperlink w:anchor="_Toc243233766" w:history="1">
+      <w:hyperlink w:anchor="_Toc243236186" w:history="1">
         <w:r>
           <w:rPr>
             <w:rStyle w:val="Hyperlink"/>
@@ -3905,7 +3905,7 @@
             <w:noProof/>
             <w:webHidden/>
           </w:rPr>
-          <w:instrText xml:space="preserve"> PAGEREF _Toc243233766 \h </w:instrText>
+          <w:instrText xml:space="preserve"> PAGEREF _Toc243236186 \h </w:instrText>
         </w:r>
         <w:r>
           <w:rPr>
@@ -3951,7 +3951,7 @@
           <w14:ligatures w14:val="standardContextual"/>
         </w:rPr>
       </w:pPr>
-      <w:hyperlink w:anchor="_Toc243233767" w:history="1">
+      <w:hyperlink w:anchor="_Toc243236187" w:history="1">
         <w:r>
           <w:rPr>
             <w:rStyle w:val="Hyperlink"/>
@@ -3978,7 +3978,7 @@
             <w:noProof/>
             <w:webHidden/>
           </w:rPr>
-          <w:instrText xml:space="preserve"> PAGEREF _Toc243233767 \h </w:instrText>
+          <w:instrText xml:space="preserve"> PAGEREF _Toc243236187 \h </w:instrText>
         </w:r>
         <w:r>
           <w:rPr>
@@ -4024,7 +4024,7 @@
           <w14:ligatures w14:val="standardContextual"/>
         </w:rPr>
       </w:pPr>
-      <w:hyperlink w:anchor="_Toc243233768" w:history="1">
+      <w:hyperlink w:anchor="_Toc243236188" w:history="1">
         <w:r>
           <w:rPr>
             <w:rStyle w:val="Hyperlink"/>
@@ -4051,7 +4051,7 @@
             <w:noProof/>
             <w:webHidden/>
           </w:rPr>
-          <w:instrText xml:space="preserve"> PAGEREF _Toc243233768 \h </w:instrText>
+          <w:instrText xml:space="preserve"> PAGEREF _Toc243236188 \h </w:instrText>
         </w:r>
         <w:r>
           <w:rPr>
@@ -4097,7 +4097,7 @@
           <w14:ligatures w14:val="standardContextual"/>
         </w:rPr>
       </w:pPr>
-      <w:hyperlink w:anchor="_Toc243233769" w:history="1">
+      <w:hyperlink w:anchor="_Toc243236189" w:history="1">
         <w:r>
           <w:rPr>
             <w:rStyle w:val="Hyperlink"/>
@@ -4124,7 +4124,7 @@
             <w:noProof/>
             <w:webHidden/>
           </w:rPr>
-          <w:instrText xml:space="preserve"> PAGEREF _Toc243233769 \h </w:instrText>
+          <w:instrText xml:space="preserve"> PAGEREF _Toc243236189 \h </w:instrText>
         </w:r>
         <w:r>
           <w:rPr>
@@ -4170,7 +4170,7 @@
           <w14:ligatures w14:val="standardContextual"/>
         </w:rPr>
       </w:pPr>
-      <w:hyperlink w:anchor="_Toc243233770" w:history="1">
+      <w:hyperlink w:anchor="_Toc243236190" w:history="1">
         <w:r>
           <w:rPr>
             <w:rStyle w:val="Hyperlink"/>
@@ -4197,7 +4197,7 @@
             <w:noProof/>
             <w:webHidden/>
           </w:rPr>
-          <w:instrText xml:space="preserve"> PAGEREF _Toc243233770 \h </w:instrText>
+          <w:instrText xml:space="preserve"> PAGEREF _Toc243236190 \h </w:instrText>
         </w:r>
         <w:r>
           <w:rPr>
@@ -4243,7 +4243,7 @@
           <w14:ligatures w14:val="standardContextual"/>
         </w:rPr>
       </w:pPr>
-      <w:hyperlink w:anchor="_Toc243233771" w:history="1">
+      <w:hyperlink w:anchor="_Toc243236191" w:history="1">
         <w:r>
           <w:rPr>
             <w:rStyle w:val="Hyperlink"/>
@@ -4270,7 +4270,7 @@
             <w:noProof/>
             <w:webHidden/>
           </w:rPr>
-          <w:instrText xml:space="preserve"> PAGEREF _Toc243233771 \h </w:instrText>
+          <w:instrText xml:space="preserve"> PAGEREF _Toc243236191 \h </w:instrText>
         </w:r>
         <w:r>
           <w:rPr>
@@ -4311,7 +4311,7 @@
         <w:pStyle w:val="Heading1"/>
         <w:pageBreakBefore/>
       </w:pPr>
-      <w:bookmarkStart w:id="0" w:name="_Toc243233717"/>
+      <w:bookmarkStart w:id="0" w:name="_Toc243236137"/>
       <w:r>
         <w:lastRenderedPageBreak/>
         <w:t>Ghi chú về bản nháp này</w:t>
@@ -4405,7 +4405,7 @@
         <w:pStyle w:val="Heading1"/>
         <w:pageBreakBefore/>
       </w:pPr>
-      <w:bookmarkStart w:id="1" w:name="_Toc243233718"/>
+      <w:bookmarkStart w:id="1" w:name="_Toc243236138"/>
       <w:r>
         <w:lastRenderedPageBreak/>
         <w:t>Chương 1. Giới thiệu</w:t>
@@ -4416,7 +4416,7 @@
       <w:pPr>
         <w:pStyle w:val="Heading2"/>
       </w:pPr>
-      <w:bookmarkStart w:id="2" w:name="_Toc243233719"/>
+      <w:bookmarkStart w:id="2" w:name="_Toc243236139"/>
       <w:r>
         <w:t>1.1. Bài toán đường đi ngắn nhất một nguồn</w:t>
       </w:r>
@@ -4428,7 +4428,7 @@
         <w:jc w:val="both"/>
       </w:pPr>
       <w:r>
-        <w:t>Cho đồ thị có hướng có trọng số G = (V, E), hàm trọng số w: E → ℝ và một đỉnh nguồn s. Độ dài của đường đi p = ⟨v₀, v₁, …, v_k⟩ là tổng trọng số các cạnh trên đường đi. Khoảng cách ngắn nhất δ(s, v) là giá trị nhỏ nhất của độ dài các đường đi từ s tới v (bằng ∞ nếu không có đường đi). Bài toán yêu cầu tính δ(s, v) cho mọi đỉnh v, và nếu có đỉnh đích t thì chỉ ra một đường đi ngắn nhất từ s tới t.</w:t>
+        <w:t>Cho đồ thị có hướng có trọng số G = (V, E), hàm trọng số w: E → ℝ và một đỉnh nguồn s. Độ dài của đường đi p = ⟨v₀, v₁, …, v_k⟩ là tổng trọng số các cạnh trên đường đi. Khoảng cách ngắn nhất δ(s, v) là giá trị nhỏ nhất của độ dài các đường đi từ s tới v (bằng ∞ nếu không có đường đi). Bài toán yêu cầu tính δ(s, v) cho mọi đỉnh v, và nếu có đỉnh đích t thì chỉ ra một đường đi ngắn nhất từ s tới t. Để gọn, trong báo cáo V và E cũng dùng để chỉ số đỉnh và số cạnh, chính là n và m ở dòng đầu input.</w:t>
       </w:r>
     </w:p>
     <w:p>
@@ -4444,7 +4444,7 @@
       <w:pPr>
         <w:pStyle w:val="Heading2"/>
       </w:pPr>
-      <w:bookmarkStart w:id="3" w:name="_Toc243233720"/>
+      <w:bookmarkStart w:id="3" w:name="_Toc243236140"/>
       <w:r>
         <w:t>1.2. Mục tiêu đồ án</w:t>
       </w:r>
@@ -4499,7 +4499,7 @@
       <w:pPr>
         <w:pStyle w:val="Heading2"/>
       </w:pPr>
-      <w:bookmarkStart w:id="4" w:name="_Toc243233721"/>
+      <w:bookmarkStart w:id="4" w:name="_Toc243236141"/>
       <w:r>
         <w:t>1.3. Phạm vi</w:t>
       </w:r>
@@ -4701,7 +4701,7 @@
       <w:pPr>
         <w:pStyle w:val="Heading2"/>
       </w:pPr>
-      <w:bookmarkStart w:id="5" w:name="_Toc243233722"/>
+      <w:bookmarkStart w:id="5" w:name="_Toc243236142"/>
       <w:r>
         <w:t>1.4. Sản phẩm nộp</w:t>
       </w:r>
@@ -4815,7 +4815,14 @@
               <w:rPr>
                 <w:sz w:val="22"/>
               </w:rPr>
-              <w:t>Mã nguồn: giao diện web (HTML, CSS, JavaScript ES modules, Cytoscape.js), lõi thuật toán, script Node.</w:t>
+              <w:t xml:space="preserve">Mã nguồn: giao diện web (HTML, CSS, JavaScript ES modules, </w:t>
+            </w:r>
+            <w:r>
+              <w:rPr>
+                <w:sz w:val="22"/>
+              </w:rPr>
+              <w:lastRenderedPageBreak/>
+              <w:t>Cytoscape.js), lõi thuật toán, script Node.</w:t>
             </w:r>
           </w:p>
         </w:tc>
@@ -5112,7 +5119,7 @@
       <w:pPr>
         <w:pStyle w:val="Heading2"/>
       </w:pPr>
-      <w:bookmarkStart w:id="6" w:name="_Toc243233723"/>
+      <w:bookmarkStart w:id="6" w:name="_Toc243236143"/>
       <w:r>
         <w:t>1.5. Bố cục báo cáo</w:t>
       </w:r>
@@ -5132,7 +5139,7 @@
         <w:pStyle w:val="Heading1"/>
         <w:pageBreakBefore/>
       </w:pPr>
-      <w:bookmarkStart w:id="7" w:name="_Toc243233724"/>
+      <w:bookmarkStart w:id="7" w:name="_Toc243236144"/>
       <w:r>
         <w:lastRenderedPageBreak/>
         <w:t>Chương 2. Cơ sở lý thuyết</w:t>
@@ -5143,7 +5150,7 @@
       <w:pPr>
         <w:pStyle w:val="Heading2"/>
       </w:pPr>
-      <w:bookmarkStart w:id="8" w:name="_Toc243233725"/>
+      <w:bookmarkStart w:id="8" w:name="_Toc243236145"/>
       <w:r>
         <w:t>2.1. Ba chiến lược giải cùng một bài toán</w:t>
       </w:r>
@@ -5515,7 +5522,7 @@
       <w:pPr>
         <w:pStyle w:val="Heading2"/>
       </w:pPr>
-      <w:bookmarkStart w:id="9" w:name="_Toc243233726"/>
+      <w:bookmarkStart w:id="9" w:name="_Toc243236146"/>
       <w:r>
         <w:t>2.2. Thuật toán Dijkstra</w:t>
       </w:r>
@@ -5845,7 +5852,7 @@
       <w:pPr>
         <w:pStyle w:val="Heading2"/>
       </w:pPr>
-      <w:bookmarkStart w:id="10" w:name="_Toc243233727"/>
+      <w:bookmarkStart w:id="10" w:name="_Toc243236147"/>
       <w:r>
         <w:t>2.3. Min-heap nhị phân và lazy deletion</w:t>
       </w:r>
@@ -5930,7 +5937,7 @@
       <w:pPr>
         <w:pStyle w:val="Heading2"/>
       </w:pPr>
-      <w:bookmarkStart w:id="11" w:name="_Toc243233728"/>
+      <w:bookmarkStart w:id="11" w:name="_Toc243236148"/>
       <w:r>
         <w:t>2.4. Bellman-Ford (quy hoạch động)</w:t>
       </w:r>
@@ -5994,7 +6001,7 @@
       <w:pPr>
         <w:pStyle w:val="Heading2"/>
       </w:pPr>
-      <w:bookmarkStart w:id="12" w:name="_Toc243233729"/>
+      <w:bookmarkStart w:id="12" w:name="_Toc243236149"/>
       <w:r>
         <w:t>2.5. Vì sao Dijkstra sai khi có cạnh âm</w:t>
       </w:r>
@@ -6061,7 +6068,7 @@
       <w:pPr>
         <w:pStyle w:val="Heading2"/>
       </w:pPr>
-      <w:bookmarkStart w:id="13" w:name="_Toc243233730"/>
+      <w:bookmarkStart w:id="13" w:name="_Toc243236150"/>
       <w:r>
         <w:t>2.6. So sánh tổng hợp</w:t>
       </w:r>
@@ -6605,7 +6612,7 @@
         <w:pStyle w:val="Heading1"/>
         <w:pageBreakBefore/>
       </w:pPr>
-      <w:bookmarkStart w:id="14" w:name="_Toc243233731"/>
+      <w:bookmarkStart w:id="14" w:name="_Toc243236151"/>
       <w:r>
         <w:lastRenderedPageBreak/>
         <w:t>Chương 3. Phân tích và thiết kế</w:t>
@@ -6616,7 +6623,7 @@
       <w:pPr>
         <w:pStyle w:val="Heading2"/>
       </w:pPr>
-      <w:bookmarkStart w:id="15" w:name="_Toc243233732"/>
+      <w:bookmarkStart w:id="15" w:name="_Toc243236152"/>
       <w:r>
         <w:t>3.1. Yêu cầu chức năng</w:t>
       </w:r>
@@ -6671,7 +6678,7 @@
       <w:pPr>
         <w:pStyle w:val="Heading2"/>
       </w:pPr>
-      <w:bookmarkStart w:id="16" w:name="_Toc243233733"/>
+      <w:bookmarkStart w:id="16" w:name="_Toc243236153"/>
       <w:r>
         <w:t>3.2. Kiến trúc: lõi sinh trace, giao diện chỉ phát lại</w:t>
       </w:r>
@@ -7465,7 +7472,7 @@
       <w:pPr>
         <w:pStyle w:val="Heading2"/>
       </w:pPr>
-      <w:bookmarkStart w:id="17" w:name="_Toc243233734"/>
+      <w:bookmarkStart w:id="17" w:name="_Toc243236154"/>
       <w:r>
         <w:t>3.3. Cấu trúc một bước trace</w:t>
       </w:r>
@@ -7986,7 +7993,7 @@
       <w:pPr>
         <w:pStyle w:val="Heading2"/>
       </w:pPr>
-      <w:bookmarkStart w:id="18" w:name="_Toc243233735"/>
+      <w:bookmarkStart w:id="18" w:name="_Toc243236155"/>
       <w:r>
         <w:t>3.4. Hàm relax(edge, t)</w:t>
       </w:r>
@@ -8025,7 +8032,7 @@
       <w:pPr>
         <w:pStyle w:val="Heading2"/>
       </w:pPr>
-      <w:bookmarkStart w:id="19" w:name="_Toc243233736"/>
+      <w:bookmarkStart w:id="19" w:name="_Toc243236156"/>
       <w:r>
         <w:t>3.5. Định dạng input/output và xử lý lỗi</w:t>
       </w:r>
@@ -8182,7 +8189,7 @@
       <w:pPr>
         <w:pStyle w:val="Heading2"/>
       </w:pPr>
-      <w:bookmarkStart w:id="20" w:name="_Toc243233737"/>
+      <w:bookmarkStart w:id="20" w:name="_Toc243236157"/>
       <w:r>
         <w:lastRenderedPageBreak/>
         <w:t>3.6. Các quyết định thiết kế</w:t>
@@ -8596,7 +8603,7 @@
               <w:rPr>
                 <w:sz w:val="21"/>
               </w:rPr>
-              <w:t>Luôn chạy đủ n − 1 vòng</w:t>
+              <w:t>Luôn chạy đủ V − 1 vòng</w:t>
             </w:r>
           </w:p>
         </w:tc>
@@ -8734,7 +8741,7 @@
         <w:pStyle w:val="Heading1"/>
         <w:pageBreakBefore/>
       </w:pPr>
-      <w:bookmarkStart w:id="21" w:name="_Toc243233738"/>
+      <w:bookmarkStart w:id="21" w:name="_Toc243236158"/>
       <w:r>
         <w:lastRenderedPageBreak/>
         <w:t>Chương 4. Cài đặt và giao diện</w:t>
@@ -8745,7 +8752,7 @@
       <w:pPr>
         <w:pStyle w:val="Heading2"/>
       </w:pPr>
-      <w:bookmarkStart w:id="22" w:name="_Toc243233739"/>
+      <w:bookmarkStart w:id="22" w:name="_Toc243236159"/>
       <w:r>
         <w:t>4.1. Vòng lặp chính của Dijkstra (min-heap)</w:t>
       </w:r>
@@ -9119,7 +9126,7 @@
       <w:pPr>
         <w:pStyle w:val="Heading2"/>
       </w:pPr>
-      <w:bookmarkStart w:id="23" w:name="_Toc243233740"/>
+      <w:bookmarkStart w:id="23" w:name="_Toc243236160"/>
       <w:r>
         <w:t>4.2. Min-heap: thao tác sift-down</w:t>
       </w:r>
@@ -9317,7 +9324,7 @@
       <w:pPr>
         <w:pStyle w:val="Heading2"/>
       </w:pPr>
-      <w:bookmarkStart w:id="24" w:name="_Toc243233741"/>
+      <w:bookmarkStart w:id="24" w:name="_Toc243236161"/>
       <w:r>
         <w:lastRenderedPageBreak/>
         <w:t>4.3. Giao diện</w:t>
@@ -9895,7 +9902,7 @@
       <w:pPr>
         <w:pStyle w:val="Heading2"/>
       </w:pPr>
-      <w:bookmarkStart w:id="25" w:name="_Toc243233742"/>
+      <w:bookmarkStart w:id="25" w:name="_Toc243236162"/>
       <w:r>
         <w:t>4.4. Cách chạy</w:t>
       </w:r>
@@ -10028,7 +10035,7 @@
         <w:pStyle w:val="Heading1"/>
         <w:pageBreakBefore/>
       </w:pPr>
-      <w:bookmarkStart w:id="26" w:name="_Toc243233743"/>
+      <w:bookmarkStart w:id="26" w:name="_Toc243236163"/>
       <w:r>
         <w:lastRenderedPageBreak/>
         <w:t>Chương 5. Ví dụ minh họa thống nhất</w:t>
@@ -10039,7 +10046,7 @@
       <w:pPr>
         <w:pStyle w:val="Heading2"/>
       </w:pPr>
-      <w:bookmarkStart w:id="27" w:name="_Toc243233744"/>
+      <w:bookmarkStart w:id="27" w:name="_Toc243236164"/>
       <w:r>
         <w:t>5.1. Đồ thị ví dụ</w:t>
       </w:r>
@@ -10370,7 +10377,7 @@
       <w:pPr>
         <w:pStyle w:val="Heading2"/>
       </w:pPr>
-      <w:bookmarkStart w:id="28" w:name="_Toc243233745"/>
+      <w:bookmarkStart w:id="28" w:name="_Toc243236165"/>
       <w:r>
         <w:t>5.2. Dijkstra (min-heap): toàn bộ 23 bước</w:t>
       </w:r>
@@ -12548,7 +12555,7 @@
       <w:pPr>
         <w:pStyle w:val="Heading2"/>
       </w:pPr>
-      <w:bookmarkStart w:id="29" w:name="_Toc243233746"/>
+      <w:bookmarkStart w:id="29" w:name="_Toc243236166"/>
       <w:r>
         <w:t>5.3. Các bước đáng chú ý</w:t>
       </w:r>
@@ -12907,7 +12914,7 @@
       <w:pPr>
         <w:pStyle w:val="Heading2"/>
       </w:pPr>
-      <w:bookmarkStart w:id="30" w:name="_Toc243233747"/>
+      <w:bookmarkStart w:id="30" w:name="_Toc243236167"/>
       <w:r>
         <w:t>5.4. Cùng đồ thị với Dijkstra mảng và Bellman-Ford</w:t>
       </w:r>
@@ -13017,7 +13024,7 @@
         <w:t>dừng sớm</w:t>
       </w:r>
       <w:r>
-        <w:t>, không cần chạy đủ n − 1 = 5 vòng. Kết quả trùng với Dijkstra.</w:t>
+        <w:t>, không cần chạy đủ V − 1 = 5 vòng. Kết quả trùng với Dijkstra.</w:t>
       </w:r>
     </w:p>
     <w:p>
@@ -13354,7 +13361,7 @@
       <w:pPr>
         <w:pStyle w:val="Heading2"/>
       </w:pPr>
-      <w:bookmarkStart w:id="31" w:name="_Toc243233748"/>
+      <w:bookmarkStart w:id="31" w:name="_Toc243236168"/>
       <w:r>
         <w:t>5.5. Cạnh âm và chu trình âm</w:t>
       </w:r>
@@ -13452,7 +13459,7 @@
         <w:jc w:val="both"/>
       </w:pPr>
       <w:r>
-        <w:t xml:space="preserve">Với đồ thị có chu trình 2 → 3 → 4 → 2 tổng 1 + (−3) + 1 = −1, sau n − 1 = 4 vòng cạnh 2→3 vẫn relax được. Bellman-Ford báo chu trình âm, tô đỏ chu trình và output </w:t>
+        <w:t xml:space="preserve">Với đồ thị có chu trình 2 → 3 → 4 → 2 tổng 1 + (−3) + 1 = −1, sau V − 1 = 4 vòng cạnh 2→3 vẫn relax được. Bellman-Ford báo chu trình âm, tô đỏ chu trình và output </w:t>
       </w:r>
       <w:r>
         <w:rPr>
@@ -13538,7 +13545,7 @@
         <w:pStyle w:val="Heading1"/>
         <w:pageBreakBefore/>
       </w:pPr>
-      <w:bookmarkStart w:id="32" w:name="_Toc243233749"/>
+      <w:bookmarkStart w:id="32" w:name="_Toc243236169"/>
       <w:r>
         <w:lastRenderedPageBreak/>
         <w:t>Chương 6. Kiểm thử</w:t>
@@ -13549,7 +13556,7 @@
       <w:pPr>
         <w:pStyle w:val="Heading2"/>
       </w:pPr>
-      <w:bookmarkStart w:id="33" w:name="_Toc243233750"/>
+      <w:bookmarkStart w:id="33" w:name="_Toc243236170"/>
       <w:r>
         <w:t>6.1. Chiến lược</w:t>
       </w:r>
@@ -13624,7 +13631,7 @@
       <w:pPr>
         <w:pStyle w:val="Heading2"/>
       </w:pPr>
-      <w:bookmarkStart w:id="34" w:name="_Toc243233751"/>
+      <w:bookmarkStart w:id="34" w:name="_Toc243236171"/>
       <w:r>
         <w:t>6.2. Bộ testcase</w:t>
       </w:r>
@@ -14009,7 +14016,7 @@
       <w:pPr>
         <w:pStyle w:val="Heading2"/>
       </w:pPr>
-      <w:bookmarkStart w:id="35" w:name="_Toc243233752"/>
+      <w:bookmarkStart w:id="35" w:name="_Toc243236172"/>
       <w:r>
         <w:t>6.3. Cách chấm</w:t>
       </w:r>
@@ -14075,7 +14082,7 @@
       <w:pPr>
         <w:pStyle w:val="Heading2"/>
       </w:pPr>
-      <w:bookmarkStart w:id="36" w:name="_Toc243233753"/>
+      <w:bookmarkStart w:id="36" w:name="_Toc243236173"/>
       <w:r>
         <w:t>6.4. Kết quả</w:t>
       </w:r>
@@ -14621,7 +14628,7 @@
       <w:pPr>
         <w:pStyle w:val="Heading2"/>
       </w:pPr>
-      <w:bookmarkStart w:id="37" w:name="_Toc243233754"/>
+      <w:bookmarkStart w:id="37" w:name="_Toc243236174"/>
       <w:r>
         <w:t>6.5. Bộ test có bắt được lỗi không? (mutation test)</w:t>
       </w:r>
@@ -14718,7 +14725,7 @@
         <w:pStyle w:val="Heading1"/>
         <w:pageBreakBefore/>
       </w:pPr>
-      <w:bookmarkStart w:id="38" w:name="_Toc243233755"/>
+      <w:bookmarkStart w:id="38" w:name="_Toc243236175"/>
       <w:r>
         <w:lastRenderedPageBreak/>
         <w:t>Chương 7. Đánh giá hiệu năng</w:t>
@@ -14729,7 +14736,7 @@
       <w:pPr>
         <w:pStyle w:val="Heading2"/>
       </w:pPr>
-      <w:bookmarkStart w:id="39" w:name="_Toc243233756"/>
+      <w:bookmarkStart w:id="39" w:name="_Toc243236176"/>
       <w:r>
         <w:t>7.1. Thiết lập</w:t>
       </w:r>
@@ -14796,7 +14803,7 @@
       <w:pPr>
         <w:pStyle w:val="Heading2"/>
       </w:pPr>
-      <w:bookmarkStart w:id="40" w:name="_Toc243233757"/>
+      <w:bookmarkStart w:id="40" w:name="_Toc243236177"/>
       <w:r>
         <w:t>7.2. Đồ thị thưa</w:t>
       </w:r>
@@ -15650,7 +15657,7 @@
       <w:pPr>
         <w:pStyle w:val="Heading2"/>
       </w:pPr>
-      <w:bookmarkStart w:id="41" w:name="_Toc243233758"/>
+      <w:bookmarkStart w:id="41" w:name="_Toc243236178"/>
       <w:r>
         <w:lastRenderedPageBreak/>
         <w:t>7.3. Đồ thị dày</w:t>
@@ -16325,7 +16332,7 @@
       <w:pPr>
         <w:pStyle w:val="Heading2"/>
       </w:pPr>
-      <w:bookmarkStart w:id="42" w:name="_Toc243233759"/>
+      <w:bookmarkStart w:id="42" w:name="_Toc243236179"/>
       <w:r>
         <w:t>7.4. Nhận xét</w:t>
       </w:r>
@@ -16355,7 +16362,7 @@
         <w:jc w:val="both"/>
       </w:pPr>
       <w:r>
-        <w:t xml:space="preserve">Bellman-Ford trên đồ thị ngẫu nhiên chỉ cần 6–15 vòng nhờ dừng sớm (thay vì n − 1), nên chậm hơn Dijkstra chỉ vài lần chứ không tới hàng nghìn lần như cận O(V · E). Ngược lại, trên test lưới </w:t>
+        <w:t xml:space="preserve">Bellman-Ford trên đồ thị ngẫu nhiên chỉ cần 6–15 vòng nhờ dừng sớm (thay vì V − 1), nên chậm hơn Dijkstra chỉ vài lần chứ không tới hàng nghìn lần như cận O(V · E). Ngược lại, trên test lưới </w:t>
       </w:r>
       <w:r>
         <w:rPr>
@@ -16391,7 +16398,7 @@
         <w:pStyle w:val="Heading1"/>
         <w:pageBreakBefore/>
       </w:pPr>
-      <w:bookmarkStart w:id="43" w:name="_Toc243233760"/>
+      <w:bookmarkStart w:id="43" w:name="_Toc243236180"/>
       <w:r>
         <w:lastRenderedPageBreak/>
         <w:t>Chương 8. Quá trình xây dựng và sử dụng AI</w:t>
@@ -16421,7 +16428,7 @@
       <w:pPr>
         <w:pStyle w:val="Heading2"/>
       </w:pPr>
-      <w:bookmarkStart w:id="44" w:name="_Toc243233761"/>
+      <w:bookmarkStart w:id="44" w:name="_Toc243236181"/>
       <w:r>
         <w:t>8.1. Công cụ và cách tổ chức làm việc</w:t>
       </w:r>
@@ -16800,7 +16807,7 @@
       <w:pPr>
         <w:pStyle w:val="Heading2"/>
       </w:pPr>
-      <w:bookmarkStart w:id="45" w:name="_Toc243233762"/>
+      <w:bookmarkStart w:id="45" w:name="_Toc243236182"/>
       <w:r>
         <w:t>8.2. Dòng thời gian</w:t>
       </w:r>
@@ -17975,7 +17982,7 @@
       <w:pPr>
         <w:pStyle w:val="Heading2"/>
       </w:pPr>
-      <w:bookmarkStart w:id="46" w:name="_Toc243233763"/>
+      <w:bookmarkStart w:id="46" w:name="_Toc243236183"/>
       <w:r>
         <w:t>8.3. Lỗi phát hiện và cách xử lý</w:t>
       </w:r>
@@ -18436,7 +18443,7 @@
       <w:pPr>
         <w:pStyle w:val="Heading2"/>
       </w:pPr>
-      <w:bookmarkStart w:id="47" w:name="_Toc243233764"/>
+      <w:bookmarkStart w:id="47" w:name="_Toc243236184"/>
       <w:r>
         <w:t>8.4. Kết quả của AI được kiểm chứng như thế nào</w:t>
       </w:r>
@@ -18527,7 +18534,7 @@
       <w:pPr>
         <w:pStyle w:val="Heading2"/>
       </w:pPr>
-      <w:bookmarkStart w:id="48" w:name="_Toc243233765"/>
+      <w:bookmarkStart w:id="48" w:name="_Toc243236185"/>
       <w:r>
         <w:t>8.5. Phân công giữa sinh viên và AI</w:t>
       </w:r>
@@ -18985,7 +18992,7 @@
       <w:pPr>
         <w:pStyle w:val="Heading2"/>
       </w:pPr>
-      <w:bookmarkStart w:id="49" w:name="_Toc243233766"/>
+      <w:bookmarkStart w:id="49" w:name="_Toc243236186"/>
       <w:r>
         <w:t>8.6. Nhận xét về việc dùng AI</w:t>
       </w:r>
@@ -19007,7 +19014,7 @@
         <w:pStyle w:val="Heading1"/>
         <w:pageBreakBefore/>
       </w:pPr>
-      <w:bookmarkStart w:id="50" w:name="_Toc243233767"/>
+      <w:bookmarkStart w:id="50" w:name="_Toc243236187"/>
       <w:r>
         <w:lastRenderedPageBreak/>
         <w:t>Chương 9. Kết luận và hướng phát triển</w:t>
@@ -19018,7 +19025,7 @@
       <w:pPr>
         <w:pStyle w:val="Heading2"/>
       </w:pPr>
-      <w:bookmarkStart w:id="51" w:name="_Toc243233768"/>
+      <w:bookmarkStart w:id="51" w:name="_Toc243236188"/>
       <w:r>
         <w:t>9.1. Kết quả đạt được</w:t>
       </w:r>
@@ -19073,7 +19080,7 @@
       <w:pPr>
         <w:pStyle w:val="Heading2"/>
       </w:pPr>
-      <w:bookmarkStart w:id="52" w:name="_Toc243233769"/>
+      <w:bookmarkStart w:id="52" w:name="_Toc243236189"/>
       <w:r>
         <w:t>9.2. Hạn chế</w:t>
       </w:r>
@@ -19119,7 +19126,7 @@
       <w:pPr>
         <w:pStyle w:val="Heading2"/>
       </w:pPr>
-      <w:bookmarkStart w:id="53" w:name="_Toc243233770"/>
+      <w:bookmarkStart w:id="53" w:name="_Toc243236190"/>
       <w:r>
         <w:t>9.3. Hướng phát triển</w:t>
       </w:r>
@@ -19173,7 +19180,7 @@
         <w:pStyle w:val="Heading1"/>
         <w:pageBreakBefore/>
       </w:pPr>
-      <w:bookmarkStart w:id="54" w:name="_Toc243233771"/>
+      <w:bookmarkStart w:id="54" w:name="_Toc243236191"/>
       <w:r>
         <w:lastRenderedPageBreak/>
         <w:t>Tài liệu tham khảo</w:t>

</xml_diff>

<commit_message>
Thêm testcase mô phỏng mạng bưu chính
Co-Authored-By: Claude Opus 5.5 <noreply@anthropic.com>
</commit_message>
<xml_diff>
--- a/4_Report/BaoCao.docx
+++ b/4_Report/BaoCao.docx
@@ -301,7 +301,7 @@
       <w:r>
         <w:fldChar w:fldCharType="separate"/>
       </w:r>
-      <w:hyperlink w:anchor="_Toc243236137" w:history="1">
+      <w:hyperlink w:anchor="_Toc243248605" w:history="1">
         <w:r>
           <w:rPr>
             <w:rStyle w:val="Hyperlink"/>
@@ -328,7 +328,7 @@
             <w:noProof/>
             <w:webHidden/>
           </w:rPr>
-          <w:instrText xml:space="preserve"> PAGEREF _Toc243236137 \h </w:instrText>
+          <w:instrText xml:space="preserve"> PAGEREF _Toc243248605 \h </w:instrText>
         </w:r>
         <w:r>
           <w:rPr>
@@ -374,7 +374,7 @@
           <w14:ligatures w14:val="standardContextual"/>
         </w:rPr>
       </w:pPr>
-      <w:hyperlink w:anchor="_Toc243236138" w:history="1">
+      <w:hyperlink w:anchor="_Toc243248606" w:history="1">
         <w:r>
           <w:rPr>
             <w:rStyle w:val="Hyperlink"/>
@@ -401,7 +401,7 @@
             <w:noProof/>
             <w:webHidden/>
           </w:rPr>
-          <w:instrText xml:space="preserve"> PAGEREF _Toc243236138 \h </w:instrText>
+          <w:instrText xml:space="preserve"> PAGEREF _Toc243248606 \h </w:instrText>
         </w:r>
         <w:r>
           <w:rPr>
@@ -447,7 +447,7 @@
           <w14:ligatures w14:val="standardContextual"/>
         </w:rPr>
       </w:pPr>
-      <w:hyperlink w:anchor="_Toc243236139" w:history="1">
+      <w:hyperlink w:anchor="_Toc243248607" w:history="1">
         <w:r>
           <w:rPr>
             <w:rStyle w:val="Hyperlink"/>
@@ -474,7 +474,7 @@
             <w:noProof/>
             <w:webHidden/>
           </w:rPr>
-          <w:instrText xml:space="preserve"> PAGEREF _Toc243236139 \h </w:instrText>
+          <w:instrText xml:space="preserve"> PAGEREF _Toc243248607 \h </w:instrText>
         </w:r>
         <w:r>
           <w:rPr>
@@ -520,7 +520,7 @@
           <w14:ligatures w14:val="standardContextual"/>
         </w:rPr>
       </w:pPr>
-      <w:hyperlink w:anchor="_Toc243236140" w:history="1">
+      <w:hyperlink w:anchor="_Toc243248608" w:history="1">
         <w:r>
           <w:rPr>
             <w:rStyle w:val="Hyperlink"/>
@@ -547,7 +547,7 @@
             <w:noProof/>
             <w:webHidden/>
           </w:rPr>
-          <w:instrText xml:space="preserve"> PAGEREF _Toc243236140 \h </w:instrText>
+          <w:instrText xml:space="preserve"> PAGEREF _Toc243248608 \h </w:instrText>
         </w:r>
         <w:r>
           <w:rPr>
@@ -593,7 +593,7 @@
           <w14:ligatures w14:val="standardContextual"/>
         </w:rPr>
       </w:pPr>
-      <w:hyperlink w:anchor="_Toc243236141" w:history="1">
+      <w:hyperlink w:anchor="_Toc243248609" w:history="1">
         <w:r>
           <w:rPr>
             <w:rStyle w:val="Hyperlink"/>
@@ -620,7 +620,7 @@
             <w:noProof/>
             <w:webHidden/>
           </w:rPr>
-          <w:instrText xml:space="preserve"> PAGEREF _Toc243236141 \h </w:instrText>
+          <w:instrText xml:space="preserve"> PAGEREF _Toc243248609 \h </w:instrText>
         </w:r>
         <w:r>
           <w:rPr>
@@ -666,7 +666,7 @@
           <w14:ligatures w14:val="standardContextual"/>
         </w:rPr>
       </w:pPr>
-      <w:hyperlink w:anchor="_Toc243236142" w:history="1">
+      <w:hyperlink w:anchor="_Toc243248610" w:history="1">
         <w:r>
           <w:rPr>
             <w:rStyle w:val="Hyperlink"/>
@@ -693,7 +693,7 @@
             <w:noProof/>
             <w:webHidden/>
           </w:rPr>
-          <w:instrText xml:space="preserve"> PAGEREF _Toc243236142 \h </w:instrText>
+          <w:instrText xml:space="preserve"> PAGEREF _Toc243248610 \h </w:instrText>
         </w:r>
         <w:r>
           <w:rPr>
@@ -739,7 +739,7 @@
           <w14:ligatures w14:val="standardContextual"/>
         </w:rPr>
       </w:pPr>
-      <w:hyperlink w:anchor="_Toc243236143" w:history="1">
+      <w:hyperlink w:anchor="_Toc243248611" w:history="1">
         <w:r>
           <w:rPr>
             <w:rStyle w:val="Hyperlink"/>
@@ -766,7 +766,7 @@
             <w:noProof/>
             <w:webHidden/>
           </w:rPr>
-          <w:instrText xml:space="preserve"> PAGEREF _Toc243236143 \h </w:instrText>
+          <w:instrText xml:space="preserve"> PAGEREF _Toc243248611 \h </w:instrText>
         </w:r>
         <w:r>
           <w:rPr>
@@ -812,7 +812,7 @@
           <w14:ligatures w14:val="standardContextual"/>
         </w:rPr>
       </w:pPr>
-      <w:hyperlink w:anchor="_Toc243236144" w:history="1">
+      <w:hyperlink w:anchor="_Toc243248612" w:history="1">
         <w:r>
           <w:rPr>
             <w:rStyle w:val="Hyperlink"/>
@@ -839,7 +839,7 @@
             <w:noProof/>
             <w:webHidden/>
           </w:rPr>
-          <w:instrText xml:space="preserve"> PAGEREF _Toc243236144 \h </w:instrText>
+          <w:instrText xml:space="preserve"> PAGEREF _Toc243248612 \h </w:instrText>
         </w:r>
         <w:r>
           <w:rPr>
@@ -885,7 +885,7 @@
           <w14:ligatures w14:val="standardContextual"/>
         </w:rPr>
       </w:pPr>
-      <w:hyperlink w:anchor="_Toc243236145" w:history="1">
+      <w:hyperlink w:anchor="_Toc243248613" w:history="1">
         <w:r>
           <w:rPr>
             <w:rStyle w:val="Hyperlink"/>
@@ -912,7 +912,7 @@
             <w:noProof/>
             <w:webHidden/>
           </w:rPr>
-          <w:instrText xml:space="preserve"> PAGEREF _Toc243236145 \h </w:instrText>
+          <w:instrText xml:space="preserve"> PAGEREF _Toc243248613 \h </w:instrText>
         </w:r>
         <w:r>
           <w:rPr>
@@ -958,7 +958,7 @@
           <w14:ligatures w14:val="standardContextual"/>
         </w:rPr>
       </w:pPr>
-      <w:hyperlink w:anchor="_Toc243236146" w:history="1">
+      <w:hyperlink w:anchor="_Toc243248614" w:history="1">
         <w:r>
           <w:rPr>
             <w:rStyle w:val="Hyperlink"/>
@@ -985,7 +985,7 @@
             <w:noProof/>
             <w:webHidden/>
           </w:rPr>
-          <w:instrText xml:space="preserve"> PAGEREF _Toc243236146 \h </w:instrText>
+          <w:instrText xml:space="preserve"> PAGEREF _Toc243248614 \h </w:instrText>
         </w:r>
         <w:r>
           <w:rPr>
@@ -1031,7 +1031,7 @@
           <w14:ligatures w14:val="standardContextual"/>
         </w:rPr>
       </w:pPr>
-      <w:hyperlink w:anchor="_Toc243236147" w:history="1">
+      <w:hyperlink w:anchor="_Toc243248615" w:history="1">
         <w:r>
           <w:rPr>
             <w:rStyle w:val="Hyperlink"/>
@@ -1058,7 +1058,7 @@
             <w:noProof/>
             <w:webHidden/>
           </w:rPr>
-          <w:instrText xml:space="preserve"> PAGEREF _Toc243236147 \h </w:instrText>
+          <w:instrText xml:space="preserve"> PAGEREF _Toc243248615 \h </w:instrText>
         </w:r>
         <w:r>
           <w:rPr>
@@ -1104,7 +1104,7 @@
           <w14:ligatures w14:val="standardContextual"/>
         </w:rPr>
       </w:pPr>
-      <w:hyperlink w:anchor="_Toc243236148" w:history="1">
+      <w:hyperlink w:anchor="_Toc243248616" w:history="1">
         <w:r>
           <w:rPr>
             <w:rStyle w:val="Hyperlink"/>
@@ -1131,7 +1131,7 @@
             <w:noProof/>
             <w:webHidden/>
           </w:rPr>
-          <w:instrText xml:space="preserve"> PAGEREF _Toc243236148 \h </w:instrText>
+          <w:instrText xml:space="preserve"> PAGEREF _Toc243248616 \h </w:instrText>
         </w:r>
         <w:r>
           <w:rPr>
@@ -1177,7 +1177,7 @@
           <w14:ligatures w14:val="standardContextual"/>
         </w:rPr>
       </w:pPr>
-      <w:hyperlink w:anchor="_Toc243236149" w:history="1">
+      <w:hyperlink w:anchor="_Toc243248617" w:history="1">
         <w:r>
           <w:rPr>
             <w:rStyle w:val="Hyperlink"/>
@@ -1204,7 +1204,7 @@
             <w:noProof/>
             <w:webHidden/>
           </w:rPr>
-          <w:instrText xml:space="preserve"> PAGEREF _Toc243236149 \h </w:instrText>
+          <w:instrText xml:space="preserve"> PAGEREF _Toc243248617 \h </w:instrText>
         </w:r>
         <w:r>
           <w:rPr>
@@ -1250,7 +1250,7 @@
           <w14:ligatures w14:val="standardContextual"/>
         </w:rPr>
       </w:pPr>
-      <w:hyperlink w:anchor="_Toc243236150" w:history="1">
+      <w:hyperlink w:anchor="_Toc243248618" w:history="1">
         <w:r>
           <w:rPr>
             <w:rStyle w:val="Hyperlink"/>
@@ -1277,7 +1277,7 @@
             <w:noProof/>
             <w:webHidden/>
           </w:rPr>
-          <w:instrText xml:space="preserve"> PAGEREF _Toc243236150 \h </w:instrText>
+          <w:instrText xml:space="preserve"> PAGEREF _Toc243248618 \h </w:instrText>
         </w:r>
         <w:r>
           <w:rPr>
@@ -1323,7 +1323,7 @@
           <w14:ligatures w14:val="standardContextual"/>
         </w:rPr>
       </w:pPr>
-      <w:hyperlink w:anchor="_Toc243236151" w:history="1">
+      <w:hyperlink w:anchor="_Toc243248619" w:history="1">
         <w:r>
           <w:rPr>
             <w:rStyle w:val="Hyperlink"/>
@@ -1350,7 +1350,7 @@
             <w:noProof/>
             <w:webHidden/>
           </w:rPr>
-          <w:instrText xml:space="preserve"> PAGEREF _Toc243236151 \h </w:instrText>
+          <w:instrText xml:space="preserve"> PAGEREF _Toc243248619 \h </w:instrText>
         </w:r>
         <w:r>
           <w:rPr>
@@ -1396,7 +1396,7 @@
           <w14:ligatures w14:val="standardContextual"/>
         </w:rPr>
       </w:pPr>
-      <w:hyperlink w:anchor="_Toc243236152" w:history="1">
+      <w:hyperlink w:anchor="_Toc243248620" w:history="1">
         <w:r>
           <w:rPr>
             <w:rStyle w:val="Hyperlink"/>
@@ -1423,7 +1423,7 @@
             <w:noProof/>
             <w:webHidden/>
           </w:rPr>
-          <w:instrText xml:space="preserve"> PAGEREF _Toc243236152 \h </w:instrText>
+          <w:instrText xml:space="preserve"> PAGEREF _Toc243248620 \h </w:instrText>
         </w:r>
         <w:r>
           <w:rPr>
@@ -1469,7 +1469,7 @@
           <w14:ligatures w14:val="standardContextual"/>
         </w:rPr>
       </w:pPr>
-      <w:hyperlink w:anchor="_Toc243236153" w:history="1">
+      <w:hyperlink w:anchor="_Toc243248621" w:history="1">
         <w:r>
           <w:rPr>
             <w:rStyle w:val="Hyperlink"/>
@@ -1496,7 +1496,7 @@
             <w:noProof/>
             <w:webHidden/>
           </w:rPr>
-          <w:instrText xml:space="preserve"> PAGEREF _Toc243236153 \h </w:instrText>
+          <w:instrText xml:space="preserve"> PAGEREF _Toc243248621 \h </w:instrText>
         </w:r>
         <w:r>
           <w:rPr>
@@ -1542,7 +1542,7 @@
           <w14:ligatures w14:val="standardContextual"/>
         </w:rPr>
       </w:pPr>
-      <w:hyperlink w:anchor="_Toc243236154" w:history="1">
+      <w:hyperlink w:anchor="_Toc243248622" w:history="1">
         <w:r>
           <w:rPr>
             <w:rStyle w:val="Hyperlink"/>
@@ -1569,7 +1569,7 @@
             <w:noProof/>
             <w:webHidden/>
           </w:rPr>
-          <w:instrText xml:space="preserve"> PAGEREF _Toc243236154 \h </w:instrText>
+          <w:instrText xml:space="preserve"> PAGEREF _Toc243248622 \h </w:instrText>
         </w:r>
         <w:r>
           <w:rPr>
@@ -1615,7 +1615,7 @@
           <w14:ligatures w14:val="standardContextual"/>
         </w:rPr>
       </w:pPr>
-      <w:hyperlink w:anchor="_Toc243236155" w:history="1">
+      <w:hyperlink w:anchor="_Toc243248623" w:history="1">
         <w:r>
           <w:rPr>
             <w:rStyle w:val="Hyperlink"/>
@@ -1642,7 +1642,7 @@
             <w:noProof/>
             <w:webHidden/>
           </w:rPr>
-          <w:instrText xml:space="preserve"> PAGEREF _Toc243236155 \h </w:instrText>
+          <w:instrText xml:space="preserve"> PAGEREF _Toc243248623 \h </w:instrText>
         </w:r>
         <w:r>
           <w:rPr>
@@ -1688,7 +1688,7 @@
           <w14:ligatures w14:val="standardContextual"/>
         </w:rPr>
       </w:pPr>
-      <w:hyperlink w:anchor="_Toc243236156" w:history="1">
+      <w:hyperlink w:anchor="_Toc243248624" w:history="1">
         <w:r>
           <w:rPr>
             <w:rStyle w:val="Hyperlink"/>
@@ -1715,7 +1715,7 @@
             <w:noProof/>
             <w:webHidden/>
           </w:rPr>
-          <w:instrText xml:space="preserve"> PAGEREF _Toc243236156 \h </w:instrText>
+          <w:instrText xml:space="preserve"> PAGEREF _Toc243248624 \h </w:instrText>
         </w:r>
         <w:r>
           <w:rPr>
@@ -1761,7 +1761,7 @@
           <w14:ligatures w14:val="standardContextual"/>
         </w:rPr>
       </w:pPr>
-      <w:hyperlink w:anchor="_Toc243236157" w:history="1">
+      <w:hyperlink w:anchor="_Toc243248625" w:history="1">
         <w:r>
           <w:rPr>
             <w:rStyle w:val="Hyperlink"/>
@@ -1788,7 +1788,7 @@
             <w:noProof/>
             <w:webHidden/>
           </w:rPr>
-          <w:instrText xml:space="preserve"> PAGEREF _Toc243236157 \h </w:instrText>
+          <w:instrText xml:space="preserve"> PAGEREF _Toc243248625 \h </w:instrText>
         </w:r>
         <w:r>
           <w:rPr>
@@ -1834,7 +1834,7 @@
           <w14:ligatures w14:val="standardContextual"/>
         </w:rPr>
       </w:pPr>
-      <w:hyperlink w:anchor="_Toc243236158" w:history="1">
+      <w:hyperlink w:anchor="_Toc243248626" w:history="1">
         <w:r>
           <w:rPr>
             <w:rStyle w:val="Hyperlink"/>
@@ -1861,7 +1861,7 @@
             <w:noProof/>
             <w:webHidden/>
           </w:rPr>
-          <w:instrText xml:space="preserve"> PAGEREF _Toc243236158 \h </w:instrText>
+          <w:instrText xml:space="preserve"> PAGEREF _Toc243248626 \h </w:instrText>
         </w:r>
         <w:r>
           <w:rPr>
@@ -1907,7 +1907,7 @@
           <w14:ligatures w14:val="standardContextual"/>
         </w:rPr>
       </w:pPr>
-      <w:hyperlink w:anchor="_Toc243236159" w:history="1">
+      <w:hyperlink w:anchor="_Toc243248627" w:history="1">
         <w:r>
           <w:rPr>
             <w:rStyle w:val="Hyperlink"/>
@@ -1934,7 +1934,7 @@
             <w:noProof/>
             <w:webHidden/>
           </w:rPr>
-          <w:instrText xml:space="preserve"> PAGEREF _Toc243236159 \h </w:instrText>
+          <w:instrText xml:space="preserve"> PAGEREF _Toc243248627 \h </w:instrText>
         </w:r>
         <w:r>
           <w:rPr>
@@ -1980,7 +1980,7 @@
           <w14:ligatures w14:val="standardContextual"/>
         </w:rPr>
       </w:pPr>
-      <w:hyperlink w:anchor="_Toc243236160" w:history="1">
+      <w:hyperlink w:anchor="_Toc243248628" w:history="1">
         <w:r>
           <w:rPr>
             <w:rStyle w:val="Hyperlink"/>
@@ -2007,7 +2007,7 @@
             <w:noProof/>
             <w:webHidden/>
           </w:rPr>
-          <w:instrText xml:space="preserve"> PAGEREF _Toc243236160 \h </w:instrText>
+          <w:instrText xml:space="preserve"> PAGEREF _Toc243248628 \h </w:instrText>
         </w:r>
         <w:r>
           <w:rPr>
@@ -2053,7 +2053,7 @@
           <w14:ligatures w14:val="standardContextual"/>
         </w:rPr>
       </w:pPr>
-      <w:hyperlink w:anchor="_Toc243236161" w:history="1">
+      <w:hyperlink w:anchor="_Toc243248629" w:history="1">
         <w:r>
           <w:rPr>
             <w:rStyle w:val="Hyperlink"/>
@@ -2080,7 +2080,7 @@
             <w:noProof/>
             <w:webHidden/>
           </w:rPr>
-          <w:instrText xml:space="preserve"> PAGEREF _Toc243236161 \h </w:instrText>
+          <w:instrText xml:space="preserve"> PAGEREF _Toc243248629 \h </w:instrText>
         </w:r>
         <w:r>
           <w:rPr>
@@ -2126,7 +2126,7 @@
           <w14:ligatures w14:val="standardContextual"/>
         </w:rPr>
       </w:pPr>
-      <w:hyperlink w:anchor="_Toc243236162" w:history="1">
+      <w:hyperlink w:anchor="_Toc243248630" w:history="1">
         <w:r>
           <w:rPr>
             <w:rStyle w:val="Hyperlink"/>
@@ -2153,7 +2153,7 @@
             <w:noProof/>
             <w:webHidden/>
           </w:rPr>
-          <w:instrText xml:space="preserve"> PAGEREF _Toc243236162 \h </w:instrText>
+          <w:instrText xml:space="preserve"> PAGEREF _Toc243248630 \h </w:instrText>
         </w:r>
         <w:r>
           <w:rPr>
@@ -2199,7 +2199,7 @@
           <w14:ligatures w14:val="standardContextual"/>
         </w:rPr>
       </w:pPr>
-      <w:hyperlink w:anchor="_Toc243236163" w:history="1">
+      <w:hyperlink w:anchor="_Toc243248631" w:history="1">
         <w:r>
           <w:rPr>
             <w:rStyle w:val="Hyperlink"/>
@@ -2226,7 +2226,7 @@
             <w:noProof/>
             <w:webHidden/>
           </w:rPr>
-          <w:instrText xml:space="preserve"> PAGEREF _Toc243236163 \h </w:instrText>
+          <w:instrText xml:space="preserve"> PAGEREF _Toc243248631 \h </w:instrText>
         </w:r>
         <w:r>
           <w:rPr>
@@ -2272,7 +2272,7 @@
           <w14:ligatures w14:val="standardContextual"/>
         </w:rPr>
       </w:pPr>
-      <w:hyperlink w:anchor="_Toc243236164" w:history="1">
+      <w:hyperlink w:anchor="_Toc243248632" w:history="1">
         <w:r>
           <w:rPr>
             <w:rStyle w:val="Hyperlink"/>
@@ -2299,7 +2299,7 @@
             <w:noProof/>
             <w:webHidden/>
           </w:rPr>
-          <w:instrText xml:space="preserve"> PAGEREF _Toc243236164 \h </w:instrText>
+          <w:instrText xml:space="preserve"> PAGEREF _Toc243248632 \h </w:instrText>
         </w:r>
         <w:r>
           <w:rPr>
@@ -2345,7 +2345,7 @@
           <w14:ligatures w14:val="standardContextual"/>
         </w:rPr>
       </w:pPr>
-      <w:hyperlink w:anchor="_Toc243236165" w:history="1">
+      <w:hyperlink w:anchor="_Toc243248633" w:history="1">
         <w:r>
           <w:rPr>
             <w:rStyle w:val="Hyperlink"/>
@@ -2372,7 +2372,7 @@
             <w:noProof/>
             <w:webHidden/>
           </w:rPr>
-          <w:instrText xml:space="preserve"> PAGEREF _Toc243236165 \h </w:instrText>
+          <w:instrText xml:space="preserve"> PAGEREF _Toc243248633 \h </w:instrText>
         </w:r>
         <w:r>
           <w:rPr>
@@ -2418,7 +2418,7 @@
           <w14:ligatures w14:val="standardContextual"/>
         </w:rPr>
       </w:pPr>
-      <w:hyperlink w:anchor="_Toc243236166" w:history="1">
+      <w:hyperlink w:anchor="_Toc243248634" w:history="1">
         <w:r>
           <w:rPr>
             <w:rStyle w:val="Hyperlink"/>
@@ -2445,7 +2445,7 @@
             <w:noProof/>
             <w:webHidden/>
           </w:rPr>
-          <w:instrText xml:space="preserve"> PAGEREF _Toc243236166 \h </w:instrText>
+          <w:instrText xml:space="preserve"> PAGEREF _Toc243248634 \h </w:instrText>
         </w:r>
         <w:r>
           <w:rPr>
@@ -2491,7 +2491,7 @@
           <w14:ligatures w14:val="standardContextual"/>
         </w:rPr>
       </w:pPr>
-      <w:hyperlink w:anchor="_Toc243236167" w:history="1">
+      <w:hyperlink w:anchor="_Toc243248635" w:history="1">
         <w:r>
           <w:rPr>
             <w:rStyle w:val="Hyperlink"/>
@@ -2518,7 +2518,7 @@
             <w:noProof/>
             <w:webHidden/>
           </w:rPr>
-          <w:instrText xml:space="preserve"> PAGEREF _Toc243236167 \h </w:instrText>
+          <w:instrText xml:space="preserve"> PAGEREF _Toc243248635 \h </w:instrText>
         </w:r>
         <w:r>
           <w:rPr>
@@ -2564,7 +2564,7 @@
           <w14:ligatures w14:val="standardContextual"/>
         </w:rPr>
       </w:pPr>
-      <w:hyperlink w:anchor="_Toc243236168" w:history="1">
+      <w:hyperlink w:anchor="_Toc243248636" w:history="1">
         <w:r>
           <w:rPr>
             <w:rStyle w:val="Hyperlink"/>
@@ -2591,7 +2591,7 @@
             <w:noProof/>
             <w:webHidden/>
           </w:rPr>
-          <w:instrText xml:space="preserve"> PAGEREF _Toc243236168 \h </w:instrText>
+          <w:instrText xml:space="preserve"> PAGEREF _Toc243248636 \h </w:instrText>
         </w:r>
         <w:r>
           <w:rPr>
@@ -2637,7 +2637,7 @@
           <w14:ligatures w14:val="standardContextual"/>
         </w:rPr>
       </w:pPr>
-      <w:hyperlink w:anchor="_Toc243236169" w:history="1">
+      <w:hyperlink w:anchor="_Toc243248637" w:history="1">
         <w:r>
           <w:rPr>
             <w:rStyle w:val="Hyperlink"/>
@@ -2664,7 +2664,7 @@
             <w:noProof/>
             <w:webHidden/>
           </w:rPr>
-          <w:instrText xml:space="preserve"> PAGEREF _Toc243236169 \h </w:instrText>
+          <w:instrText xml:space="preserve"> PAGEREF _Toc243248637 \h </w:instrText>
         </w:r>
         <w:r>
           <w:rPr>
@@ -2710,7 +2710,7 @@
           <w14:ligatures w14:val="standardContextual"/>
         </w:rPr>
       </w:pPr>
-      <w:hyperlink w:anchor="_Toc243236170" w:history="1">
+      <w:hyperlink w:anchor="_Toc243248638" w:history="1">
         <w:r>
           <w:rPr>
             <w:rStyle w:val="Hyperlink"/>
@@ -2737,7 +2737,7 @@
             <w:noProof/>
             <w:webHidden/>
           </w:rPr>
-          <w:instrText xml:space="preserve"> PAGEREF _Toc243236170 \h </w:instrText>
+          <w:instrText xml:space="preserve"> PAGEREF _Toc243248638 \h </w:instrText>
         </w:r>
         <w:r>
           <w:rPr>
@@ -2783,7 +2783,7 @@
           <w14:ligatures w14:val="standardContextual"/>
         </w:rPr>
       </w:pPr>
-      <w:hyperlink w:anchor="_Toc243236171" w:history="1">
+      <w:hyperlink w:anchor="_Toc243248639" w:history="1">
         <w:r>
           <w:rPr>
             <w:rStyle w:val="Hyperlink"/>
@@ -2810,7 +2810,7 @@
             <w:noProof/>
             <w:webHidden/>
           </w:rPr>
-          <w:instrText xml:space="preserve"> PAGEREF _Toc243236171 \h </w:instrText>
+          <w:instrText xml:space="preserve"> PAGEREF _Toc243248639 \h </w:instrText>
         </w:r>
         <w:r>
           <w:rPr>
@@ -2856,7 +2856,7 @@
           <w14:ligatures w14:val="standardContextual"/>
         </w:rPr>
       </w:pPr>
-      <w:hyperlink w:anchor="_Toc243236172" w:history="1">
+      <w:hyperlink w:anchor="_Toc243248640" w:history="1">
         <w:r>
           <w:rPr>
             <w:rStyle w:val="Hyperlink"/>
@@ -2883,7 +2883,7 @@
             <w:noProof/>
             <w:webHidden/>
           </w:rPr>
-          <w:instrText xml:space="preserve"> PAGEREF _Toc243236172 \h </w:instrText>
+          <w:instrText xml:space="preserve"> PAGEREF _Toc243248640 \h </w:instrText>
         </w:r>
         <w:r>
           <w:rPr>
@@ -2929,7 +2929,7 @@
           <w14:ligatures w14:val="standardContextual"/>
         </w:rPr>
       </w:pPr>
-      <w:hyperlink w:anchor="_Toc243236173" w:history="1">
+      <w:hyperlink w:anchor="_Toc243248641" w:history="1">
         <w:r>
           <w:rPr>
             <w:rStyle w:val="Hyperlink"/>
@@ -2956,7 +2956,7 @@
             <w:noProof/>
             <w:webHidden/>
           </w:rPr>
-          <w:instrText xml:space="preserve"> PAGEREF _Toc243236173 \h </w:instrText>
+          <w:instrText xml:space="preserve"> PAGEREF _Toc243248641 \h </w:instrText>
         </w:r>
         <w:r>
           <w:rPr>
@@ -3002,7 +3002,7 @@
           <w14:ligatures w14:val="standardContextual"/>
         </w:rPr>
       </w:pPr>
-      <w:hyperlink w:anchor="_Toc243236174" w:history="1">
+      <w:hyperlink w:anchor="_Toc243248642" w:history="1">
         <w:r>
           <w:rPr>
             <w:rStyle w:val="Hyperlink"/>
@@ -3029,7 +3029,80 @@
             <w:noProof/>
             <w:webHidden/>
           </w:rPr>
-          <w:instrText xml:space="preserve"> PAGEREF _Toc243236174 \h </w:instrText>
+          <w:instrText xml:space="preserve"> PAGEREF _Toc243248642 \h </w:instrText>
+        </w:r>
+        <w:r>
+          <w:rPr>
+            <w:noProof/>
+            <w:webHidden/>
+          </w:rPr>
+        </w:r>
+        <w:r>
+          <w:rPr>
+            <w:noProof/>
+            <w:webHidden/>
+          </w:rPr>
+          <w:fldChar w:fldCharType="separate"/>
+        </w:r>
+        <w:r>
+          <w:rPr>
+            <w:noProof/>
+            <w:webHidden/>
+          </w:rPr>
+          <w:t>27</w:t>
+        </w:r>
+        <w:r>
+          <w:rPr>
+            <w:noProof/>
+            <w:webHidden/>
+          </w:rPr>
+          <w:fldChar w:fldCharType="end"/>
+        </w:r>
+      </w:hyperlink>
+    </w:p>
+    <w:p>
+      <w:pPr>
+        <w:pStyle w:val="TOC2"/>
+        <w:tabs>
+          <w:tab w:val="right" w:leader="dot" w:pos="9061"/>
+        </w:tabs>
+        <w:rPr>
+          <w:rFonts w:asciiTheme="minorHAnsi" w:eastAsiaTheme="minorEastAsia" w:hAnsiTheme="minorHAnsi" w:cstheme="minorBidi"/>
+          <w:noProof/>
+          <w:kern w:val="2"/>
+          <w:sz w:val="24"/>
+          <w:szCs w:val="24"/>
+          <w14:ligatures w14:val="standardContextual"/>
+        </w:rPr>
+      </w:pPr>
+      <w:hyperlink w:anchor="_Toc243248643" w:history="1">
+        <w:r>
+          <w:rPr>
+            <w:rStyle w:val="Hyperlink"/>
+            <w:noProof/>
+          </w:rPr>
+          <w:t>6.6. Testcase mô phỏng mạng bưu chính</w:t>
+        </w:r>
+        <w:r>
+          <w:rPr>
+            <w:noProof/>
+            <w:webHidden/>
+          </w:rPr>
+          <w:tab/>
+        </w:r>
+        <w:r>
+          <w:rPr>
+            <w:noProof/>
+            <w:webHidden/>
+          </w:rPr>
+          <w:fldChar w:fldCharType="begin"/>
+        </w:r>
+        <w:r>
+          <w:rPr>
+            <w:noProof/>
+            <w:webHidden/>
+          </w:rPr>
+          <w:instrText xml:space="preserve"> PAGEREF _Toc243248643 \h </w:instrText>
         </w:r>
         <w:r>
           <w:rPr>
@@ -3075,7 +3148,7 @@
           <w14:ligatures w14:val="standardContextual"/>
         </w:rPr>
       </w:pPr>
-      <w:hyperlink w:anchor="_Toc243236175" w:history="1">
+      <w:hyperlink w:anchor="_Toc243248644" w:history="1">
         <w:r>
           <w:rPr>
             <w:rStyle w:val="Hyperlink"/>
@@ -3102,7 +3175,7 @@
             <w:noProof/>
             <w:webHidden/>
           </w:rPr>
-          <w:instrText xml:space="preserve"> PAGEREF _Toc243236175 \h </w:instrText>
+          <w:instrText xml:space="preserve"> PAGEREF _Toc243248644 \h </w:instrText>
         </w:r>
         <w:r>
           <w:rPr>
@@ -3122,7 +3195,7 @@
             <w:noProof/>
             <w:webHidden/>
           </w:rPr>
-          <w:t>28</w:t>
+          <w:t>29</w:t>
         </w:r>
         <w:r>
           <w:rPr>
@@ -3148,7 +3221,7 @@
           <w14:ligatures w14:val="standardContextual"/>
         </w:rPr>
       </w:pPr>
-      <w:hyperlink w:anchor="_Toc243236176" w:history="1">
+      <w:hyperlink w:anchor="_Toc243248645" w:history="1">
         <w:r>
           <w:rPr>
             <w:rStyle w:val="Hyperlink"/>
@@ -3175,7 +3248,7 @@
             <w:noProof/>
             <w:webHidden/>
           </w:rPr>
-          <w:instrText xml:space="preserve"> PAGEREF _Toc243236176 \h </w:instrText>
+          <w:instrText xml:space="preserve"> PAGEREF _Toc243248645 \h </w:instrText>
         </w:r>
         <w:r>
           <w:rPr>
@@ -3195,7 +3268,7 @@
             <w:noProof/>
             <w:webHidden/>
           </w:rPr>
-          <w:t>28</w:t>
+          <w:t>29</w:t>
         </w:r>
         <w:r>
           <w:rPr>
@@ -3221,7 +3294,7 @@
           <w14:ligatures w14:val="standardContextual"/>
         </w:rPr>
       </w:pPr>
-      <w:hyperlink w:anchor="_Toc243236177" w:history="1">
+      <w:hyperlink w:anchor="_Toc243248646" w:history="1">
         <w:r>
           <w:rPr>
             <w:rStyle w:val="Hyperlink"/>
@@ -3248,7 +3321,7 @@
             <w:noProof/>
             <w:webHidden/>
           </w:rPr>
-          <w:instrText xml:space="preserve"> PAGEREF _Toc243236177 \h </w:instrText>
+          <w:instrText xml:space="preserve"> PAGEREF _Toc243248646 \h </w:instrText>
         </w:r>
         <w:r>
           <w:rPr>
@@ -3268,7 +3341,7 @@
             <w:noProof/>
             <w:webHidden/>
           </w:rPr>
-          <w:t>28</w:t>
+          <w:t>29</w:t>
         </w:r>
         <w:r>
           <w:rPr>
@@ -3294,7 +3367,7 @@
           <w14:ligatures w14:val="standardContextual"/>
         </w:rPr>
       </w:pPr>
-      <w:hyperlink w:anchor="_Toc243236178" w:history="1">
+      <w:hyperlink w:anchor="_Toc243248647" w:history="1">
         <w:r>
           <w:rPr>
             <w:rStyle w:val="Hyperlink"/>
@@ -3321,7 +3394,7 @@
             <w:noProof/>
             <w:webHidden/>
           </w:rPr>
-          <w:instrText xml:space="preserve"> PAGEREF _Toc243236178 \h </w:instrText>
+          <w:instrText xml:space="preserve"> PAGEREF _Toc243248647 \h </w:instrText>
         </w:r>
         <w:r>
           <w:rPr>
@@ -3341,7 +3414,7 @@
             <w:noProof/>
             <w:webHidden/>
           </w:rPr>
-          <w:t>29</w:t>
+          <w:t>30</w:t>
         </w:r>
         <w:r>
           <w:rPr>
@@ -3367,7 +3440,7 @@
           <w14:ligatures w14:val="standardContextual"/>
         </w:rPr>
       </w:pPr>
-      <w:hyperlink w:anchor="_Toc243236179" w:history="1">
+      <w:hyperlink w:anchor="_Toc243248648" w:history="1">
         <w:r>
           <w:rPr>
             <w:rStyle w:val="Hyperlink"/>
@@ -3394,7 +3467,7 @@
             <w:noProof/>
             <w:webHidden/>
           </w:rPr>
-          <w:instrText xml:space="preserve"> PAGEREF _Toc243236179 \h </w:instrText>
+          <w:instrText xml:space="preserve"> PAGEREF _Toc243248648 \h </w:instrText>
         </w:r>
         <w:r>
           <w:rPr>
@@ -3414,7 +3487,7 @@
             <w:noProof/>
             <w:webHidden/>
           </w:rPr>
-          <w:t>29</w:t>
+          <w:t>30</w:t>
         </w:r>
         <w:r>
           <w:rPr>
@@ -3440,7 +3513,7 @@
           <w14:ligatures w14:val="standardContextual"/>
         </w:rPr>
       </w:pPr>
-      <w:hyperlink w:anchor="_Toc243236180" w:history="1">
+      <w:hyperlink w:anchor="_Toc243248649" w:history="1">
         <w:r>
           <w:rPr>
             <w:rStyle w:val="Hyperlink"/>
@@ -3467,7 +3540,7 @@
             <w:noProof/>
             <w:webHidden/>
           </w:rPr>
-          <w:instrText xml:space="preserve"> PAGEREF _Toc243236180 \h </w:instrText>
+          <w:instrText xml:space="preserve"> PAGEREF _Toc243248649 \h </w:instrText>
         </w:r>
         <w:r>
           <w:rPr>
@@ -3487,7 +3560,7 @@
             <w:noProof/>
             <w:webHidden/>
           </w:rPr>
-          <w:t>30</w:t>
+          <w:t>31</w:t>
         </w:r>
         <w:r>
           <w:rPr>
@@ -3513,7 +3586,7 @@
           <w14:ligatures w14:val="standardContextual"/>
         </w:rPr>
       </w:pPr>
-      <w:hyperlink w:anchor="_Toc243236181" w:history="1">
+      <w:hyperlink w:anchor="_Toc243248650" w:history="1">
         <w:r>
           <w:rPr>
             <w:rStyle w:val="Hyperlink"/>
@@ -3540,7 +3613,7 @@
             <w:noProof/>
             <w:webHidden/>
           </w:rPr>
-          <w:instrText xml:space="preserve"> PAGEREF _Toc243236181 \h </w:instrText>
+          <w:instrText xml:space="preserve"> PAGEREF _Toc243248650 \h </w:instrText>
         </w:r>
         <w:r>
           <w:rPr>
@@ -3560,7 +3633,7 @@
             <w:noProof/>
             <w:webHidden/>
           </w:rPr>
-          <w:t>30</w:t>
+          <w:t>31</w:t>
         </w:r>
         <w:r>
           <w:rPr>
@@ -3586,7 +3659,7 @@
           <w14:ligatures w14:val="standardContextual"/>
         </w:rPr>
       </w:pPr>
-      <w:hyperlink w:anchor="_Toc243236182" w:history="1">
+      <w:hyperlink w:anchor="_Toc243248651" w:history="1">
         <w:r>
           <w:rPr>
             <w:rStyle w:val="Hyperlink"/>
@@ -3613,7 +3686,7 @@
             <w:noProof/>
             <w:webHidden/>
           </w:rPr>
-          <w:instrText xml:space="preserve"> PAGEREF _Toc243236182 \h </w:instrText>
+          <w:instrText xml:space="preserve"> PAGEREF _Toc243248651 \h </w:instrText>
         </w:r>
         <w:r>
           <w:rPr>
@@ -3633,7 +3706,7 @@
             <w:noProof/>
             <w:webHidden/>
           </w:rPr>
-          <w:t>30</w:t>
+          <w:t>31</w:t>
         </w:r>
         <w:r>
           <w:rPr>
@@ -3659,7 +3732,7 @@
           <w14:ligatures w14:val="standardContextual"/>
         </w:rPr>
       </w:pPr>
-      <w:hyperlink w:anchor="_Toc243236183" w:history="1">
+      <w:hyperlink w:anchor="_Toc243248652" w:history="1">
         <w:r>
           <w:rPr>
             <w:rStyle w:val="Hyperlink"/>
@@ -3686,7 +3759,7 @@
             <w:noProof/>
             <w:webHidden/>
           </w:rPr>
-          <w:instrText xml:space="preserve"> PAGEREF _Toc243236183 \h </w:instrText>
+          <w:instrText xml:space="preserve"> PAGEREF _Toc243248652 \h </w:instrText>
         </w:r>
         <w:r>
           <w:rPr>
@@ -3706,7 +3779,7 @@
             <w:noProof/>
             <w:webHidden/>
           </w:rPr>
-          <w:t>31</w:t>
+          <w:t>32</w:t>
         </w:r>
         <w:r>
           <w:rPr>
@@ -3732,7 +3805,7 @@
           <w14:ligatures w14:val="standardContextual"/>
         </w:rPr>
       </w:pPr>
-      <w:hyperlink w:anchor="_Toc243236184" w:history="1">
+      <w:hyperlink w:anchor="_Toc243248653" w:history="1">
         <w:r>
           <w:rPr>
             <w:rStyle w:val="Hyperlink"/>
@@ -3759,7 +3832,7 @@
             <w:noProof/>
             <w:webHidden/>
           </w:rPr>
-          <w:instrText xml:space="preserve"> PAGEREF _Toc243236184 \h </w:instrText>
+          <w:instrText xml:space="preserve"> PAGEREF _Toc243248653 \h </w:instrText>
         </w:r>
         <w:r>
           <w:rPr>
@@ -3779,7 +3852,7 @@
             <w:noProof/>
             <w:webHidden/>
           </w:rPr>
-          <w:t>31</w:t>
+          <w:t>32</w:t>
         </w:r>
         <w:r>
           <w:rPr>
@@ -3805,7 +3878,7 @@
           <w14:ligatures w14:val="standardContextual"/>
         </w:rPr>
       </w:pPr>
-      <w:hyperlink w:anchor="_Toc243236185" w:history="1">
+      <w:hyperlink w:anchor="_Toc243248654" w:history="1">
         <w:r>
           <w:rPr>
             <w:rStyle w:val="Hyperlink"/>
@@ -3832,7 +3905,7 @@
             <w:noProof/>
             <w:webHidden/>
           </w:rPr>
-          <w:instrText xml:space="preserve"> PAGEREF _Toc243236185 \h </w:instrText>
+          <w:instrText xml:space="preserve"> PAGEREF _Toc243248654 \h </w:instrText>
         </w:r>
         <w:r>
           <w:rPr>
@@ -3852,7 +3925,7 @@
             <w:noProof/>
             <w:webHidden/>
           </w:rPr>
-          <w:t>32</w:t>
+          <w:t>33</w:t>
         </w:r>
         <w:r>
           <w:rPr>
@@ -3878,7 +3951,7 @@
           <w14:ligatures w14:val="standardContextual"/>
         </w:rPr>
       </w:pPr>
-      <w:hyperlink w:anchor="_Toc243236186" w:history="1">
+      <w:hyperlink w:anchor="_Toc243248655" w:history="1">
         <w:r>
           <w:rPr>
             <w:rStyle w:val="Hyperlink"/>
@@ -3905,7 +3978,7 @@
             <w:noProof/>
             <w:webHidden/>
           </w:rPr>
-          <w:instrText xml:space="preserve"> PAGEREF _Toc243236186 \h </w:instrText>
+          <w:instrText xml:space="preserve"> PAGEREF _Toc243248655 \h </w:instrText>
         </w:r>
         <w:r>
           <w:rPr>
@@ -3925,7 +3998,7 @@
             <w:noProof/>
             <w:webHidden/>
           </w:rPr>
-          <w:t>32</w:t>
+          <w:t>33</w:t>
         </w:r>
         <w:r>
           <w:rPr>
@@ -3951,7 +4024,7 @@
           <w14:ligatures w14:val="standardContextual"/>
         </w:rPr>
       </w:pPr>
-      <w:hyperlink w:anchor="_Toc243236187" w:history="1">
+      <w:hyperlink w:anchor="_Toc243248656" w:history="1">
         <w:r>
           <w:rPr>
             <w:rStyle w:val="Hyperlink"/>
@@ -3978,7 +4051,7 @@
             <w:noProof/>
             <w:webHidden/>
           </w:rPr>
-          <w:instrText xml:space="preserve"> PAGEREF _Toc243236187 \h </w:instrText>
+          <w:instrText xml:space="preserve"> PAGEREF _Toc243248656 \h </w:instrText>
         </w:r>
         <w:r>
           <w:rPr>
@@ -3998,7 +4071,7 @@
             <w:noProof/>
             <w:webHidden/>
           </w:rPr>
-          <w:t>33</w:t>
+          <w:t>34</w:t>
         </w:r>
         <w:r>
           <w:rPr>
@@ -4024,7 +4097,7 @@
           <w14:ligatures w14:val="standardContextual"/>
         </w:rPr>
       </w:pPr>
-      <w:hyperlink w:anchor="_Toc243236188" w:history="1">
+      <w:hyperlink w:anchor="_Toc243248657" w:history="1">
         <w:r>
           <w:rPr>
             <w:rStyle w:val="Hyperlink"/>
@@ -4051,7 +4124,7 @@
             <w:noProof/>
             <w:webHidden/>
           </w:rPr>
-          <w:instrText xml:space="preserve"> PAGEREF _Toc243236188 \h </w:instrText>
+          <w:instrText xml:space="preserve"> PAGEREF _Toc243248657 \h </w:instrText>
         </w:r>
         <w:r>
           <w:rPr>
@@ -4071,7 +4144,7 @@
             <w:noProof/>
             <w:webHidden/>
           </w:rPr>
-          <w:t>33</w:t>
+          <w:t>34</w:t>
         </w:r>
         <w:r>
           <w:rPr>
@@ -4097,7 +4170,7 @@
           <w14:ligatures w14:val="standardContextual"/>
         </w:rPr>
       </w:pPr>
-      <w:hyperlink w:anchor="_Toc243236189" w:history="1">
+      <w:hyperlink w:anchor="_Toc243248658" w:history="1">
         <w:r>
           <w:rPr>
             <w:rStyle w:val="Hyperlink"/>
@@ -4124,7 +4197,7 @@
             <w:noProof/>
             <w:webHidden/>
           </w:rPr>
-          <w:instrText xml:space="preserve"> PAGEREF _Toc243236189 \h </w:instrText>
+          <w:instrText xml:space="preserve"> PAGEREF _Toc243248658 \h </w:instrText>
         </w:r>
         <w:r>
           <w:rPr>
@@ -4144,7 +4217,7 @@
             <w:noProof/>
             <w:webHidden/>
           </w:rPr>
-          <w:t>33</w:t>
+          <w:t>34</w:t>
         </w:r>
         <w:r>
           <w:rPr>
@@ -4170,7 +4243,7 @@
           <w14:ligatures w14:val="standardContextual"/>
         </w:rPr>
       </w:pPr>
-      <w:hyperlink w:anchor="_Toc243236190" w:history="1">
+      <w:hyperlink w:anchor="_Toc243248659" w:history="1">
         <w:r>
           <w:rPr>
             <w:rStyle w:val="Hyperlink"/>
@@ -4197,7 +4270,7 @@
             <w:noProof/>
             <w:webHidden/>
           </w:rPr>
-          <w:instrText xml:space="preserve"> PAGEREF _Toc243236190 \h </w:instrText>
+          <w:instrText xml:space="preserve"> PAGEREF _Toc243248659 \h </w:instrText>
         </w:r>
         <w:r>
           <w:rPr>
@@ -4217,7 +4290,7 @@
             <w:noProof/>
             <w:webHidden/>
           </w:rPr>
-          <w:t>33</w:t>
+          <w:t>34</w:t>
         </w:r>
         <w:r>
           <w:rPr>
@@ -4243,7 +4316,7 @@
           <w14:ligatures w14:val="standardContextual"/>
         </w:rPr>
       </w:pPr>
-      <w:hyperlink w:anchor="_Toc243236191" w:history="1">
+      <w:hyperlink w:anchor="_Toc243248660" w:history="1">
         <w:r>
           <w:rPr>
             <w:rStyle w:val="Hyperlink"/>
@@ -4270,7 +4343,7 @@
             <w:noProof/>
             <w:webHidden/>
           </w:rPr>
-          <w:instrText xml:space="preserve"> PAGEREF _Toc243236191 \h </w:instrText>
+          <w:instrText xml:space="preserve"> PAGEREF _Toc243248660 \h </w:instrText>
         </w:r>
         <w:r>
           <w:rPr>
@@ -4290,7 +4363,7 @@
             <w:noProof/>
             <w:webHidden/>
           </w:rPr>
-          <w:t>34</w:t>
+          <w:t>35</w:t>
         </w:r>
         <w:r>
           <w:rPr>
@@ -4311,7 +4384,7 @@
         <w:pStyle w:val="Heading1"/>
         <w:pageBreakBefore/>
       </w:pPr>
-      <w:bookmarkStart w:id="0" w:name="_Toc243236137"/>
+      <w:bookmarkStart w:id="0" w:name="_Toc243248605"/>
       <w:r>
         <w:lastRenderedPageBreak/>
         <w:t>Ghi chú về bản nháp này</w:t>
@@ -4405,7 +4478,7 @@
         <w:pStyle w:val="Heading1"/>
         <w:pageBreakBefore/>
       </w:pPr>
-      <w:bookmarkStart w:id="1" w:name="_Toc243236138"/>
+      <w:bookmarkStart w:id="1" w:name="_Toc243248606"/>
       <w:r>
         <w:lastRenderedPageBreak/>
         <w:t>Chương 1. Giới thiệu</w:t>
@@ -4416,7 +4489,7 @@
       <w:pPr>
         <w:pStyle w:val="Heading2"/>
       </w:pPr>
-      <w:bookmarkStart w:id="2" w:name="_Toc243236139"/>
+      <w:bookmarkStart w:id="2" w:name="_Toc243248607"/>
       <w:r>
         <w:t>1.1. Bài toán đường đi ngắn nhất một nguồn</w:t>
       </w:r>
@@ -4444,7 +4517,7 @@
       <w:pPr>
         <w:pStyle w:val="Heading2"/>
       </w:pPr>
-      <w:bookmarkStart w:id="3" w:name="_Toc243236140"/>
+      <w:bookmarkStart w:id="3" w:name="_Toc243248608"/>
       <w:r>
         <w:t>1.2. Mục tiêu đồ án</w:t>
       </w:r>
@@ -4499,7 +4572,7 @@
       <w:pPr>
         <w:pStyle w:val="Heading2"/>
       </w:pPr>
-      <w:bookmarkStart w:id="4" w:name="_Toc243236141"/>
+      <w:bookmarkStart w:id="4" w:name="_Toc243248609"/>
       <w:r>
         <w:t>1.3. Phạm vi</w:t>
       </w:r>
@@ -4701,7 +4774,7 @@
       <w:pPr>
         <w:pStyle w:val="Heading2"/>
       </w:pPr>
-      <w:bookmarkStart w:id="5" w:name="_Toc243236142"/>
+      <w:bookmarkStart w:id="5" w:name="_Toc243248610"/>
       <w:r>
         <w:t>1.4. Sản phẩm nộp</w:t>
       </w:r>
@@ -4912,7 +4985,7 @@
               <w:rPr>
                 <w:sz w:val="22"/>
               </w:rPr>
-              <w:t xml:space="preserve">44 test chia 5 nhóm, mỗi test gồm </w:t>
+              <w:t xml:space="preserve">45 test chia 5 nhóm, mỗi test gồm </w:t>
             </w:r>
             <w:r>
               <w:rPr>
@@ -5119,7 +5192,7 @@
       <w:pPr>
         <w:pStyle w:val="Heading2"/>
       </w:pPr>
-      <w:bookmarkStart w:id="6" w:name="_Toc243236143"/>
+      <w:bookmarkStart w:id="6" w:name="_Toc243248611"/>
       <w:r>
         <w:t>1.5. Bố cục báo cáo</w:t>
       </w:r>
@@ -5139,7 +5212,7 @@
         <w:pStyle w:val="Heading1"/>
         <w:pageBreakBefore/>
       </w:pPr>
-      <w:bookmarkStart w:id="7" w:name="_Toc243236144"/>
+      <w:bookmarkStart w:id="7" w:name="_Toc243248612"/>
       <w:r>
         <w:lastRenderedPageBreak/>
         <w:t>Chương 2. Cơ sở lý thuyết</w:t>
@@ -5150,7 +5223,7 @@
       <w:pPr>
         <w:pStyle w:val="Heading2"/>
       </w:pPr>
-      <w:bookmarkStart w:id="8" w:name="_Toc243236145"/>
+      <w:bookmarkStart w:id="8" w:name="_Toc243248613"/>
       <w:r>
         <w:t>2.1. Ba chiến lược giải cùng một bài toán</w:t>
       </w:r>
@@ -5522,7 +5595,7 @@
       <w:pPr>
         <w:pStyle w:val="Heading2"/>
       </w:pPr>
-      <w:bookmarkStart w:id="9" w:name="_Toc243236146"/>
+      <w:bookmarkStart w:id="9" w:name="_Toc243248614"/>
       <w:r>
         <w:t>2.2. Thuật toán Dijkstra</w:t>
       </w:r>
@@ -5852,7 +5925,7 @@
       <w:pPr>
         <w:pStyle w:val="Heading2"/>
       </w:pPr>
-      <w:bookmarkStart w:id="10" w:name="_Toc243236147"/>
+      <w:bookmarkStart w:id="10" w:name="_Toc243248615"/>
       <w:r>
         <w:t>2.3. Min-heap nhị phân và lazy deletion</w:t>
       </w:r>
@@ -5937,7 +6010,7 @@
       <w:pPr>
         <w:pStyle w:val="Heading2"/>
       </w:pPr>
-      <w:bookmarkStart w:id="11" w:name="_Toc243236148"/>
+      <w:bookmarkStart w:id="11" w:name="_Toc243248616"/>
       <w:r>
         <w:t>2.4. Bellman-Ford (quy hoạch động)</w:t>
       </w:r>
@@ -6001,7 +6074,7 @@
       <w:pPr>
         <w:pStyle w:val="Heading2"/>
       </w:pPr>
-      <w:bookmarkStart w:id="12" w:name="_Toc243236149"/>
+      <w:bookmarkStart w:id="12" w:name="_Toc243248617"/>
       <w:r>
         <w:t>2.5. Vì sao Dijkstra sai khi có cạnh âm</w:t>
       </w:r>
@@ -6068,7 +6141,7 @@
       <w:pPr>
         <w:pStyle w:val="Heading2"/>
       </w:pPr>
-      <w:bookmarkStart w:id="13" w:name="_Toc243236150"/>
+      <w:bookmarkStart w:id="13" w:name="_Toc243248618"/>
       <w:r>
         <w:t>2.6. So sánh tổng hợp</w:t>
       </w:r>
@@ -6612,7 +6685,7 @@
         <w:pStyle w:val="Heading1"/>
         <w:pageBreakBefore/>
       </w:pPr>
-      <w:bookmarkStart w:id="14" w:name="_Toc243236151"/>
+      <w:bookmarkStart w:id="14" w:name="_Toc243248619"/>
       <w:r>
         <w:lastRenderedPageBreak/>
         <w:t>Chương 3. Phân tích và thiết kế</w:t>
@@ -6623,7 +6696,7 @@
       <w:pPr>
         <w:pStyle w:val="Heading2"/>
       </w:pPr>
-      <w:bookmarkStart w:id="15" w:name="_Toc243236152"/>
+      <w:bookmarkStart w:id="15" w:name="_Toc243248620"/>
       <w:r>
         <w:t>3.1. Yêu cầu chức năng</w:t>
       </w:r>
@@ -6678,7 +6751,7 @@
       <w:pPr>
         <w:pStyle w:val="Heading2"/>
       </w:pPr>
-      <w:bookmarkStart w:id="16" w:name="_Toc243236153"/>
+      <w:bookmarkStart w:id="16" w:name="_Toc243248621"/>
       <w:r>
         <w:t>3.2. Kiến trúc: lõi sinh trace, giao diện chỉ phát lại</w:t>
       </w:r>
@@ -7472,7 +7545,7 @@
       <w:pPr>
         <w:pStyle w:val="Heading2"/>
       </w:pPr>
-      <w:bookmarkStart w:id="17" w:name="_Toc243236154"/>
+      <w:bookmarkStart w:id="17" w:name="_Toc243248622"/>
       <w:r>
         <w:t>3.3. Cấu trúc một bước trace</w:t>
       </w:r>
@@ -7993,7 +8066,7 @@
       <w:pPr>
         <w:pStyle w:val="Heading2"/>
       </w:pPr>
-      <w:bookmarkStart w:id="18" w:name="_Toc243236155"/>
+      <w:bookmarkStart w:id="18" w:name="_Toc243248623"/>
       <w:r>
         <w:t>3.4. Hàm relax(edge, t)</w:t>
       </w:r>
@@ -8032,7 +8105,7 @@
       <w:pPr>
         <w:pStyle w:val="Heading2"/>
       </w:pPr>
-      <w:bookmarkStart w:id="19" w:name="_Toc243236156"/>
+      <w:bookmarkStart w:id="19" w:name="_Toc243248624"/>
       <w:r>
         <w:t>3.5. Định dạng input/output và xử lý lỗi</w:t>
       </w:r>
@@ -8189,7 +8262,7 @@
       <w:pPr>
         <w:pStyle w:val="Heading2"/>
       </w:pPr>
-      <w:bookmarkStart w:id="20" w:name="_Toc243236157"/>
+      <w:bookmarkStart w:id="20" w:name="_Toc243248625"/>
       <w:r>
         <w:lastRenderedPageBreak/>
         <w:t>3.6. Các quyết định thiết kế</w:t>
@@ -8741,7 +8814,7 @@
         <w:pStyle w:val="Heading1"/>
         <w:pageBreakBefore/>
       </w:pPr>
-      <w:bookmarkStart w:id="21" w:name="_Toc243236158"/>
+      <w:bookmarkStart w:id="21" w:name="_Toc243248626"/>
       <w:r>
         <w:lastRenderedPageBreak/>
         <w:t>Chương 4. Cài đặt và giao diện</w:t>
@@ -8752,7 +8825,7 @@
       <w:pPr>
         <w:pStyle w:val="Heading2"/>
       </w:pPr>
-      <w:bookmarkStart w:id="22" w:name="_Toc243236159"/>
+      <w:bookmarkStart w:id="22" w:name="_Toc243248627"/>
       <w:r>
         <w:t>4.1. Vòng lặp chính của Dijkstra (min-heap)</w:t>
       </w:r>
@@ -9126,7 +9199,7 @@
       <w:pPr>
         <w:pStyle w:val="Heading2"/>
       </w:pPr>
-      <w:bookmarkStart w:id="23" w:name="_Toc243236160"/>
+      <w:bookmarkStart w:id="23" w:name="_Toc243248628"/>
       <w:r>
         <w:t>4.2. Min-heap: thao tác sift-down</w:t>
       </w:r>
@@ -9324,7 +9397,7 @@
       <w:pPr>
         <w:pStyle w:val="Heading2"/>
       </w:pPr>
-      <w:bookmarkStart w:id="24" w:name="_Toc243236161"/>
+      <w:bookmarkStart w:id="24" w:name="_Toc243248629"/>
       <w:r>
         <w:lastRenderedPageBreak/>
         <w:t>4.3. Giao diện</w:t>
@@ -9902,7 +9975,7 @@
       <w:pPr>
         <w:pStyle w:val="Heading2"/>
       </w:pPr>
-      <w:bookmarkStart w:id="25" w:name="_Toc243236162"/>
+      <w:bookmarkStart w:id="25" w:name="_Toc243248630"/>
       <w:r>
         <w:t>4.4. Cách chạy</w:t>
       </w:r>
@@ -10035,7 +10108,7 @@
         <w:pStyle w:val="Heading1"/>
         <w:pageBreakBefore/>
       </w:pPr>
-      <w:bookmarkStart w:id="26" w:name="_Toc243236163"/>
+      <w:bookmarkStart w:id="26" w:name="_Toc243248631"/>
       <w:r>
         <w:lastRenderedPageBreak/>
         <w:t>Chương 5. Ví dụ minh họa thống nhất</w:t>
@@ -10046,7 +10119,7 @@
       <w:pPr>
         <w:pStyle w:val="Heading2"/>
       </w:pPr>
-      <w:bookmarkStart w:id="27" w:name="_Toc243236164"/>
+      <w:bookmarkStart w:id="27" w:name="_Toc243248632"/>
       <w:r>
         <w:t>5.1. Đồ thị ví dụ</w:t>
       </w:r>
@@ -10377,7 +10450,7 @@
       <w:pPr>
         <w:pStyle w:val="Heading2"/>
       </w:pPr>
-      <w:bookmarkStart w:id="28" w:name="_Toc243236165"/>
+      <w:bookmarkStart w:id="28" w:name="_Toc243248633"/>
       <w:r>
         <w:t>5.2. Dijkstra (min-heap): toàn bộ 23 bước</w:t>
       </w:r>
@@ -12555,7 +12628,7 @@
       <w:pPr>
         <w:pStyle w:val="Heading2"/>
       </w:pPr>
-      <w:bookmarkStart w:id="29" w:name="_Toc243236166"/>
+      <w:bookmarkStart w:id="29" w:name="_Toc243248634"/>
       <w:r>
         <w:t>5.3. Các bước đáng chú ý</w:t>
       </w:r>
@@ -12914,7 +12987,7 @@
       <w:pPr>
         <w:pStyle w:val="Heading2"/>
       </w:pPr>
-      <w:bookmarkStart w:id="30" w:name="_Toc243236167"/>
+      <w:bookmarkStart w:id="30" w:name="_Toc243248635"/>
       <w:r>
         <w:t>5.4. Cùng đồ thị với Dijkstra mảng và Bellman-Ford</w:t>
       </w:r>
@@ -13361,7 +13434,7 @@
       <w:pPr>
         <w:pStyle w:val="Heading2"/>
       </w:pPr>
-      <w:bookmarkStart w:id="31" w:name="_Toc243236168"/>
+      <w:bookmarkStart w:id="31" w:name="_Toc243248636"/>
       <w:r>
         <w:t>5.5. Cạnh âm và chu trình âm</w:t>
       </w:r>
@@ -13545,7 +13618,7 @@
         <w:pStyle w:val="Heading1"/>
         <w:pageBreakBefore/>
       </w:pPr>
-      <w:bookmarkStart w:id="32" w:name="_Toc243236169"/>
+      <w:bookmarkStart w:id="32" w:name="_Toc243248637"/>
       <w:r>
         <w:lastRenderedPageBreak/>
         <w:t>Chương 6. Kiểm thử</w:t>
@@ -13556,7 +13629,7 @@
       <w:pPr>
         <w:pStyle w:val="Heading2"/>
       </w:pPr>
-      <w:bookmarkStart w:id="33" w:name="_Toc243236170"/>
+      <w:bookmarkStart w:id="33" w:name="_Toc243248638"/>
       <w:r>
         <w:t>6.1. Chiến lược</w:t>
       </w:r>
@@ -13631,7 +13704,7 @@
       <w:pPr>
         <w:pStyle w:val="Heading2"/>
       </w:pPr>
-      <w:bookmarkStart w:id="34" w:name="_Toc243236171"/>
+      <w:bookmarkStart w:id="34" w:name="_Toc243248639"/>
       <w:r>
         <w:t>6.2. Bộ testcase</w:t>
       </w:r>
@@ -13655,7 +13728,7 @@
           <w:i/>
           <w:sz w:val="24"/>
         </w:rPr>
-        <w:t>Năm nhóm testcase (44 test)</w:t>
+        <w:t>Năm nhóm testcase (45 test)</w:t>
       </w:r>
     </w:p>
     <w:tbl>
@@ -13875,7 +13948,7 @@
               <w:rPr>
                 <w:sz w:val="22"/>
               </w:rPr>
-              <w:t>9</w:t>
+              <w:t>10</w:t>
             </w:r>
           </w:p>
         </w:tc>
@@ -13891,7 +13964,7 @@
               <w:rPr>
                 <w:sz w:val="22"/>
               </w:rPr>
-              <w:t>Cạnh âm (Dijkstra phải báo lỗi); chu trình âm tới được / không tới được từ s; chu trình tổng 0; đồ thị đầy đủ; hình sao; lưới nhiều đường bằng nhau; nhiều phần tử cũ trong heap.</w:t>
+              <w:t>Cạnh âm (Dijkstra phải báo lỗi); chu trình âm tới được / không tới được từ s; chu trình tổng 0; đồ thị đầy đủ; hình sao; lưới nhiều đường bằng nhau; nhiều phần tử cũ trong heap; mạng bưu chính mô phỏng thực tế 1250 điểm (mục 6.6).</w:t>
             </w:r>
           </w:p>
         </w:tc>
@@ -14016,7 +14089,7 @@
       <w:pPr>
         <w:pStyle w:val="Heading2"/>
       </w:pPr>
-      <w:bookmarkStart w:id="35" w:name="_Toc243236172"/>
+      <w:bookmarkStart w:id="35" w:name="_Toc243248640"/>
       <w:r>
         <w:t>6.3. Cách chấm</w:t>
       </w:r>
@@ -14082,7 +14155,7 @@
       <w:pPr>
         <w:pStyle w:val="Heading2"/>
       </w:pPr>
-      <w:bookmarkStart w:id="36" w:name="_Toc243236173"/>
+      <w:bookmarkStart w:id="36" w:name="_Toc243248641"/>
       <w:r>
         <w:t>6.4. Kết quả</w:t>
       </w:r>
@@ -14101,13 +14174,13 @@
         <w:t>node scripts/run-tests.js</w:t>
       </w:r>
       <w:r>
-        <w:t xml:space="preserve"> chạy 44 test × 3 thuật toán: </w:t>
+        <w:t xml:space="preserve"> chạy 45 test × 3 thuật toán: </w:t>
       </w:r>
       <w:r>
         <w:rPr>
           <w:b/>
         </w:rPr>
-        <w:t>128 đạt, 0 không đạt, 4 bỏ qua</w:t>
+        <w:t>131 đạt, 0 không đạt, 4 bỏ qua</w:t>
       </w:r>
       <w:r>
         <w:t xml:space="preserve">. Bốn lượt bỏ qua là Dijkstra mảng trên các test n ≥ 48 400 (O(V²) quá chậm). </w:t>
@@ -14628,7 +14701,7 @@
       <w:pPr>
         <w:pStyle w:val="Heading2"/>
       </w:pPr>
-      <w:bookmarkStart w:id="37" w:name="_Toc243236174"/>
+      <w:bookmarkStart w:id="37" w:name="_Toc243248642"/>
       <w:r>
         <w:t>6.5. Bộ test có bắt được lỗi không? (mutation test)</w:t>
       </w:r>
@@ -14722,25 +14795,105 @@
     </w:p>
     <w:p>
       <w:pPr>
+        <w:pStyle w:val="Heading2"/>
+      </w:pPr>
+      <w:bookmarkStart w:id="38" w:name="_Toc243248643"/>
+      <w:r>
+        <w:t>6.6. Testcase mô phỏng mạng bưu chính</w:t>
+      </w:r>
+      <w:bookmarkEnd w:id="38"/>
+    </w:p>
+    <w:p>
+      <w:pPr>
+        <w:ind w:firstLine="567"/>
+        <w:jc w:val="both"/>
+      </w:pPr>
+      <w:r>
+        <w:t>Sinh viên yêu cầu bổ sung một test gần với dữ liệu thực tế: hành trình giao hàng trên mạng bưu chính, nơi các trung tâm khai thác nối với nhau rất dày còn các bưu cục chỉ nối về trung tâm phụ trách. Test được sinh bằng hàm postalNetwork trong scripts/generators.js, có seed như các test khác, lưu ở 3_Testcase/dac-biet/10-mang-buu-chinh. Trọng số là số phút di chuyển, tính từ khoảng cách trên một bản đồ giả lập dọc 1650 km chia ba vùng.</w:t>
+      </w:r>
+    </w:p>
+    <w:p>
+      <w:pPr>
+        <w:pStyle w:val="ListBullet"/>
+        <w:jc w:val="both"/>
+      </w:pPr>
+      <w:r>
+        <w:rPr>
+          <w:b/>
+        </w:rPr>
+        <w:t>1250 đỉnh, 2978 cạnh (hai chiều):</w:t>
+      </w:r>
+      <w:r>
+        <w:t xml:space="preserve"> 3 trung tâm khai thác (TTKT) vùng Hà Nội, Đà Nẵng, TP.HCM; 63 TTKT tỉnh; 1184 bưu cục.</w:t>
+      </w:r>
+    </w:p>
+    <w:p>
+      <w:pPr>
+        <w:pStyle w:val="ListBullet"/>
+        <w:jc w:val="both"/>
+      </w:pPr>
+      <w:r>
+        <w:rPr>
+          <w:b/>
+        </w:rPr>
+        <w:t>Dày ở trung tâm:</w:t>
+      </w:r>
+      <w:r>
+        <w:t xml:space="preserve"> 3 TTKT vùng nối nhau; TTKT vùng nối mọi TTKT tỉnh trong vùng và trực tiếp phục vụ bưu cục nội thành (bậc 117–136); mỗi TTKT tỉnh nối thêm 3 TTKT tỉnh gần nhất cùng vùng (bậc 11–31, trung bình 20,5).</w:t>
+      </w:r>
+    </w:p>
+    <w:p>
+      <w:pPr>
+        <w:pStyle w:val="ListBullet"/>
+        <w:jc w:val="both"/>
+      </w:pPr>
+      <w:r>
+        <w:rPr>
+          <w:b/>
+        </w:rPr>
+        <w:lastRenderedPageBreak/>
+        <w:t>Thưa ở bưu cục:</w:t>
+      </w:r>
+      <w:r>
+        <w:t xml:space="preserve"> bưu cục không nối với nhau; 1069 bưu cục chỉ có 1 tuyến về TTKT, 115 bưu cục có thêm tuyến về TTKT gần thứ hai.</w:t>
+      </w:r>
+    </w:p>
+    <w:p>
+      <w:pPr>
+        <w:pStyle w:val="ListBullet"/>
+        <w:jc w:val="both"/>
+      </w:pPr>
+      <w:r>
+        <w:rPr>
+          <w:b/>
+        </w:rPr>
+        <w:t>Kết quả:</w:t>
+      </w:r>
+      <w:r>
+        <w:t xml:space="preserve"> gửi từ bưu cục 67 (miền Bắc) tới bưu cục 171 (xa nhất miền Nam) mất 560 phút, theo hành trình 67 → 14 → 1 → 3 → 55 → 171: bưu cục → TTKT tỉnh → TTKT Hà Nội → TTKT TP.HCM → TTKT tỉnh → bưu cục, đúng cách hàng đi qua các trung tâm khai thác. Cả 3 thuật toán đều đạt (heap 4,4 ms, mảng 10,6 ms, Bellman-Ford 4,8 ms).</w:t>
+      </w:r>
+    </w:p>
+    <w:p>
+      <w:pPr>
         <w:pStyle w:val="Heading1"/>
         <w:pageBreakBefore/>
       </w:pPr>
-      <w:bookmarkStart w:id="38" w:name="_Toc243236175"/>
+      <w:bookmarkStart w:id="39" w:name="_Toc243248644"/>
       <w:r>
         <w:lastRenderedPageBreak/>
         <w:t>Chương 7. Đánh giá hiệu năng</w:t>
       </w:r>
-      <w:bookmarkEnd w:id="38"/>
+      <w:bookmarkEnd w:id="39"/>
     </w:p>
     <w:p>
       <w:pPr>
         <w:pStyle w:val="Heading2"/>
       </w:pPr>
-      <w:bookmarkStart w:id="39" w:name="_Toc243236176"/>
+      <w:bookmarkStart w:id="40" w:name="_Toc243248645"/>
       <w:r>
         <w:t>7.1. Thiết lập</w:t>
       </w:r>
-      <w:bookmarkEnd w:id="39"/>
+      <w:bookmarkEnd w:id="40"/>
     </w:p>
     <w:p>
       <w:pPr>
@@ -14803,11 +14956,11 @@
       <w:pPr>
         <w:pStyle w:val="Heading2"/>
       </w:pPr>
-      <w:bookmarkStart w:id="40" w:name="_Toc243236177"/>
+      <w:bookmarkStart w:id="41" w:name="_Toc243248646"/>
       <w:r>
         <w:t>7.2. Đồ thị thưa</w:t>
       </w:r>
-      <w:bookmarkEnd w:id="40"/>
+      <w:bookmarkEnd w:id="41"/>
     </w:p>
     <w:p>
       <w:pPr>
@@ -15657,12 +15810,12 @@
       <w:pPr>
         <w:pStyle w:val="Heading2"/>
       </w:pPr>
-      <w:bookmarkStart w:id="41" w:name="_Toc243236178"/>
+      <w:bookmarkStart w:id="42" w:name="_Toc243248647"/>
       <w:r>
         <w:lastRenderedPageBreak/>
         <w:t>7.3. Đồ thị dày</w:t>
       </w:r>
-      <w:bookmarkEnd w:id="41"/>
+      <w:bookmarkEnd w:id="42"/>
     </w:p>
     <w:p>
       <w:pPr>
@@ -16332,11 +16485,11 @@
       <w:pPr>
         <w:pStyle w:val="Heading2"/>
       </w:pPr>
-      <w:bookmarkStart w:id="42" w:name="_Toc243236179"/>
+      <w:bookmarkStart w:id="43" w:name="_Toc243248648"/>
       <w:r>
         <w:t>7.4. Nhận xét</w:t>
       </w:r>
-      <w:bookmarkEnd w:id="42"/>
+      <w:bookmarkEnd w:id="43"/>
     </w:p>
     <w:p>
       <w:pPr>
@@ -16398,12 +16551,12 @@
         <w:pStyle w:val="Heading1"/>
         <w:pageBreakBefore/>
       </w:pPr>
-      <w:bookmarkStart w:id="43" w:name="_Toc243236180"/>
+      <w:bookmarkStart w:id="44" w:name="_Toc243248649"/>
       <w:r>
         <w:lastRenderedPageBreak/>
         <w:t>Chương 8. Quá trình xây dựng và sử dụng AI</w:t>
       </w:r>
-      <w:bookmarkEnd w:id="43"/>
+      <w:bookmarkEnd w:id="44"/>
     </w:p>
     <w:p>
       <w:pPr>
@@ -16428,11 +16581,11 @@
       <w:pPr>
         <w:pStyle w:val="Heading2"/>
       </w:pPr>
-      <w:bookmarkStart w:id="44" w:name="_Toc243236181"/>
+      <w:bookmarkStart w:id="45" w:name="_Toc243248650"/>
       <w:r>
         <w:t>8.1. Công cụ và cách tổ chức làm việc</w:t>
       </w:r>
-      <w:bookmarkEnd w:id="44"/>
+      <w:bookmarkEnd w:id="45"/>
     </w:p>
     <w:p>
       <w:pPr>
@@ -16807,11 +16960,11 @@
       <w:pPr>
         <w:pStyle w:val="Heading2"/>
       </w:pPr>
-      <w:bookmarkStart w:id="45" w:name="_Toc243236182"/>
+      <w:bookmarkStart w:id="46" w:name="_Toc243248651"/>
       <w:r>
         <w:t>8.2. Dòng thời gian</w:t>
       </w:r>
-      <w:bookmarkEnd w:id="45"/>
+      <w:bookmarkEnd w:id="46"/>
     </w:p>
     <w:p>
       <w:pPr>
@@ -17963,6 +18116,91 @@
           </w:p>
         </w:tc>
       </w:tr>
+      <w:tr>
+        <w:trPr>
+          <w:jc w:val="center"/>
+        </w:trPr>
+        <w:tc>
+          <w:tcPr>
+            <w:tcW w:w="680" w:type="dxa"/>
+          </w:tcPr>
+          <w:p>
+            <w:pPr>
+              <w:spacing w:after="0" w:line="264" w:lineRule="auto"/>
+            </w:pPr>
+            <w:r>
+              <w:rPr>
+                <w:sz w:val="19"/>
+              </w:rPr>
+              <w:t>#19</w:t>
+            </w:r>
+          </w:p>
+        </w:tc>
+        <w:tc>
+          <w:tcPr>
+            <w:tcW w:w="737" w:type="dxa"/>
+          </w:tcPr>
+          <w:p>
+            <w:pPr>
+              <w:spacing w:after="0" w:line="264" w:lineRule="auto"/>
+            </w:pPr>
+            <w:r>
+              <w:rPr>
+                <w:sz w:val="19"/>
+              </w:rPr>
+              <w:t>18/10</w:t>
+            </w:r>
+          </w:p>
+        </w:tc>
+        <w:tc>
+          <w:tcPr>
+            <w:tcW w:w="1304" w:type="dxa"/>
+          </w:tcPr>
+          <w:p>
+            <w:pPr>
+              <w:spacing w:after="0" w:line="264" w:lineRule="auto"/>
+            </w:pPr>
+            <w:r>
+              <w:rPr>
+                <w:sz w:val="19"/>
+              </w:rPr>
+              <w:t>Kiểm thử</w:t>
+            </w:r>
+          </w:p>
+        </w:tc>
+        <w:tc>
+          <w:tcPr>
+            <w:tcW w:w="3175" w:type="dxa"/>
+          </w:tcPr>
+          <w:p>
+            <w:pPr>
+              <w:spacing w:after="0" w:line="264" w:lineRule="auto"/>
+            </w:pPr>
+            <w:r>
+              <w:rPr>
+                <w:sz w:val="19"/>
+              </w:rPr>
+              <w:t>"thêm tôi 1 test case cho mô phỏng dữ liệu thực tế hành trình đường đi giao hàng, 1250 điểm/bưu cực/trung tâm khai thác, ..."</w:t>
+            </w:r>
+          </w:p>
+        </w:tc>
+        <w:tc>
+          <w:tcPr>
+            <w:tcW w:w="3175" w:type="dxa"/>
+          </w:tcPr>
+          <w:p>
+            <w:pPr>
+              <w:spacing w:after="0" w:line="264" w:lineRule="auto"/>
+            </w:pPr>
+            <w:r>
+              <w:rPr>
+                <w:sz w:val="19"/>
+              </w:rPr>
+              <w:t>SV đề xuất test thực tế; AI thêm hàm sinh mạng bưu chính, test dac-biet/10 (1250 đỉnh), 131/131 đạt.</w:t>
+            </w:r>
+          </w:p>
+        </w:tc>
+      </w:tr>
     </w:tbl>
     <w:p>
       <w:pPr>
@@ -17982,11 +18220,11 @@
       <w:pPr>
         <w:pStyle w:val="Heading2"/>
       </w:pPr>
-      <w:bookmarkStart w:id="46" w:name="_Toc243236183"/>
+      <w:bookmarkStart w:id="47" w:name="_Toc243248652"/>
       <w:r>
         <w:t>8.3. Lỗi phát hiện và cách xử lý</w:t>
       </w:r>
-      <w:bookmarkEnd w:id="46"/>
+      <w:bookmarkEnd w:id="47"/>
     </w:p>
     <w:p>
       <w:pPr>
@@ -18443,11 +18681,11 @@
       <w:pPr>
         <w:pStyle w:val="Heading2"/>
       </w:pPr>
-      <w:bookmarkStart w:id="47" w:name="_Toc243236184"/>
+      <w:bookmarkStart w:id="48" w:name="_Toc243248653"/>
       <w:r>
         <w:t>8.4. Kết quả của AI được kiểm chứng như thế nào</w:t>
       </w:r>
-      <w:bookmarkEnd w:id="47"/>
+      <w:bookmarkEnd w:id="48"/>
     </w:p>
     <w:p>
       <w:pPr>
@@ -18464,6 +18702,7 @@
         <w:jc w:val="both"/>
       </w:pPr>
       <w:r>
+        <w:lastRenderedPageBreak/>
         <w:t xml:space="preserve">Mọi thuật toán được đối chiếu với đáp án </w:t>
       </w:r>
       <w:r>
@@ -18491,7 +18730,6 @@
         <w:jc w:val="both"/>
       </w:pPr>
       <w:r>
-        <w:lastRenderedPageBreak/>
         <w:t>Giao diện được kiểm tra bằng trình duyệt thật (Claude in Chrome, sau đó Chrome headless): đếm số bước, đọc output, kiểm tra console không lỗi.</w:t>
       </w:r>
     </w:p>
@@ -18534,11 +18772,11 @@
       <w:pPr>
         <w:pStyle w:val="Heading2"/>
       </w:pPr>
-      <w:bookmarkStart w:id="48" w:name="_Toc243236185"/>
+      <w:bookmarkStart w:id="49" w:name="_Toc243248654"/>
       <w:r>
         <w:t>8.5. Phân công giữa sinh viên và AI</w:t>
       </w:r>
-      <w:bookmarkEnd w:id="48"/>
+      <w:bookmarkEnd w:id="49"/>
     </w:p>
     <w:p>
       <w:pPr>
@@ -18992,11 +19230,11 @@
       <w:pPr>
         <w:pStyle w:val="Heading2"/>
       </w:pPr>
-      <w:bookmarkStart w:id="49" w:name="_Toc243236186"/>
+      <w:bookmarkStart w:id="50" w:name="_Toc243248655"/>
       <w:r>
         <w:t>8.6. Nhận xét về việc dùng AI</w:t>
       </w:r>
-      <w:bookmarkEnd w:id="49"/>
+      <w:bookmarkEnd w:id="50"/>
     </w:p>
     <w:p>
       <w:pPr>
@@ -19014,22 +19252,22 @@
         <w:pStyle w:val="Heading1"/>
         <w:pageBreakBefore/>
       </w:pPr>
-      <w:bookmarkStart w:id="50" w:name="_Toc243236187"/>
+      <w:bookmarkStart w:id="51" w:name="_Toc243248656"/>
       <w:r>
         <w:lastRenderedPageBreak/>
         <w:t>Chương 9. Kết luận và hướng phát triển</w:t>
       </w:r>
-      <w:bookmarkEnd w:id="50"/>
+      <w:bookmarkEnd w:id="51"/>
     </w:p>
     <w:p>
       <w:pPr>
         <w:pStyle w:val="Heading2"/>
       </w:pPr>
-      <w:bookmarkStart w:id="51" w:name="_Toc243236188"/>
+      <w:bookmarkStart w:id="52" w:name="_Toc243248657"/>
       <w:r>
         <w:t>9.1. Kết quả đạt được</w:t>
       </w:r>
-      <w:bookmarkEnd w:id="51"/>
+      <w:bookmarkEnd w:id="52"/>
     </w:p>
     <w:p>
       <w:pPr>
@@ -19055,7 +19293,7 @@
         <w:jc w:val="both"/>
       </w:pPr>
       <w:r>
-        <w:t>44 testcase có đáp án độc lập, 128/128 lượt chạy đạt; mutation test cho thấy bộ test phát hiện được lỗi trong heap.</w:t>
+        <w:t>45 testcase có đáp án độc lập, 131/131 lượt chạy đạt; mutation test cho thấy bộ test phát hiện được lỗi trong heap.</w:t>
       </w:r>
     </w:p>
     <w:p>
@@ -19080,11 +19318,11 @@
       <w:pPr>
         <w:pStyle w:val="Heading2"/>
       </w:pPr>
-      <w:bookmarkStart w:id="52" w:name="_Toc243236189"/>
+      <w:bookmarkStart w:id="53" w:name="_Toc243248658"/>
       <w:r>
         <w:t>9.2. Hạn chế</w:t>
       </w:r>
-      <w:bookmarkEnd w:id="52"/>
+      <w:bookmarkEnd w:id="53"/>
     </w:p>
     <w:p>
       <w:pPr>
@@ -19126,11 +19364,11 @@
       <w:pPr>
         <w:pStyle w:val="Heading2"/>
       </w:pPr>
-      <w:bookmarkStart w:id="53" w:name="_Toc243236190"/>
+      <w:bookmarkStart w:id="54" w:name="_Toc243248659"/>
       <w:r>
         <w:t>9.3. Hướng phát triển</w:t>
       </w:r>
-      <w:bookmarkEnd w:id="53"/>
+      <w:bookmarkEnd w:id="54"/>
     </w:p>
     <w:p>
       <w:pPr>
@@ -19180,12 +19418,12 @@
         <w:pStyle w:val="Heading1"/>
         <w:pageBreakBefore/>
       </w:pPr>
-      <w:bookmarkStart w:id="54" w:name="_Toc243236191"/>
+      <w:bookmarkStart w:id="55" w:name="_Toc243248660"/>
       <w:r>
         <w:lastRenderedPageBreak/>
         <w:t>Tài liệu tham khảo</w:t>
       </w:r>
-      <w:bookmarkEnd w:id="54"/>
+      <w:bookmarkEnd w:id="55"/>
     </w:p>
     <w:p>
       <w:pPr>

</xml_diff>